<commit_message>
Docs: consigne la validation de l'expéditeur SMS OVH
Section 13. Les SMS envoyés depuis fin juillet côté code devraient
désormais réellement partir en prod — à confirmer par un vrai envoi.

Co-Authored-By: Claude Sonnet 5 <noreply@anthropic.com>
</commit_message>
<xml_diff>
--- a/cahier_des_charges_animeaux.docx
+++ b/cahier_des_charges_animeaux.docx
@@ -7375,6 +7375,14 @@
       </w:pPr>
       <w:r>
         <w:t>Ajouté le 08-09/09/2026 : engagement bien-être animal (charte praticien), différenciateur face à Tobalgo dont l'argument principal est une charte éthique co-écrite avec l'association Argos 42. Contenu centralisé dans src/lib/ethicsCharter.ts (six clauses + un paragraphe déclaratif explicite sur l'absence de vérification des méthodes au quotidien, avec canal de signalement contact.animeaux@gmail.com) — non relu par un juriste, même réserve que sur /cgu et /confidentialite. Case à cocher obligatoire à l'inscription praticien (RegisterPage.tsx), badge sur la fiche publique (DoctorPage.tsx, doctors.ethics_charter_accepted_at non nul), page légale dédiée (/engagement, LegalPage.tsx). Migration 092 : colonne horodatée sur doctors (même mécanisme que terms_accepted_at, migration 049), posée par handle_new_user() à l'inscription. Les praticiens déjà inscrits avant cette fonctionnalité ne l'ont jamais tacitement acceptée : une bannière avec bouton d'acceptation (useAcceptEthicsCharter) leur est présentée sur DoctorDashboard.tsx tant qu'ils n'ont pas validé.</w:t>
+      </w:r>
+    </w:p>
+    <w:p>
+      <w:pPr>
+        <w:spacing w:after="160" w:line="300"/>
+      </w:pPr>
+      <w:r>
+        <w:t>Résolu le 19/09/2026 : l'expéditeur SMS alphanumérique OVH (« MonAnimeaux ») est enfin validé après plus d'un mois et demi et 5+ tentatives (voir section 9, mise à jour du 07/08/2026, pour l'historique des refus) — 100 crédits SMS disponibles sur le compte. Tous les envois SMS déjà codés depuis fin juillet (sendOvhSms dans send-reminders, send-appointment-confirmation, send-appointment-cancellation, send-appointment-reschedule) devraient désormais réellement partir en prod, alors qu'ils échouaient jusqu'ici silencieusement (aucune erreur visible dans l'appli, uniquement dans les Logs de chaque fonction Edge). À confirmer par un vrai envoi (une réservation, ou le prochain rappel 24h) plutôt que de supposer que ça fonctionne du seul fait que le code a toujours été correct.</w:t>
       </w:r>
     </w:p>
     <w:sectPr>

</xml_diff>

<commit_message>
Docs: consigne le correctif de fuseau horaire sur la réservation
Section 13.

Co-Authored-By: Claude Sonnet 5 <noreply@anthropic.com>
</commit_message>
<xml_diff>
--- a/cahier_des_charges_animeaux.docx
+++ b/cahier_des_charges_animeaux.docx
@@ -7383,6 +7383,14 @@
       </w:pPr>
       <w:r>
         <w:t>Résolu le 19/09/2026 : l'expéditeur SMS alphanumérique OVH (« MonAnimeaux ») est enfin validé après plus d'un mois et demi et 5+ tentatives (voir section 9, mise à jour du 07/08/2026, pour l'historique des refus) — 100 crédits SMS disponibles sur le compte. Tous les envois SMS déjà codés depuis fin juillet (sendOvhSms dans send-reminders, send-appointment-confirmation, send-appointment-cancellation, send-appointment-reschedule) devraient désormais réellement partir en prod, alors qu'ils échouaient jusqu'ici silencieusement (aucune erreur visible dans l'appli, uniquement dans les Logs de chaque fonction Edge). À confirmer par un vrai envoi (une réservation, ou le prochain rappel 24h) plutôt que de supposer que ça fonctionne du seul fait que le code a toujours été correct.</w:t>
+      </w:r>
+    </w:p>
+    <w:p>
+      <w:pPr>
+        <w:spacing w:after="160" w:line="300"/>
+      </w:pPr>
+      <w:r>
+        <w:t>Résolu le 19/09/2026 : une réservation devenait impossible pour un patient (ou praticien) connecté depuis un fuseau horaire autre qu'Europe/Paris — reproduit en testant un vrai RDV depuis la Malaisie (UTC+8) en préparant le test SMS. Un créneau "11:30" choisi là-bas correspondait en réalité à 05:30 heure de Paris, hors des horaires du praticien : le serveur (trigger validate_patient_appointment_slot, migration 088, ancré sur Europe/Paris) rejetait la réservation, avec le message technique brut affiché tel quel au patient. Cause : toute la génération/comparaison de créneaux côté client (generateAvailableSlots, useAvailableSlots, hasAvailabilityInRange, findNextAvailableSlot, AvailabilityCalendar, BookPage.confirm) utilisait les méthodes natives de Date (getDay, getHours, setHours...), ancrées sur le fuseau LOCAL de l'appareil du visiteur — une limite déjà identifiée le 04/09/2026 et sciemment acceptée comme "risque quasi nul" (marché France), que ce test réel a prouvée fausse en pratique. Corrigé en ajoutant la dépendance date-fns-tz et un nouveau module testé (src/lib/parisTime.ts) ancrant tout ce calcul sur Europe/Paris, appliqué à tous les points concernés. Message d'erreur patient également amélioré (jamais le texte brut de la base de données) avec un bouton pour recharger des créneaux à jour.</w:t>
       </w:r>
     </w:p>
     <w:sectPr>

</xml_diff>

<commit_message>
Docs: consigne le correctif SMS OVH (champ sender manquant)
Section 13. Confirmé fonctionnel de bout en bout par un vrai test de
réservation.

Co-Authored-By: Claude Sonnet 5 <noreply@anthropic.com>
</commit_message>
<xml_diff>
--- a/cahier_des_charges_animeaux.docx
+++ b/cahier_des_charges_animeaux.docx
@@ -7391,6 +7391,14 @@
       </w:pPr>
       <w:r>
         <w:t>Résolu le 19/09/2026 : une réservation devenait impossible pour un patient (ou praticien) connecté depuis un fuseau horaire autre qu'Europe/Paris — reproduit en testant un vrai RDV depuis la Malaisie (UTC+8) en préparant le test SMS. Un créneau "11:30" choisi là-bas correspondait en réalité à 05:30 heure de Paris, hors des horaires du praticien : le serveur (trigger validate_patient_appointment_slot, migration 088, ancré sur Europe/Paris) rejetait la réservation, avec le message technique brut affiché tel quel au patient. Cause : toute la génération/comparaison de créneaux côté client (generateAvailableSlots, useAvailableSlots, hasAvailabilityInRange, findNextAvailableSlot, AvailabilityCalendar, BookPage.confirm) utilisait les méthodes natives de Date (getDay, getHours, setHours...), ancrées sur le fuseau LOCAL de l'appareil du visiteur — une limite déjà identifiée le 04/09/2026 et sciemment acceptée comme "risque quasi nul" (marché France), que ce test réel a prouvée fausse en pratique. Corrigé en ajoutant la dépendance date-fns-tz et un nouveau module testé (src/lib/parisTime.ts) ancrant tout ce calcul sur Europe/Paris, appliqué à tous les points concernés. Message d'erreur patient également amélioré (jamais le texte brut de la base de données) avec un bouton pour recharger des créneaux à jour.</w:t>
+      </w:r>
+    </w:p>
+    <w:p>
+      <w:pPr>
+        <w:spacing w:after="160" w:line="300"/>
+      </w:pPr>
+      <w:r>
+        <w:t>Résolu le 20/09/2026 : les SMS restaient en échec malgré l'expéditeur OVH "MonAnimeaux" validé la veille (100 crédits) — un premier test réel de réservation confirmait l'email mais pas le SMS, avec la même erreur historique "Sms sender does not exists. Please create it first" dans les logs. Cause : aucune des 4 fonctions utilisant sendOvhSms (send-appointment-confirmation, send-appointment-cancellation, send-appointment-reschedule, send-reminders) n'envoyait le champ sender dans le corps de la requête POST /sms/{serviceName}/jobs — OVH retombe alors sur un expéditeur par défaut jamais configuré côté compte plutôt que d'utiliser l'expéditeur alphanumérique validé, même s'il en existe un. Corrigé en ajoutant ce champ, lu depuis un nouveau secret OVH_SMS_SENDER (valeur "MonAnimeaux", même mécanisme que OVH_SMS_SERVICE_NAME) plutôt que codé en dur. Un second test de réservation confirme le SMS bien reçu — la chaîne complète confirmation de RDV (email + SMS + notification in-app) est désormais opérationnelle de bout en bout en production.</w:t>
       </w:r>
     </w:p>
     <w:sectPr>

</xml_diff>

<commit_message>
Docs: consigne l'audit du 20/09 et les fragilités notées sans correctif
Section 13.

Co-Authored-By: Claude Sonnet 5 <noreply@anthropic.com>
</commit_message>
<xml_diff>
--- a/cahier_des_charges_animeaux.docx
+++ b/cahier_des_charges_animeaux.docx
@@ -7399,6 +7399,14 @@
       </w:pPr>
       <w:r>
         <w:t>Résolu le 20/09/2026 : les SMS restaient en échec malgré l'expéditeur OVH "MonAnimeaux" validé la veille (100 crédits) — un premier test réel de réservation confirmait l'email mais pas le SMS, avec la même erreur historique "Sms sender does not exists. Please create it first" dans les logs. Cause : aucune des 4 fonctions utilisant sendOvhSms (send-appointment-confirmation, send-appointment-cancellation, send-appointment-reschedule, send-reminders) n'envoyait le champ sender dans le corps de la requête POST /sms/{serviceName}/jobs — OVH retombe alors sur un expéditeur par défaut jamais configuré côté compte plutôt que d'utiliser l'expéditeur alphanumérique validé, même s'il en existe un. Corrigé en ajoutant ce champ, lu depuis un nouveau secret OVH_SMS_SENDER (valeur "MonAnimeaux", même mécanisme que OVH_SMS_SERVICE_NAME) plutôt que codé en dur. Un second test de réservation confirme le SMS bien reçu — la chaîne complète confirmation de RDV (email + SMS + notification in-app) est désormais opérationnelle de bout en bout en production.</w:t>
+      </w:r>
+    </w:p>
+    <w:p>
+      <w:pPr>
+        <w:spacing w:after="160" w:line="300"/>
+      </w:pPr>
+      <w:r>
+        <w:t>Audit du 20/09/2026 : après le double bug réservation/SMS de la veille, deux vérifications ciblées demandées par l'utilisatrice (résidus de bug de fuseau horaire + appels à des services externes) ont trouvé et fait corriger : dans DoctorDashboard.tsx, la création de congé, le mini calendrier "Agenda" solo et le calendrier partagé "Mon cabinet" (grille horaire par membre) utilisaient tous des méthodes Date locales au lieu d'Europe/Paris — un praticien en voyage pouvait voir ses RDV sur le mauvais jour ou poser un congé décalé ; même bug dans doctorStats.ts (taux de remplissage), useData.ts (filtre "disponible aujourd'hui"), et RemindersPage.tsx (libellés "Aujourd'hui/Demain"). Nouveaux utilitaires testés dans src/lib/parisTime.ts : addDaysToDateKey, parisStartOfWeekKey, parisMinutesOfDay, parisCalendarDaysDiff. La navigation semaine (agenda solo + cabinet) est passée d'un objet Date muté via addDays à un simple décalage entier de semaines. Par ailleurs, send-appointment-confirmation était la seule des 4 fonctions OVH/Resend à n'avoir jamais reçu le garde-fou timeout+try/catch du 08/09 — corrigé, et l'URL du flux calendrier ICS (DoctorDashboard.tsx) codait en dur le domaine du projet Supabase au lieu de VITE_SUPABASE_URL — corrigé aussi. Trois points notés mais volontairement non modifiés (pas de bug confirmé, juste une fragilité à surveiller) : la clé VAPID (push notifications) est configurée séparément côté client (Vercel) et serveur (secret Supabase) sans rien qui vérifie qu'elles correspondent toujours ; les SMS OVH n'envoient pas de champ charset explicite (accents à re-vérifier sur un nom très accentué) ni noStopClause ; le repli Resend "onboarding@resend.dev" (sandbox) ne délivrerait plus à de vrais destinataires si EMAIL_FROM venait à manquer un jour.</w:t>
       </w:r>
     </w:p>
     <w:sectPr>

</xml_diff>

<commit_message>
Docs: consigne le correctif du 20/09 sur AppointmentCard.tsx et le sweep timezone
Co-Authored-By: Claude Sonnet 5 <noreply@anthropic.com>
</commit_message>
<xml_diff>
--- a/cahier_des_charges_animeaux.docx
+++ b/cahier_des_charges_animeaux.docx
@@ -7407,6 +7407,14 @@
       </w:pPr>
       <w:r>
         <w:t>Audit du 20/09/2026 : après le double bug réservation/SMS de la veille, deux vérifications ciblées demandées par l'utilisatrice (résidus de bug de fuseau horaire + appels à des services externes) ont trouvé et fait corriger : dans DoctorDashboard.tsx, la création de congé, le mini calendrier "Agenda" solo et le calendrier partagé "Mon cabinet" (grille horaire par membre) utilisaient tous des méthodes Date locales au lieu d'Europe/Paris — un praticien en voyage pouvait voir ses RDV sur le mauvais jour ou poser un congé décalé ; même bug dans doctorStats.ts (taux de remplissage), useData.ts (filtre "disponible aujourd'hui"), et RemindersPage.tsx (libellés "Aujourd'hui/Demain"). Nouveaux utilitaires testés dans src/lib/parisTime.ts : addDaysToDateKey, parisStartOfWeekKey, parisMinutesOfDay, parisCalendarDaysDiff. La navigation semaine (agenda solo + cabinet) est passée d'un objet Date muté via addDays à un simple décalage entier de semaines. Par ailleurs, send-appointment-confirmation était la seule des 4 fonctions OVH/Resend à n'avoir jamais reçu le garde-fou timeout+try/catch du 08/09 — corrigé, et l'URL du flux calendrier ICS (DoctorDashboard.tsx) codait en dur le domaine du projet Supabase au lieu de VITE_SUPABASE_URL — corrigé aussi. Trois points notés mais volontairement non modifiés (pas de bug confirmé, juste une fragilité à surveiller) : la clé VAPID (push notifications) est configurée séparément côté client (Vercel) et serveur (secret Supabase) sans rien qui vérifie qu'elles correspondent toujours ; les SMS OVH n'envoient pas de champ charset explicite (accents à re-vérifier sur un nom très accentué) ni noStopClause ; le repli Resend "onboarding@resend.dev" (sandbox) ne délivrerait plus à de vrais destinataires si EMAIL_FROM venait à manquer un jour.</w:t>
+      </w:r>
+    </w:p>
+    <w:p>
+      <w:pPr>
+        <w:spacing w:after="160" w:line="300"/>
+      </w:pPr>
+      <w:r>
+        <w:t>Correctif du 20/09/2026 (suite à l'audit de la veille) : l'audit du 20/09/2026 (voir entrée précédente) n'avait pas tout trouvé. Anaïs a testé l'application elle-même et repéré, via deux captures d'écran, qu'un même rendez-vous affichait 11:30 dans le calendrier partagé « Mon cabinet » (correct) mais 17:30 dans la carte « Rendez-vous » de l'agenda personnel — exactement l'écart entre la Malaisie et Paris. Cause : AppointmentCard.tsx, le composant carte de rendez-vous réutilisé dans toute l'application (dashboards patient/praticien/secrétariat/admin, rappels), utilisait encore l'heure locale de l'appareil au lieu de l'heure de Paris pour son affichage HH:mm — ni le correctif du 19/09 ni l'audit du 20/09 n'avaient détecté ce cas précis, l'audit ayant cherché les méthodes .getDay()/.getHours()/.getTime() sans repérer les simples formatages de date qui n'utilisent aucune d'elles. Un grep exhaustif de tout le code source a ensuite permis de corriger les mêmes résidus dans neuf autres fichiers (réservation, dashboards admin/praticien/secrétariat, page publique d'un praticien, messagerie, dossier de santé animal, export PDF du dossier, documents patient). Leçon retenue : pour ce type de bug, un grep manuel exhaustif du motif exact est plus fiable qu'un audit automatisé cherchant des symptômes indirects.</w:t>
       </w:r>
     </w:p>
     <w:sectPr>

</xml_diff>

<commit_message>
Docs: consigne le correctif de débordement mobile sur /search
Co-Authored-By: Claude Sonnet 5 <noreply@anthropic.com>
</commit_message>
<xml_diff>
--- a/cahier_des_charges_animeaux.docx
+++ b/cahier_des_charges_animeaux.docx
@@ -7415,6 +7415,14 @@
       </w:pPr>
       <w:r>
         <w:t>Correctif du 20/09/2026 (suite à l'audit de la veille) : l'audit du 20/09/2026 (voir entrée précédente) n'avait pas tout trouvé. Anaïs a testé l'application elle-même et repéré, via deux captures d'écran, qu'un même rendez-vous affichait 11:30 dans le calendrier partagé « Mon cabinet » (correct) mais 17:30 dans la carte « Rendez-vous » de l'agenda personnel — exactement l'écart entre la Malaisie et Paris. Cause : AppointmentCard.tsx, le composant carte de rendez-vous réutilisé dans toute l'application (dashboards patient/praticien/secrétariat/admin, rappels), utilisait encore l'heure locale de l'appareil au lieu de l'heure de Paris pour son affichage HH:mm — ni le correctif du 19/09 ni l'audit du 20/09 n'avaient détecté ce cas précis, l'audit ayant cherché les méthodes .getDay()/.getHours()/.getTime() sans repérer les simples formatages de date qui n'utilisent aucune d'elles. Un grep exhaustif de tout le code source a ensuite permis de corriger les mêmes résidus dans neuf autres fichiers (réservation, dashboards admin/praticien/secrétariat, page publique d'un praticien, messagerie, dossier de santé animal, export PDF du dossier, documents patient). Leçon retenue : pour ce type de bug, un grep manuel exhaustif du motif exact est plus fiable qu'un audit automatisé cherchant des symptômes indirects.</w:t>
+      </w:r>
+    </w:p>
+    <w:p>
+      <w:pPr>
+        <w:spacing w:after="160" w:line="300"/>
+      </w:pPr>
+      <w:r>
+        <w:t>Correctif du 20/09/2026 : Anaïs a signalé un débordement visuel sur la version mobile de l'application (écran qui « bouge », champs coupés ou superposés, pas toujours lisibles). Reproduit et confirmé en aperçu mobile sur la page de recherche (/search) : la ligne « Trier par » et son menu déroulant ne se réduisaient/enroulaient jamais sur petit écran, ce qui poussait toute la page 47 pixels plus large que l'écran du téléphone — sans barre de défilement visible, donc le contenu (bouton « Réserver », chevrons des cartes) était simplement coupé ou décalé au toucher, ce qui correspond exactement à la sensation d'un écran qui bouge. Corrigé sur SearchPage.tsx (mise en retour à la ligne du tri, largeur du menu contrainte sur mobile). Par précaution, quatre autres endroits du code partageant la même construction fragile (un bloc de texte extensible sans limite de rétrécissement, à côté d'un élément de taille fixe) ont aussi été corrigés dans AnimalHealthPage.tsx et DoctorDashboard.tsx, bien que non vérifiables visuellement sans connexion à un compte praticien.</w:t>
       </w:r>
     </w:p>
     <w:sectPr>

</xml_diff>

<commit_message>
Docs: consigne le crash note praticien NULL et les correctifs mobiles du 20/09
Co-Authored-By: Claude Sonnet 5 <noreply@anthropic.com>
</commit_message>
<xml_diff>
--- a/cahier_des_charges_animeaux.docx
+++ b/cahier_des_charges_animeaux.docx
@@ -7423,6 +7423,14 @@
       </w:pPr>
       <w:r>
         <w:t>Correctif du 20/09/2026 : Anaïs a signalé un débordement visuel sur la version mobile de l'application (écran qui « bouge », champs coupés ou superposés, pas toujours lisibles). Reproduit et confirmé en aperçu mobile sur la page de recherche (/search) : la ligne « Trier par » et son menu déroulant ne se réduisaient/enroulaient jamais sur petit écran, ce qui poussait toute la page 47 pixels plus large que l'écran du téléphone — sans barre de défilement visible, donc le contenu (bouton « Réserver », chevrons des cartes) était simplement coupé ou décalé au toucher, ce qui correspond exactement à la sensation d'un écran qui bouge. Corrigé sur SearchPage.tsx (mise en retour à la ligne du tri, largeur du menu contrainte sur mobile). Par précaution, quatre autres endroits du code partageant la même construction fragile (un bloc de texte extensible sans limite de rétrécissement, à côté d'un élément de taille fixe) ont aussi été corrigés dans AnimalHealthPage.tsx et DoctorDashboard.tsx, bien que non vérifiables visuellement sans connexion à un compte praticien.</w:t>
+      </w:r>
+    </w:p>
+    <w:p>
+      <w:pPr>
+        <w:spacing w:after="160" w:line="300"/>
+      </w:pPr>
+      <w:r>
+        <w:t>Correctifs du 20/09/2026 (analyse d'un enregistrement d'écran mobile envoyé par Anaïs) : un vrai crash de l'application a été identifié (page « Une erreur est survenue », capturée automatiquement par Sentry). Cause trouvée en relisant les migrations de base de données : le déclencheur qui recalcule la note moyenne d'un praticien après un avis (update_doctor_rating) ne gérait pas le cas où ce praticien n'a plus aucun avis — la moyenne devenait NULL au lieu de 0, et l'affichage de cette note (.toFixed) faisait planter toute l'application pour n'importe quel visiteur tombant sur ce praticien en recherche, pas seulement pour Anaïs. Corrigé par une nouvelle migration (093) qui répare le déclencheur et remet à 0 les notes déjà cassées en base, plus une protection côté affichage par précaution. Cette migration doit être vérifiée/appliquée manuellement dans Supabase (comme toujours, un fichier de migration dans le code ne prouve pas qu'il a été exécuté en production). Par ailleurs, deux écrans (« Mes animaux » et « Mes rendez-vous ») affichaient un faux message « aucune donnée » pendant une fraction de seconde au chargement avant d'afficher les vraies données — corrigé avec un indicateur de chargement clair à la place. Une photo d'animal qui ne charge pas affiche maintenant l'émoji de l'espèce plutôt qu'un espace vide.</w:t>
       </w:r>
     </w:p>
     <w:sectPr>

</xml_diff>

<commit_message>
Docs: consigne la refonte du ton des emails/SMS de rendez-vous
Co-Authored-By: Claude Sonnet 5 <noreply@anthropic.com>
</commit_message>
<xml_diff>
--- a/cahier_des_charges_animeaux.docx
+++ b/cahier_des_charges_animeaux.docx
@@ -7431,6 +7431,14 @@
       </w:pPr>
       <w:r>
         <w:t>Correctifs du 20/09/2026 (analyse d'un enregistrement d'écran mobile envoyé par Anaïs) : un vrai crash de l'application a été identifié (page « Une erreur est survenue », capturée automatiquement par Sentry). Cause trouvée en relisant les migrations de base de données : le déclencheur qui recalcule la note moyenne d'un praticien après un avis (update_doctor_rating) ne gérait pas le cas où ce praticien n'a plus aucun avis — la moyenne devenait NULL au lieu de 0, et l'affichage de cette note (.toFixed) faisait planter toute l'application pour n'importe quel visiteur tombant sur ce praticien en recherche, pas seulement pour Anaïs. Corrigé par une nouvelle migration (093) qui répare le déclencheur et remet à 0 les notes déjà cassées en base, plus une protection côté affichage par précaution. Cette migration doit être vérifiée/appliquée manuellement dans Supabase (comme toujours, un fichier de migration dans le code ne prouve pas qu'il a été exécuté en production). Par ailleurs, deux écrans (« Mes animaux » et « Mes rendez-vous ») affichaient un faux message « aucune donnée » pendant une fraction de seconde au chargement avant d'afficher les vraies données — corrigé avec un indicateur de chargement clair à la place. Une photo d'animal qui ne charge pas affiche maintenant l'émoji de l'espèce plutôt qu'un espace vide.</w:t>
+      </w:r>
+    </w:p>
+    <w:p>
+      <w:pPr>
+        <w:spacing w:after="160" w:line="300"/>
+      </w:pPr>
+      <w:r>
+        <w:t>Ajouté le 20/09/2026 : le ton et le contenu des 6 emails/SMS transactionnels liés aux rendez-vous (confirmation, annulation, report côté patient, report côté praticien, rappel 24h, rappel de vaccin, demande d'avis) ont été revus avec Anaïs, validés via des aperçus visuels avant toute modification du code. Changements principaux : ton plus chaleureux et direct partout ; l'email d'annulation dit maintenant que le rendez-vous "a malheureusement été annulé" avec une phrase d'excuse, et propose un bouton pour reprendre un rendez-vous (qui n'existait pas avant) ; l'email de report côté patient précise désormais qu'il est possible d'annuler et reprendre un rendez-vous si le nouvel horaire ne convient pas ; le rappel de vaccin et la demande d'avis ont chacun désormais un bouton d'action direct (prendre RDV / laisser un avis) qui manquait jusque-là. Les 4 fonctions Edge concernées (send-appointment-confirmation, send-appointment-cancellation, send-appointment-reschedule, send-reminders) doivent être redéployées manuellement dans le tableau de bord Supabase, comme pour tout changement de fonction Edge.</w:t>
       </w:r>
     </w:p>
     <w:sectPr>

</xml_diff>

<commit_message>
Docs: consigne le renforcement du parcours de vérification praticien
Co-Authored-By: Claude Sonnet 5 <noreply@anthropic.com>
</commit_message>
<xml_diff>
--- a/cahier_des_charges_animeaux.docx
+++ b/cahier_des_charges_animeaux.docx
@@ -7439,6 +7439,14 @@
       </w:pPr>
       <w:r>
         <w:t>Ajouté le 20/09/2026 : le ton et le contenu des 6 emails/SMS transactionnels liés aux rendez-vous (confirmation, annulation, report côté patient, report côté praticien, rappel 24h, rappel de vaccin, demande d'avis) ont été revus avec Anaïs, validés via des aperçus visuels avant toute modification du code. Changements principaux : ton plus chaleureux et direct partout ; l'email d'annulation dit maintenant que le rendez-vous "a malheureusement été annulé" avec une phrase d'excuse, et propose un bouton pour reprendre un rendez-vous (qui n'existait pas avant) ; l'email de report côté patient précise désormais qu'il est possible d'annuler et reprendre un rendez-vous si le nouvel horaire ne convient pas ; le rappel de vaccin et la demande d'avis ont chacun désormais un bouton d'action direct (prendre RDV / laisser un avis) qui manquait jusque-là. Les 4 fonctions Edge concernées (send-appointment-confirmation, send-appointment-cancellation, send-appointment-reschedule, send-reminders) doivent être redéployées manuellement dans le tableau de bord Supabase, comme pour tout changement de fonction Edge.</w:t>
+      </w:r>
+    </w:p>
+    <w:p>
+      <w:pPr>
+        <w:spacing w:after="160" w:line="300"/>
+      </w:pPr>
+      <w:r>
+        <w:t>Ajouté/corrigé le 21/09/2026 : à la demande d'Anaïs, vérification complète par relecture de code du parcours d'inscription et de validation d'un praticien (charte, dépôt de documents, visibilité publique). Deux manques réels trouvés et corrigés : (1) aucune notification n'arrivait à l'administratrice quand un praticien déposait un document justificatif — ajouté un système qui la notifie désormais automatiquement, avec un lien direct vers les dossiers en attente ; (2) la fiche publique d'un praticien restait en réalité accessible (par lien direct, ou via l'API) même avant sa validation par l'administratrice — la recherche le cachait bien, mais ce n'était qu'une apparence côté affichage, pas une vraie restriction. Corrigé au niveau de la base de données : seul un praticien validé est désormais réellement consultable publiquement, avec les exceptions nécessaires (le praticien lui-même, l'administratrice, un patient ayant déjà un rendez-vous avec lui, ses collègues de cabinet).</w:t>
       </w:r>
     </w:p>
     <w:sectPr>

</xml_diff>

<commit_message>
Docs: consigne le blocage de l'espace praticien jusqu'à validation
Co-Authored-By: Claude Sonnet 5 <noreply@anthropic.com>
</commit_message>
<xml_diff>
--- a/cahier_des_charges_animeaux.docx
+++ b/cahier_des_charges_animeaux.docx
@@ -7447,6 +7447,14 @@
       </w:pPr>
       <w:r>
         <w:t>Ajouté/corrigé le 21/09/2026 : à la demande d'Anaïs, vérification complète par relecture de code du parcours d'inscription et de validation d'un praticien (charte, dépôt de documents, visibilité publique). Deux manques réels trouvés et corrigés : (1) aucune notification n'arrivait à l'administratrice quand un praticien déposait un document justificatif — ajouté un système qui la notifie désormais automatiquement, avec un lien direct vers les dossiers en attente ; (2) la fiche publique d'un praticien restait en réalité accessible (par lien direct, ou via l'API) même avant sa validation par l'administratrice — la recherche le cachait bien, mais ce n'était qu'une apparence côté affichage, pas une vraie restriction. Corrigé au niveau de la base de données : seul un praticien validé est désormais réellement consultable publiquement, avec les exceptions nécessaires (le praticien lui-même, l'administratrice, un patient ayant déjà un rendez-vous avec lui, ses collègues de cabinet).</w:t>
+      </w:r>
+    </w:p>
+    <w:p>
+      <w:pPr>
+        <w:spacing w:after="160" w:line="300"/>
+      </w:pPr>
+      <w:r>
+        <w:t>Changement du 21/09/2026 : jusqu'ici, un praticien pouvait utiliser librement tout son espace (patients, agenda, tarifs...) dès son inscription, seule sa fiche publique restait invisible en recherche tant qu'elle n'était pas validée. Anaïs a jugé ce fonctionnement insuffisant : n'importe qui pouvait s'inscrire et se servir de l'application sans jamais prouver son identité ou sa formation. Désormais, dès sa toute première connexion, le praticien tombe directement sur un écran obligatoire de dépôt de document (diplôme, carte professionnelle, extrait Kbis...) à la place de son espace habituel, et ne peut y accéder qu'une fois son dossier validé par une administratrice. Ajouté au passage l'extrait Kbis, qui manquait à la liste des types de documents proposés.</w:t>
       </w:r>
     </w:p>
     <w:sectPr>

</xml_diff>

<commit_message>
Visite guidée de première connexion (patients et praticiens), affichée une seule fois
Cercle au crayon + flèche courbe + bulle sur les vrais boutons (data-tour),
étapes sautées si le bouton n'est pas visible (mobile/bureau). Mémorisé par
compte via profiles.onboarding_completed_at (migration 110, backfill des
comptes existants).

Co-Authored-By: Claude Sonnet 5 <noreply@anthropic.com>
</commit_message>
<xml_diff>
--- a/cahier_des_charges_animeaux.docx
+++ b/cahier_des_charges_animeaux.docx
@@ -4639,6 +4639,31 @@
       </w:pPr>
       <w:r>
         <w:t xml:space="preserve">Ajoutée le 21 juillet 2026. Un praticien peut utiliser son tableau de bord immédiatement après l'inscription (aucune attente bloquante), mais reste invisible du public — absent des résultats de recherche (section 6.4) et de sa fiche publique directe (section 6.5) — tant que son dossier n'est pas validé par un administrateur. doctors.verification_status vaut 'pending' (défaut), 'verified' ou 'rejected'. Depuis l'onglet Profil du tableau de bord (section 7.5), le praticien dépose un ou plusieurs documents (diplôme, carte professionnelle / numéro d'ordre, pièce d'identité) dans doctor_verification_documents, stockés dans le bucket privé verification-documents (URL signée valable 1 an à l'upload, jamais d'URL publique — contrairement aux buckets avatars/documents). Un trigger before update sur doctors (prevent_self_verification) annule silencieusement toute tentative de modifier verification_status ou verification_rejected_reason par une requête autre qu'émise par un administrateur (is_admin()), empêchant un praticien de s'auto-valider même via un appel API direct.</w:t>
+      </w:r>
+    </w:p>
+    <w:p>
+      <w:pPr>
+        <w:pStyle w:val="Heading2"/>
+        <w:spacing w:after="150" w:before="300"/>
+      </w:pPr>
+      <w:r>
+        <w:t>6.16 Visite guidée de première connexion</w:t>
+      </w:r>
+    </w:p>
+    <w:p>
+      <w:pPr>
+        <w:spacing w:after="160" w:line="300"/>
+      </w:pPr>
+      <w:r>
+        <w:t>Ajoutée le 25 septembre 2026. À sa toute première connexion, un propriétaire d'animal ou un praticien voit une visite guidée sur l'interface réelle : le bouton concerné est cerclé « au crayon », une flèche courbe le relie à une bulle qui l'explique (titre en Lora italique, points de progression, boutons Précédent / Suivant, croix de fermeture). Parcours patient : notifications, messages, Mes animaux, Réserver, Mes rendez-vous, Documents (bureau), Profil. Parcours praticien : Mon espace, Mes patients, RDV, notifications, messages, profil. Les étapes dont le bouton n'est pas visible (barre mobile ou bureau) sont sautées automatiquement.</w:t>
+      </w:r>
+    </w:p>
+    <w:p>
+      <w:pPr>
+        <w:spacing w:after="160" w:line="300"/>
+      </w:pPr>
+      <w:r>
+        <w:t>Affichage unique par compte : la colonne profiles.onboarding_completed_at (migration 110) est renseignée à la fin de la visite ou à sa fermeture ; elle est nulle pour un nouveau compte et remplie d'office pour tous les comptes existants (seuls les nouveaux comptes voient donc la visite). Pas de bouton « revoir » (choix produit). Un praticien encore bloqué sur l'écran de dépôt de document ne déclenche pas la visite, qui démarre à sa première arrivée sur le vrai tableau de bord. Admins et secrétariat ne sont pas concernés. Code : src/lib/onboardingTour.ts (logique pure testée), src/components/onboarding/OnboardingTour.tsx (monté dans App.tsx), repères data-tour sur Navbar, MobileHeader, MobileTabBar et DoctorMobileTabBar.</w:t>
       </w:r>
     </w:p>
     <w:p>

</xml_diff>

<commit_message>
Docs: rattrape le cahier des charges (22-25/09) : push, CI/CD, RLS, perf mobile, suivis, partage de dossier, multi-métiers, relance, messagerie, visite guidée
Co-Authored-By: Claude Sonnet 5 <noreply@anthropic.com>
</commit_message>
<xml_diff>
--- a/cahier_des_charges_animeaux.docx
+++ b/cahier_des_charges_animeaux.docx
@@ -58,7 +58,7 @@
           <w:sz w:val="22"/>
           <w:szCs w:val="22"/>
         </w:rPr>
-        <w:t>Version 1.52 — document mis à jour avec les évolutions de juillet, août et septembre 2026 (vérification des praticiens par documents, correctif critique inscriptions, espace secrétariat en compte dédié, statut administrateur découplé du rôle, tableau de bord admin complet, domaine d'envoi Resend vérifié, carte Leaflet sur la fiche praticien avec géocodage des cabinets, domaine monanimeaux.fr connecté au site et indexé par Google, modération avancée admin, rappels de RDV par SMS, liste d'attente, rappels de vaccin proactifs, statistiques praticien, 368 tests unitaires, code-splitting par route, PWA installable, référencement de base, découpage vendor du bundle, réponse du praticien aux avis, export .ics du RDV, carnet de santé exportable, tri par prochaine disponibilité en recherche, notifications push navigateur, email + SMS de confirmation immédiate à la réservation, pages légales finalisées avec le SIRET, annulation de RDV patient corrigée, interface mobile dédiée pour l'espace patient avec recherche à deux champs et cartes animaux en bannière photo, rappel automatique pour laisser un avis après un RDV terminé, favoris praticiens, annulation de RDV côté praticien avec notification patient (in-app, email, SMS), correctif de redirection post-connexion, logo Animéaux dans tous les emails transactionnels, recherche de bugs applicative complète le 24 août 2026 : faille XSS critique corrigée sur la biographie praticien, durcissement de la sécurité au niveau colonne sur les rendez-vous/profils praticiens/messages/notifications, sécurisation des fonctions serveur d'envoi d'email-SMS-push contre les appels non autorisés, correctifs messagerie temps réel/documents de vérification/statistiques praticien/actions de modération admin, système de rappels automatiques (RDV à 24h, vaccin, avis) entièrement fiabilisé début septembre 2026 après plusieurs pannes silencieuses en cascade (vérification JWT de la plateforme, délai réseau trop court, désynchronisation de clé secrète, mauvaise colonne interrogée), erreurs de requête serveur désormais toujours visibles au lieu d'être ignorées silencieusement, adresse postale ajoutée au profil praticien, code de messagerie temps réel unifié entre l'espace patient et praticien, audit applicatif complet du 04/09/2026 : reconstruction de secours de 4 tables jamais commitées (animaux/vaccins/poids/dossiers de santé), verrouillage RLS niveau colonne étendu (avis, dossiers médicaux), durée de rendez-vous alignée sur la configuration réelle du praticien (45/60 min au lieu de 30 min fixe), garde-fou anti-doublon sur le rappel de RDV à 24h, rappel de vaccin en retard qui repart, confirmations ajoutées avant les actions destructrices du cabinet (retirer un membre, supprimer un tarif), renouvellement d'abonnement push géré, notification qui réutilise l'onglet déjà ouvert, plusieurs correctifs de fiabilité (connexion, invalidations de cache, routage administrateur), report de rendez-vous en libre-service pour le patient (au même titre que l'annulation), délai minimum d'1h avant le rendez-vous imposé au patient pour annuler ou reporter, flux calendrier abonnable (ICS) pour le praticien permettant de synchroniser tout son agenda confirmé en un clic dans Google Agenda ou Apple Calendrier, audit de sécurité complet du 05/09/2026 (8 revues croisées) : contournement RLS corrigé permettant à un patient de confirmer lui-même un RDV en attente et de le déplacer à sa guise, motif de rejet administratif d'un praticien retiré de la lecture publique, faille de remplacement de fichier de stockage entre utilisateurs corrigée, verrou ajouté empêchant un patient de forger la réponse du praticien à son propre avis, emails de confirmation/annulation/report de RDV et lien de confirmation de présence fiabilisés (requête ambiguë), échappement HTML généralisé dans les emails, correction du destinataire de l'email de report de RDV quand c'est le patient qui reporte, auto-réparation de l'abonnement aux notifications push, confirmations à deux clics harmonisées sur les annulations de RDV, messages d'erreur explicites au lieu d'échecs silencieux sur les actions de rendez-vous)</w:t>
+        <w:t>Version 1.53 — document mis à jour avec les évolutions de juillet, août et septembre 2026 (vérification des praticiens par documents, correctif critique inscriptions, espace secrétariat en compte dédié, statut administrateur découplé du rôle, tableau de bord admin complet, domaine d'envoi Resend vérifié, carte Leaflet sur la fiche praticien avec géocodage des cabinets, domaine monanimeaux.fr connecté au site et indexé par Google, modération avancée admin, rappels de RDV par SMS, liste d'attente, rappels de vaccin proactifs, statistiques praticien, 368 tests unitaires, code-splitting par route, PWA installable, référencement de base, découpage vendor du bundle, réponse du praticien aux avis, export .ics du RDV, carnet de santé exportable, tri par prochaine disponibilité en recherche, notifications push navigateur, email + SMS de confirmation immédiate à la réservation, pages légales finalisées avec le SIRET, annulation de RDV patient corrigée, interface mobile dédiée pour l'espace patient avec recherche à deux champs et cartes animaux en bannière photo, rappel automatique pour laisser un avis après un RDV terminé, favoris praticiens, annulation de RDV côté praticien avec notification patient (in-app, email, SMS), correctif de redirection post-connexion, logo Animéaux dans tous les emails transactionnels, recherche de bugs applicative complète le 24 août 2026 : faille XSS critique corrigée sur la biographie praticien, durcissement de la sécurité au niveau colonne sur les rendez-vous/profils praticiens/messages/notifications, sécurisation des fonctions serveur d'envoi d'email-SMS-push contre les appels non autorisés, correctifs messagerie temps réel/documents de vérification/statistiques praticien/actions de modération admin, système de rappels automatiques (RDV à 24h, vaccin, avis) entièrement fiabilisé début septembre 2026 après plusieurs pannes silencieuses en cascade (vérification JWT de la plateforme, délai réseau trop court, désynchronisation de clé secrète, mauvaise colonne interrogée), erreurs de requête serveur désormais toujours visibles au lieu d'être ignorées silencieusement, adresse postale ajoutée au profil praticien, code de messagerie temps réel unifié entre l'espace patient et praticien, audit applicatif complet du 04/09/2026 : reconstruction de secours de 4 tables jamais commitées (animaux/vaccins/poids/dossiers de santé), verrouillage RLS niveau colonne étendu (avis, dossiers médicaux), durée de rendez-vous alignée sur la configuration réelle du praticien (45/60 min au lieu de 30 min fixe), garde-fou anti-doublon sur le rappel de RDV à 24h, rappel de vaccin en retard qui repart, confirmations ajoutées avant les actions destructrices du cabinet (retirer un membre, supprimer un tarif), renouvellement d'abonnement push géré, notification qui réutilise l'onglet déjà ouvert, plusieurs correctifs de fiabilité (connexion, invalidations de cache, routage administrateur), report de rendez-vous en libre-service pour le patient (au même titre que l'annulation), délai minimum d'1h avant le rendez-vous imposé au patient pour annuler ou reporter, flux calendrier abonnable (ICS) pour le praticien permettant de synchroniser tout son agenda confirmé en un clic dans Google Agenda ou Apple Calendrier, audit de sécurité complet du 05/09/2026 (8 revues croisées) : contournement RLS corrigé permettant à un patient de confirmer lui-même un RDV en attente et de le déplacer à sa guise, motif de rejet administratif d'un praticien retiré de la lecture publique, faille de remplacement de fichier de stockage entre utilisateurs corrigée, verrou ajouté empêchant un patient de forger la réponse du praticien à son propre avis, emails de confirmation/annulation/report de RDV et lien de confirmation de présence fiabilisés (requête ambiguë), échappement HTML généralisé dans les emails, correction du destinataire de l'email de report de RDV quand c'est le patient qui reporte, auto-réparation de l'abonnement aux notifications push, confirmations à deux clics harmonisées sur les annulations de RDV, messages d'erreur explicites au lieu d'échecs silencieux sur les actions de rendez-vous; puis du 22 au 25/09/2026 : notifications push enfin fonctionnelles, pipeline de déploiement automatisé (fonctions Edge, tests bloquants, Sentry), corrections de récursions RLS sur l'espace praticien, performances mobile (graphique et carte chargés à la demande, images en lazy loading), rappels de suivi généralisés (vaccin, vermifuge, bilan annuel), partage de dossier animal entre praticiens avec l'accord du propriétaire, praticiens à plusieurs métiers, page Mes animaux allégée, relance des patients inactifs, interrupteur de messagerie par praticien, visite guidée de première connexion, 473 tests unitaires)</w:t>
       </w:r>
     </w:p>
     <w:p>
@@ -1136,7 +1136,7 @@
         <w:spacing w:after="100"/>
       </w:pPr>
       <w:r>
-        <w:t xml:space="preserve">supabase/migrations/ — historique SQL versionné (46 fichiers à ce jour)</w:t>
+        <w:t>supabase/migrations/ — historique SQL versionné (110 fichiers à ce jour)</w:t>
       </w:r>
     </w:p>
     <w:p>
@@ -1287,7 +1287,7 @@
         <w:spacing w:after="160" w:line="300"/>
       </w:pPr>
       <w:r>
-        <w:t xml:space="preserve">Le schéma de base (enums, tables principales, RLS) est versionné dans supabase/migrations/001_schema.sql, complété par 45 migrations correctives et additives. Sept tables (animals, vaccines, weight_tracking, health_records, clinics, clinic_members, clinic_services) ont été créées directement depuis le tableau de bord Supabase et n'apparaissent dans aucune migration committée : leur schéma ci-dessous est donc reconstitué à partir de leur usage réel dans le code TypeScript (src/types/index.ts et src/hooks/useData.ts), pas d'un fichier SQL source. Ce point est confirmé explicitement par un commentaire de la migration 023.</w:t>
+        <w:t>Le schéma de base (enums, tables principales, RLS) est versionné dans supabase/migrations/001_schema.sql, complété par 109 migrations correctives et additives. Sept tables (animals, vaccines, weight_tracking, health_records, clinics, clinic_members, clinic_services) ont été créées directement depuis le tableau de bord Supabase et n'apparaissent dans aucune migration committée : leur schéma ci-dessous est donc reconstitué à partir de leur usage réel dans le code TypeScript (src/types/index.ts et src/hooks/useData.ts), pas d'un fichier SQL source. Ce point est confirmé explicitement par un commentaire de la migration 023.</w:t>
       </w:r>
     </w:p>
     <w:p>
@@ -2454,6 +2454,14 @@
     </w:p>
     <w:p>
       <w:pPr>
+        <w:spacing w:after="160" w:line="300"/>
+      </w:pPr>
+      <w:r>
+        <w:t>Mise à jour du 23–25/09/2026 : (1) la table vaccines a été renommée care_items et généralisée en « suivis » (migration 100) : une colonne care_type (vaccine, deworming, checkup, other) couvre vaccin, vermifuge, bilan annuel et autre suivi ; les huit policies RLS ont été recréées à l'identique sous le nouveau nom, et l'ancien type de notification vaccine_reminder est conservé pour l'historique à côté du nouveau care_reminder. (2) Nouvelle table animal_referrals (migration 105) : animal_id, owner_id (dérivé côté serveur par trigger depuis animals.owner_id, jamais fourni par le client), referring_doctor_id, target_doctor_id, reason, status (pending, accepted, declined, revoked), created_at, responded_at ; un index unique empêche deux demandes en attente identiques pour un même animal et un même praticien destinataire ; le statut accepted EST le droit d'accès, sans table séparée à synchroniser. (3) Colonnes ajoutées : doctors.specialties (tableau de métiers, migration 102, qui remplace doctors.specialty supprimée en migration 107), doctors.messaging_enabled (migration 109), appointments.reengagement_reminder_sent_at (migration 108), profiles.onboarding_completed_at (migration 110).</w:t>
+      </w:r>
+    </w:p>
+    <w:p>
+      <w:pPr>
         <w:pStyle w:val="Heading2"/>
         <w:spacing w:after="150" w:before="300"/>
       </w:pPr>
@@ -3939,6 +3947,14 @@
     </w:p>
     <w:p>
       <w:pPr>
+        <w:spacing w:after="160" w:line="300"/>
+      </w:pPr>
+      <w:r>
+        <w:t>Mise à jour du 24/09/2026 — partage de dossier entre praticiens avec l'accord du propriétaire (migrations 104 à 106) : un praticien A qui a déjà un accès légitime peut proposer l'envoi du dossier d'un animal à un confrère B (bouton « Envoyer à un confrère » sur la fiche de santé, avec un message de contexte). B n'obtient rien tant que le propriétaire n'a pas accepté ; une fois accepté, B a un accès en lecture seule, limité à cet animal précis (pas aux autres animaux du propriétaire), sur animals, care_items, weight_tracking, health_records, animal_documents et sur le profil du propriétaire (pour afficher son nom). Le propriétaire peut révoquer à tout moment. Les transitions de statut sont verrouillées par trigger (pending vers accepted ou declined, accepted vers revoked, rien d'autre) et les notifications (referral_requested, referral_accepted, referral_declined, referral_revoked) sont créées par des triggers SQL, jamais côté client. Dans l'onglet Mes patients du praticien, une sous-section « Dossiers reçus en référence » est séparée de la liste habituelle, car la portée est différente (un seul animal). Trouvaille corrigée dans le même lot : la policy « animals: vétérinaire peut voir » (migration 081) autorisait n'importe quel praticien connecté à lire la fiche de n'importe quel animal sans lien avec son propriétaire (pas les données médicales, déjà protégées) ; aucune fonctionnalité n'en dépendait, elle a été supprimée (migration 104). Autre point : les trois policies RLS « propriétaire » de care_items, weight_tracking et health_records existaient en production sans figurer dans aucune migration ; elles ont été versionnées à l'identique (migration 101) après vérification via pg_policies.</w:t>
+      </w:r>
+    </w:p>
+    <w:p>
+      <w:pPr>
         <w:pStyle w:val="Heading2"/>
         <w:spacing w:after="150" w:before="300"/>
       </w:pPr>
@@ -4467,6 +4483,14 @@
     </w:p>
     <w:p>
       <w:pPr>
+        <w:spacing w:after="160" w:line="300"/>
+      </w:pPr>
+      <w:r>
+        <w:t>Mise à jour du 23–24/09/2026 : un praticien peut cumuler plusieurs métiers (exemple : éducatrice canine et naturopathe). Le champ unique est remplacé par doctors.specialties (tableau, migration 102) ; un sélecteur multiple (PractitionerTypePicker) est présent à l'inscription et dans les deux pages de profil praticien, tous les métiers s'affichent sur la fiche publique, la recherche filtre sur n'importe lequel d'entre eux (matchesAnySpecialty), et le préfixe « Dr » n'est appliqué que si « Vétérinaire » fait partie des métiers (formatDoctorName). Basculement terminé le 24/09 (migration 107) : les six dernières fonctions SQL (recherche de cabinet et cinq vues admin) lisent specialties et la colonne doctors.specialty a été supprimée.</w:t>
+      </w:r>
+    </w:p>
+    <w:p>
+      <w:pPr>
         <w:pStyle w:val="Heading2"/>
         <w:spacing w:after="150" w:before="300"/>
       </w:pPr>
@@ -4550,6 +4574,14 @@
     </w:p>
     <w:p>
       <w:pPr>
+        <w:spacing w:after="160" w:line="300"/>
+      </w:pPr>
+      <w:r>
+        <w:t>Mise à jour du 23–24/09/2026 : l'onglet Vaccins devient « Suivis » et gère quatre types (vaccin, vermifuge, bilan annuel, autre) via un sélecteur de type (src/lib/careTypes.ts). Les rappels /rappels, l'export du dossier et les notifications acceptent les deux types de notification (vaccine_reminder pour l'historique, care_reminder pour la suite). La page « Mes animaux » charge désormais le poids et les suivis de tous les animaux en deux requêtes groupées au lieu de deux requêtes par animal, et le statut de chaque animal est calculé une seule fois au niveau de la page. Les photos d'animaux déjà présentes dans le stockage ont été recompressées le 25/09 (9 fichiers, 31,6 Mo ramenés à 0,93 Mo) avec les mêmes réglages que la compression côté client (900 px de large, JPEG qualité 82), sans changer leur adresse.</w:t>
+      </w:r>
+    </w:p>
+    <w:p>
+      <w:pPr>
         <w:pStyle w:val="Heading2"/>
         <w:spacing w:after="150" w:before="300"/>
       </w:pPr>
@@ -4770,6 +4802,14 @@
     </w:p>
     <w:p>
       <w:pPr>
+        <w:spacing w:after="160" w:line="300"/>
+      </w:pPr>
+      <w:r>
+        <w:t>Mise à jour du 25/09/2026 : (1) un interrupteur « messagerie » par praticien (doctors.messaging_enabled, migration 109), présent dans les deux pages de profil (page /profil et onglet Profil du tableau de bord). Il est appliqué par une policy RLS restrictive sur messages, pas par un simple masquage : un patient qui tente d'écrire reçoit « Ce praticien a désactivé la messagerie pour le moment. ». Les conversations déjà en cours restent lisibles, seuls les nouveaux messages sont bloqués. (2) Sélecteur multi-métiers (voir section 6.7). (3) Sous-section « Dossiers reçus en référence » dans l'onglet Mes patients (voir section 5.2).</w:t>
+      </w:r>
+    </w:p>
+    <w:p>
+      <w:pPr>
         <w:pStyle w:val="Heading2"/>
         <w:spacing w:after="150" w:before="300"/>
       </w:pPr>
@@ -4935,6 +4975,14 @@
       </w:pPr>
       <w:r>
         <w:t>Complément du 23 juillet 2026 : la même fonction envoie désormais aussi un rappel de vaccin (email + SMS + notification in-app) dans les 7 jours précédant vaccines.next_due_date, saisi par le praticien sur le dossier de santé de l'animal (section 6.10) — jusqu'ici affiché seulement passivement sur /rappels (section 6.12). Un seul envoi par vaccin (colonne reminder_sent_at, migration 066) : la fenêtre de 7 jours ne redéclenche pas l'alerte à chaque exécution horaire du cron.</w:t>
+      </w:r>
+    </w:p>
+    <w:p>
+      <w:pPr>
+        <w:spacing w:after="160" w:line="300"/>
+      </w:pPr>
+      <w:r>
+        <w:t>Complément du 23 et du 25/09/2026 : les rappels de suivi couvrent tous les types de care_items (vaccin, vermifuge, bilan annuel, autre), avec un libellé adapté dans l'email, le SMS et la notification. Nouveau : relance des patients inactifs — un patient dont le dernier rendez-vous terminé remonte à plus de 6 mois reçoit une notification de relance (type reengagement_reminder, qui l'amène vers la recherche), une seule fois (colonne appointments.reengagement_reminder_sent_at, migration 108). Le regroupement « dernier rendez-vous par patient » est fait en mémoire dans la fonction ; le seuil de 6 mois est une seule ligne de send-reminders/index.ts. Cette fonction se redéploie désormais automatiquement (voir section 13, pipeline du 22–23/09/2026).</w:t>
       </w:r>
     </w:p>
     <w:p>
@@ -7480,6 +7528,54 @@
       </w:pPr>
       <w:r>
         <w:t>Changement du 21/09/2026 : jusqu'ici, un praticien pouvait utiliser librement tout son espace (patients, agenda, tarifs...) dès son inscription, seule sa fiche publique restait invisible en recherche tant qu'elle n'était pas validée. Anaïs a jugé ce fonctionnement insuffisant : n'importe qui pouvait s'inscrire et se servir de l'application sans jamais prouver son identité ou sa formation. Désormais, dès sa toute première connexion, le praticien tombe directement sur un écran obligatoire de dépôt de document (diplôme, carte professionnelle, extrait Kbis...) à la place de son espace habituel, et ne peut y accéder qu'une fois son dossier validé par une administratrice. Ajouté au passage l'extrait Kbis, qui manquait à la liste des types de documents proposés.</w:t>
+      </w:r>
+    </w:p>
+    <w:p>
+      <w:pPr>
+        <w:spacing w:after="160" w:line="300"/>
+      </w:pPr>
+      <w:r>
+        <w:t>Résolu le 22/09/2026 : notifications push jamais fonctionnelles depuis leur mise en place, malgré plusieurs activations. Deux causes cumulées, diagnostiquées via le corps réel des réponses HTTP (net._http_response) : (1) le trigger d'envoi utilisait une clé service_role copiée à la main dans Vault, dont le format ne correspondait plus à celui que la plateforme injecte dans les fonctions Edge — remplacée par un secret dédié que l'on contrôle (migration 099 : push_trigger_secret dans Vault + PUSH_TRIGGER_SECRET sur la fonction) ; (2) l'option « Verify JWT » de send-push rejetait la requête avant qu'elle atteigne le code, un secret personnalisé n'étant pas un JWT — et redéployer une fonction depuis le tableau de bord réactive cette option. La clé publique VAPID manquait aussi dans les variables Vercel, ce qui faisait échouer silencieusement tout nouvel abonnement. Le panneau de notifications, écrasé ou débordant sur mobile, a été corrigé le même jour et toutes les notifications sont désormais cliquables avec la bonne destination selon le rôle.</w:t>
+      </w:r>
+    </w:p>
+    <w:p>
+      <w:pPr>
+        <w:spacing w:after="160" w:line="300"/>
+      </w:pPr>
+      <w:r>
+        <w:t>Ajouté le 22–23/09/2026 : fiabilisation du déploiement. supabase/config.toml déclare verify_jwt = false pour les 10 fonctions Edge (réglage qui se réinitialisait silencieusement à chaque redéploiement manuel) ; le workflow GitHub Actions deploy-functions.yml exécute d'abord les tests puis déploie les fonctions Edge à chaque push sur main touchant supabase/functions/** ou config.toml (secret SUPABASE_ACCESS_TOKEN configuré) ; le script build inclut vitest run, donc un déploiement Vercel dont les tests échouent n'est plus mis en ligne ; VITE_SENTRY_DSN et VITE_VAPID_PUBLIC_KEY sont configurées en production (Sentry était codé mais jamais actif faute de DSN). npm ci s'est révélé trop fragile ici (dépendances optionnelles multi-plateformes) et est remplacé par npm install ; Node est fixé à 24 (Node 20 fait échouer jsdom/undici). Les migrations SQL restent volontairement appliquées à la main.</w:t>
+      </w:r>
+    </w:p>
+    <w:p>
+      <w:pPr>
+        <w:spacing w:after="160" w:line="300"/>
+      </w:pPr>
+      <w:r>
+        <w:t>Résolu le 22/09/2026 : chargement infini de l'espace praticien, causé par des récursions infinies de policies RLS sur doctors (migration 094, puis correctifs 096 et 097), diagnostiquées dans les Postgres Logs. Deux boucles : une clause « collègues de cabinet se voient » relisait doctors depuis la policy de doctors elle-même (retirée), et une clause « le patient a un rendez-vous avec ce praticien » relisait appointments dont la policy relit doctors (lecture isolée dans la fonction security definer has_appointment_with_doctor). Règle retenue : une policy ne doit jamais relire sa propre table, même indirectement via une autre table. Un audit du 23/09 a aussi corrigé le bouton « Voir les disponibilités » visible par tout rôle sur la fiche praticien, et ajouté le garde-fou de secret RESEND_API_KEY manquant dans 6 fonctions d'email.</w:t>
+      </w:r>
+    </w:p>
+    <w:p>
+      <w:pPr>
+        <w:spacing w:after="160" w:line="300"/>
+      </w:pPr>
+      <w:r>
+        <w:t>Résolu le 23/09/2026 : lenteur signalée sur mobile. Audit du build de production : (1) recharts (353 Ko) était chargé à chaque ouverture de la fiche santé d'un animal — désormais un composant chargé à la demande (WeightChart, React.lazy) ; (2) aucune des images de contenu n'avait loading="lazy" — ajouté sur les 22 images réseau (avatars, logos de cabinet, photos d'animaux, miniatures) ; (3) leaflet.css était chargé depuis un CDN, en bloquant le rendu, sur toutes les pages alors que seule la fiche praticien affiche une carte — importé localement dans LocationMap, chargé à la demande (le chunk de la fiche praticien passe de 49 Ko à 3,7 Ko). Corrigés aussi : plusieurs débordements horizontaux mobile (truncate sans min-w-0 dans un flex, badge Engagement) et un filet de sécurité global contre le défilement horizontal.</w:t>
+      </w:r>
+    </w:p>
+    <w:p>
+      <w:pPr>
+        <w:spacing w:after="160" w:line="300"/>
+      </w:pPr>
+      <w:r>
+        <w:t>Résolu le 23/09/2026 : nettoyage de quatre comptes de test créés pendant les sessions de développement (suppression via un script vérifiant d'abord les règles ON DELETE des clés étrangères — seules appointments.doctor_id/patient_id sont en RESTRICT et clinic_staff.invited_by en NO ACTION). Ce nettoyage a révélé que delete_my_account() (suppression de compte en libre-service) référençait encore l'ancienne table vaccines, renommée care_items le même soir : la suppression de compte était donc cassée pour tous les utilisateurs. Corrigé en migration 103 ; leçon retenue : après tout renommage de table, chercher l'ancien nom dans TOUTES les migrations et fonctions, pas seulement dans les fichiers de policies modifiés.</w:t>
+      </w:r>
+    </w:p>
+    <w:p>
+      <w:pPr>
+        <w:spacing w:after="160" w:line="300"/>
+      </w:pPr>
+      <w:r>
+        <w:t>Ajouté le 25/09/2026 : visite guidée de première connexion (section 6.16), affichée une seule fois par compte grâce à profiles.onboarding_completed_at (migration 110, appliquée d'office à tous les comptes existants). Le composant se lance seulement si le profil contient explicitement null (une valeur absente, cas d'un profil mis en cache avant la migration, n'affiche rien). Le compte administrateur ne la voit jamais : pour la tester il faut un compte propriétaire ou praticien non admin, neuf ou remis à null. Le nombre de tests est passé à 473.</w:t>
       </w:r>
     </w:p>
     <w:sectPr>

</xml_diff>

<commit_message>
Nettoyage : imports/variables inutilisés, .DS_Store retirés du suivi git ; docs à jour
Co-Authored-By: Claude Sonnet 5 <noreply@anthropic.com>
</commit_message>
<xml_diff>
--- a/cahier_des_charges_animeaux.docx
+++ b/cahier_des_charges_animeaux.docx
@@ -58,7 +58,7 @@
           <w:sz w:val="22"/>
           <w:szCs w:val="22"/>
         </w:rPr>
-        <w:t>Version 1.53 — document mis à jour avec les évolutions de juillet, août et septembre 2026 (vérification des praticiens par documents, correctif critique inscriptions, espace secrétariat en compte dédié, statut administrateur découplé du rôle, tableau de bord admin complet, domaine d'envoi Resend vérifié, carte Leaflet sur la fiche praticien avec géocodage des cabinets, domaine monanimeaux.fr connecté au site et indexé par Google, modération avancée admin, rappels de RDV par SMS, liste d'attente, rappels de vaccin proactifs, statistiques praticien, 368 tests unitaires, code-splitting par route, PWA installable, référencement de base, découpage vendor du bundle, réponse du praticien aux avis, export .ics du RDV, carnet de santé exportable, tri par prochaine disponibilité en recherche, notifications push navigateur, email + SMS de confirmation immédiate à la réservation, pages légales finalisées avec le SIRET, annulation de RDV patient corrigée, interface mobile dédiée pour l'espace patient avec recherche à deux champs et cartes animaux en bannière photo, rappel automatique pour laisser un avis après un RDV terminé, favoris praticiens, annulation de RDV côté praticien avec notification patient (in-app, email, SMS), correctif de redirection post-connexion, logo Animéaux dans tous les emails transactionnels, recherche de bugs applicative complète le 24 août 2026 : faille XSS critique corrigée sur la biographie praticien, durcissement de la sécurité au niveau colonne sur les rendez-vous/profils praticiens/messages/notifications, sécurisation des fonctions serveur d'envoi d'email-SMS-push contre les appels non autorisés, correctifs messagerie temps réel/documents de vérification/statistiques praticien/actions de modération admin, système de rappels automatiques (RDV à 24h, vaccin, avis) entièrement fiabilisé début septembre 2026 après plusieurs pannes silencieuses en cascade (vérification JWT de la plateforme, délai réseau trop court, désynchronisation de clé secrète, mauvaise colonne interrogée), erreurs de requête serveur désormais toujours visibles au lieu d'être ignorées silencieusement, adresse postale ajoutée au profil praticien, code de messagerie temps réel unifié entre l'espace patient et praticien, audit applicatif complet du 04/09/2026 : reconstruction de secours de 4 tables jamais commitées (animaux/vaccins/poids/dossiers de santé), verrouillage RLS niveau colonne étendu (avis, dossiers médicaux), durée de rendez-vous alignée sur la configuration réelle du praticien (45/60 min au lieu de 30 min fixe), garde-fou anti-doublon sur le rappel de RDV à 24h, rappel de vaccin en retard qui repart, confirmations ajoutées avant les actions destructrices du cabinet (retirer un membre, supprimer un tarif), renouvellement d'abonnement push géré, notification qui réutilise l'onglet déjà ouvert, plusieurs correctifs de fiabilité (connexion, invalidations de cache, routage administrateur), report de rendez-vous en libre-service pour le patient (au même titre que l'annulation), délai minimum d'1h avant le rendez-vous imposé au patient pour annuler ou reporter, flux calendrier abonnable (ICS) pour le praticien permettant de synchroniser tout son agenda confirmé en un clic dans Google Agenda ou Apple Calendrier, audit de sécurité complet du 05/09/2026 (8 revues croisées) : contournement RLS corrigé permettant à un patient de confirmer lui-même un RDV en attente et de le déplacer à sa guise, motif de rejet administratif d'un praticien retiré de la lecture publique, faille de remplacement de fichier de stockage entre utilisateurs corrigée, verrou ajouté empêchant un patient de forger la réponse du praticien à son propre avis, emails de confirmation/annulation/report de RDV et lien de confirmation de présence fiabilisés (requête ambiguë), échappement HTML généralisé dans les emails, correction du destinataire de l'email de report de RDV quand c'est le patient qui reporte, auto-réparation de l'abonnement aux notifications push, confirmations à deux clics harmonisées sur les annulations de RDV, messages d'erreur explicites au lieu d'échecs silencieux sur les actions de rendez-vous; puis du 22 au 25/09/2026 : notifications push enfin fonctionnelles, pipeline de déploiement automatisé (fonctions Edge, tests bloquants, Sentry), corrections de récursions RLS sur l'espace praticien, performances mobile (graphique et carte chargés à la demande, images en lazy loading), rappels de suivi généralisés (vaccin, vermifuge, bilan annuel), partage de dossier animal entre praticiens avec l'accord du propriétaire, praticiens à plusieurs métiers, page Mes animaux allégée, relance des patients inactifs, interrupteur de messagerie par praticien, visite guidée de première connexion, 473 tests unitaires)</w:t>
+        <w:t>Version 1.53 — document mis à jour avec les évolutions de juillet, août et septembre 2026 (vérification des praticiens par documents, correctif critique inscriptions, espace secrétariat en compte dédié, statut administrateur découplé du rôle, tableau de bord admin complet, domaine d'envoi Resend vérifié, carte Leaflet sur la fiche praticien avec géocodage des cabinets, domaine monanimeaux.fr connecté au site et indexé par Google, modération avancée admin, rappels de RDV par SMS, liste d'attente, rappels de vaccin proactifs, statistiques praticien, 368 tests unitaires, code-splitting par route, PWA installable, référencement de base, découpage vendor du bundle, réponse du praticien aux avis, export .ics du RDV, carnet de santé exportable, tri par prochaine disponibilité en recherche, notifications push navigateur, email + SMS de confirmation immédiate à la réservation, pages légales finalisées avec le SIRET, annulation de RDV patient corrigée, interface mobile dédiée pour l'espace patient avec recherche à deux champs et cartes animaux en bannière photo, rappel automatique pour laisser un avis après un RDV terminé, favoris praticiens, annulation de RDV côté praticien avec notification patient (in-app, email, SMS), correctif de redirection post-connexion, logo Animéaux dans tous les emails transactionnels, recherche de bugs applicative complète le 24 août 2026 : faille XSS critique corrigée sur la biographie praticien, durcissement de la sécurité au niveau colonne sur les rendez-vous/profils praticiens/messages/notifications, sécurisation des fonctions serveur d'envoi d'email-SMS-push contre les appels non autorisés, correctifs messagerie temps réel/documents de vérification/statistiques praticien/actions de modération admin, système de rappels automatiques (RDV à 24h, vaccin, avis) entièrement fiabilisé début septembre 2026 après plusieurs pannes silencieuses en cascade (vérification JWT de la plateforme, délai réseau trop court, désynchronisation de clé secrète, mauvaise colonne interrogée), erreurs de requête serveur désormais toujours visibles au lieu d'être ignorées silencieusement, adresse postale ajoutée au profil praticien, code de messagerie temps réel unifié entre l'espace patient et praticien, audit applicatif complet du 04/09/2026 : reconstruction de secours de 4 tables jamais commitées (animaux/vaccins/poids/dossiers de santé), verrouillage RLS niveau colonne étendu (avis, dossiers médicaux), durée de rendez-vous alignée sur la configuration réelle du praticien (45/60 min au lieu de 30 min fixe), garde-fou anti-doublon sur le rappel de RDV à 24h, rappel de vaccin en retard qui repart, confirmations ajoutées avant les actions destructrices du cabinet (retirer un membre, supprimer un tarif), renouvellement d'abonnement push géré, notification qui réutilise l'onglet déjà ouvert, plusieurs correctifs de fiabilité (connexion, invalidations de cache, routage administrateur), report de rendez-vous en libre-service pour le patient (au même titre que l'annulation), délai minimum d'1h avant le rendez-vous imposé au patient pour annuler ou reporter, flux calendrier abonnable (ICS) pour le praticien permettant de synchroniser tout son agenda confirmé en un clic dans Google Agenda ou Apple Calendrier, audit de sécurité complet du 05/09/2026 (8 revues croisées) : contournement RLS corrigé permettant à un patient de confirmer lui-même un RDV en attente et de le déplacer à sa guise, motif de rejet administratif d'un praticien retiré de la lecture publique, faille de remplacement de fichier de stockage entre utilisateurs corrigée, verrou ajouté empêchant un patient de forger la réponse du praticien à son propre avis, emails de confirmation/annulation/report de RDV et lien de confirmation de présence fiabilisés (requête ambiguë), échappement HTML généralisé dans les emails, correction du destinataire de l'email de report de RDV quand c'est le patient qui reporte, auto-réparation de l'abonnement aux notifications push, confirmations à deux clics harmonisées sur les annulations de RDV, messages d'erreur explicites au lieu d'échecs silencieux sur les actions de rendez-vous; puis du 22 au 25/09/2026 : notifications push enfin fonctionnelles, pipeline de déploiement automatisé (fonctions Edge, tests bloquants, Sentry), corrections de récursions RLS sur l'espace praticien, performances mobile (graphique et carte chargés à la demande, images en lazy loading), rappels de suivi généralisés (vaccin, vermifuge, bilan annuel), partage de dossier animal entre praticiens avec l'accord du propriétaire, praticiens à plusieurs métiers, page Mes animaux allégée, relance des patients inactifs, interrupteur de messagerie par praticien, visite guidée de première connexion, 480 tests unitaires, email de confirmation d'inscription refait (lien cliquable, en français))</w:t>
       </w:r>
     </w:p>
     <w:p>
@@ -7575,7 +7575,23 @@
         <w:spacing w:after="160" w:line="300"/>
       </w:pPr>
       <w:r>
-        <w:t>Ajouté le 25/09/2026 : visite guidée de première connexion (section 6.16), affichée une seule fois par compte grâce à profiles.onboarding_completed_at (migration 110, appliquée d'office à tous les comptes existants). Le composant se lance seulement si le profil contient explicitement null (une valeur absente, cas d'un profil mis en cache avant la migration, n'affiche rien). Le compte administrateur ne la voit jamais : pour la tester il faut un compte propriétaire ou praticien non admin, neuf ou remis à null. Le nombre de tests est passé à 473.</w:t>
+        <w:t>Ajouté le 25/09/2026 : visite guidée de première connexion (section 6.16), affichée une seule fois par compte grâce à profiles.onboarding_completed_at (migration 110, appliquée d'office à tous les comptes existants). Le composant se lance seulement si le profil contient explicitement null (une valeur absente, cas d'un profil mis en cache avant la migration, n'affiche rien). Le compte administrateur ne la voit jamais : pour la tester il faut un compte propriétaire ou praticien non admin, neuf ou remis à null. Le parcours praticien couvre aussi Tarifs, Avis, Statistiques et Mon cabinet (ce dernier seulement en cabinet). Le nombre de tests est passé à 480.</w:t>
+      </w:r>
+    </w:p>
+    <w:p>
+      <w:pPr>
+        <w:spacing w:after="160" w:line="300"/>
+      </w:pPr>
+      <w:r>
+        <w:t>Résolu le 25/09/2026 : lors du test d'inscription d'un compte praticien, l'email de confirmation d'adresse (email Auth de Supabase, envoyé via le SMTP Resend) arrivait dans les spams avec un sujet bilingue (« Confirm your email address (Confirmez votre adresse e-mail) ») et un « bouton » qui n'était que du texte, sans lien cliquable — le modèle réellement configuré dans le tableau de bord Supabase n'était pas celui versionné dans supabase/email-templates/confirm-signup.html. Le modèle a été refait (français, logo et couleurs des autres emails transactionnels, vrai bouton, lien brut répété en clair sous le bouton pour les clients mail ou traductions automatiques qui neutralisent les boutons) et collé dans Authentication, Emails, Templates, Confirm signup ; l'essai avec une adresse alias a confirmé le bon fonctionnement. Point d'attention : ce modèle vit dans le tableau de bord, pas dans le déploiement — le fichier du dépôt n'en est que la référence à recoller après tout changement.</w:t>
+      </w:r>
+    </w:p>
+    <w:p>
+      <w:pPr>
+        <w:spacing w:after="160" w:line="300"/>
+      </w:pPr>
+      <w:r>
+        <w:t>Nettoyage du 25/09/2026 : suppression des variables et imports inutilisés signalés par tsc --noUnusedLocals --noUnusedParameters (10 occurrences dans Navbar, useData, AnimalHealthPage, BookPage, DoctorDashboard, MessagesPage, RegisterPage, sans effet sur le comportement) et retrait du suivi git des fichiers .DS_Store, déjà exclus par .gitignore. Points connus, laissés en l'état : npm run lint échoue car eslint n'est pas installé en dépendance, et la fonction referralStatusLabel (src/lib/animalReferrals.ts) est testée mais n'est plus affichée dans l'interface.</w:t>
       </w:r>
     </w:p>
     <w:sectPr>

</xml_diff>

<commit_message>
Afficher le statut des partages de dossier au praticien qui les envoie ; npm run lint repointé sur tsc
Co-Authored-By: Claude Sonnet 5 <noreply@anthropic.com>
</commit_message>
<xml_diff>
--- a/cahier_des_charges_animeaux.docx
+++ b/cahier_des_charges_animeaux.docx
@@ -58,7 +58,7 @@
           <w:sz w:val="22"/>
           <w:szCs w:val="22"/>
         </w:rPr>
-        <w:t>Version 1.53 — document mis à jour avec les évolutions de juillet, août et septembre 2026 (vérification des praticiens par documents, correctif critique inscriptions, espace secrétariat en compte dédié, statut administrateur découplé du rôle, tableau de bord admin complet, domaine d'envoi Resend vérifié, carte Leaflet sur la fiche praticien avec géocodage des cabinets, domaine monanimeaux.fr connecté au site et indexé par Google, modération avancée admin, rappels de RDV par SMS, liste d'attente, rappels de vaccin proactifs, statistiques praticien, 368 tests unitaires, code-splitting par route, PWA installable, référencement de base, découpage vendor du bundle, réponse du praticien aux avis, export .ics du RDV, carnet de santé exportable, tri par prochaine disponibilité en recherche, notifications push navigateur, email + SMS de confirmation immédiate à la réservation, pages légales finalisées avec le SIRET, annulation de RDV patient corrigée, interface mobile dédiée pour l'espace patient avec recherche à deux champs et cartes animaux en bannière photo, rappel automatique pour laisser un avis après un RDV terminé, favoris praticiens, annulation de RDV côté praticien avec notification patient (in-app, email, SMS), correctif de redirection post-connexion, logo Animéaux dans tous les emails transactionnels, recherche de bugs applicative complète le 24 août 2026 : faille XSS critique corrigée sur la biographie praticien, durcissement de la sécurité au niveau colonne sur les rendez-vous/profils praticiens/messages/notifications, sécurisation des fonctions serveur d'envoi d'email-SMS-push contre les appels non autorisés, correctifs messagerie temps réel/documents de vérification/statistiques praticien/actions de modération admin, système de rappels automatiques (RDV à 24h, vaccin, avis) entièrement fiabilisé début septembre 2026 après plusieurs pannes silencieuses en cascade (vérification JWT de la plateforme, délai réseau trop court, désynchronisation de clé secrète, mauvaise colonne interrogée), erreurs de requête serveur désormais toujours visibles au lieu d'être ignorées silencieusement, adresse postale ajoutée au profil praticien, code de messagerie temps réel unifié entre l'espace patient et praticien, audit applicatif complet du 04/09/2026 : reconstruction de secours de 4 tables jamais commitées (animaux/vaccins/poids/dossiers de santé), verrouillage RLS niveau colonne étendu (avis, dossiers médicaux), durée de rendez-vous alignée sur la configuration réelle du praticien (45/60 min au lieu de 30 min fixe), garde-fou anti-doublon sur le rappel de RDV à 24h, rappel de vaccin en retard qui repart, confirmations ajoutées avant les actions destructrices du cabinet (retirer un membre, supprimer un tarif), renouvellement d'abonnement push géré, notification qui réutilise l'onglet déjà ouvert, plusieurs correctifs de fiabilité (connexion, invalidations de cache, routage administrateur), report de rendez-vous en libre-service pour le patient (au même titre que l'annulation), délai minimum d'1h avant le rendez-vous imposé au patient pour annuler ou reporter, flux calendrier abonnable (ICS) pour le praticien permettant de synchroniser tout son agenda confirmé en un clic dans Google Agenda ou Apple Calendrier, audit de sécurité complet du 05/09/2026 (8 revues croisées) : contournement RLS corrigé permettant à un patient de confirmer lui-même un RDV en attente et de le déplacer à sa guise, motif de rejet administratif d'un praticien retiré de la lecture publique, faille de remplacement de fichier de stockage entre utilisateurs corrigée, verrou ajouté empêchant un patient de forger la réponse du praticien à son propre avis, emails de confirmation/annulation/report de RDV et lien de confirmation de présence fiabilisés (requête ambiguë), échappement HTML généralisé dans les emails, correction du destinataire de l'email de report de RDV quand c'est le patient qui reporte, auto-réparation de l'abonnement aux notifications push, confirmations à deux clics harmonisées sur les annulations de RDV, messages d'erreur explicites au lieu d'échecs silencieux sur les actions de rendez-vous; puis du 22 au 25/09/2026 : notifications push enfin fonctionnelles, pipeline de déploiement automatisé (fonctions Edge, tests bloquants, Sentry), corrections de récursions RLS sur l'espace praticien, performances mobile (graphique et carte chargés à la demande, images en lazy loading), rappels de suivi généralisés (vaccin, vermifuge, bilan annuel), partage de dossier animal entre praticiens avec l'accord du propriétaire, praticiens à plusieurs métiers, page Mes animaux allégée, relance des patients inactifs, interrupteur de messagerie par praticien, visite guidée de première connexion, 480 tests unitaires, email de confirmation d'inscription refait (lien cliquable, en français))</w:t>
+        <w:t>Version 1.53 — document mis à jour avec les évolutions de juillet, août et septembre 2026 (vérification des praticiens par documents, correctif critique inscriptions, espace secrétariat en compte dédié, statut administrateur découplé du rôle, tableau de bord admin complet, domaine d'envoi Resend vérifié, carte Leaflet sur la fiche praticien avec géocodage des cabinets, domaine monanimeaux.fr connecté au site et indexé par Google, modération avancée admin, rappels de RDV par SMS, liste d'attente, rappels de vaccin proactifs, statistiques praticien, 368 tests unitaires, code-splitting par route, PWA installable, référencement de base, découpage vendor du bundle, réponse du praticien aux avis, export .ics du RDV, carnet de santé exportable, tri par prochaine disponibilité en recherche, notifications push navigateur, email + SMS de confirmation immédiate à la réservation, pages légales finalisées avec le SIRET, annulation de RDV patient corrigée, interface mobile dédiée pour l'espace patient avec recherche à deux champs et cartes animaux en bannière photo, rappel automatique pour laisser un avis après un RDV terminé, favoris praticiens, annulation de RDV côté praticien avec notification patient (in-app, email, SMS), correctif de redirection post-connexion, logo Animéaux dans tous les emails transactionnels, recherche de bugs applicative complète le 24 août 2026 : faille XSS critique corrigée sur la biographie praticien, durcissement de la sécurité au niveau colonne sur les rendez-vous/profils praticiens/messages/notifications, sécurisation des fonctions serveur d'envoi d'email-SMS-push contre les appels non autorisés, correctifs messagerie temps réel/documents de vérification/statistiques praticien/actions de modération admin, système de rappels automatiques (RDV à 24h, vaccin, avis) entièrement fiabilisé début septembre 2026 après plusieurs pannes silencieuses en cascade (vérification JWT de la plateforme, délai réseau trop court, désynchronisation de clé secrète, mauvaise colonne interrogée), erreurs de requête serveur désormais toujours visibles au lieu d'être ignorées silencieusement, adresse postale ajoutée au profil praticien, code de messagerie temps réel unifié entre l'espace patient et praticien, audit applicatif complet du 04/09/2026 : reconstruction de secours de 4 tables jamais commitées (animaux/vaccins/poids/dossiers de santé), verrouillage RLS niveau colonne étendu (avis, dossiers médicaux), durée de rendez-vous alignée sur la configuration réelle du praticien (45/60 min au lieu de 30 min fixe), garde-fou anti-doublon sur le rappel de RDV à 24h, rappel de vaccin en retard qui repart, confirmations ajoutées avant les actions destructrices du cabinet (retirer un membre, supprimer un tarif), renouvellement d'abonnement push géré, notification qui réutilise l'onglet déjà ouvert, plusieurs correctifs de fiabilité (connexion, invalidations de cache, routage administrateur), report de rendez-vous en libre-service pour le patient (au même titre que l'annulation), délai minimum d'1h avant le rendez-vous imposé au patient pour annuler ou reporter, flux calendrier abonnable (ICS) pour le praticien permettant de synchroniser tout son agenda confirmé en un clic dans Google Agenda ou Apple Calendrier, audit de sécurité complet du 05/09/2026 (8 revues croisées) : contournement RLS corrigé permettant à un patient de confirmer lui-même un RDV en attente et de le déplacer à sa guise, motif de rejet administratif d'un praticien retiré de la lecture publique, faille de remplacement de fichier de stockage entre utilisateurs corrigée, verrou ajouté empêchant un patient de forger la réponse du praticien à son propre avis, emails de confirmation/annulation/report de RDV et lien de confirmation de présence fiabilisés (requête ambiguë), échappement HTML généralisé dans les emails, correction du destinataire de l'email de report de RDV quand c'est le patient qui reporte, auto-réparation de l'abonnement aux notifications push, confirmations à deux clics harmonisées sur les annulations de RDV, messages d'erreur explicites au lieu d'échecs silencieux sur les actions de rendez-vous; puis du 22 au 25/09/2026 : notifications push enfin fonctionnelles, pipeline de déploiement automatisé (fonctions Edge, tests bloquants, Sentry), corrections de récursions RLS sur l'espace praticien, performances mobile (graphique et carte chargés à la demande, images en lazy loading), rappels de suivi généralisés (vaccin, vermifuge, bilan annuel), partage de dossier animal entre praticiens avec l'accord du propriétaire, praticiens à plusieurs métiers, page Mes animaux allégée, relance des patients inactifs, interrupteur de messagerie par praticien, visite guidée de première connexion, 486 tests unitaires, email de confirmation d'inscription refait (lien cliquable, en français))</w:t>
       </w:r>
     </w:p>
     <w:p>
@@ -7575,7 +7575,7 @@
         <w:spacing w:after="160" w:line="300"/>
       </w:pPr>
       <w:r>
-        <w:t>Ajouté le 25/09/2026 : visite guidée de première connexion (section 6.16), affichée une seule fois par compte grâce à profiles.onboarding_completed_at (migration 110, appliquée d'office à tous les comptes existants). Le composant se lance seulement si le profil contient explicitement null (une valeur absente, cas d'un profil mis en cache avant la migration, n'affiche rien). Le compte administrateur ne la voit jamais : pour la tester il faut un compte propriétaire ou praticien non admin, neuf ou remis à null. Le parcours praticien couvre aussi Tarifs, Avis, Statistiques et Mon cabinet (ce dernier seulement en cabinet). Le nombre de tests est passé à 480.</w:t>
+        <w:t>Ajouté le 25/09/2026 : visite guidée de première connexion (section 6.16), affichée une seule fois par compte grâce à profiles.onboarding_completed_at (migration 110, appliquée d'office à tous les comptes existants). Le composant se lance seulement si le profil contient explicitement null (une valeur absente, cas d'un profil mis en cache avant la migration, n'affiche rien). Le compte administrateur ne la voit jamais : pour la tester il faut un compte propriétaire ou praticien non admin, neuf ou remis à null. Le parcours praticien couvre aussi Tarifs, Avis, Statistiques et Mon cabinet (ce dernier seulement en cabinet). Le nombre de tests est passé à 486.</w:t>
       </w:r>
     </w:p>
     <w:p>
@@ -7591,7 +7591,7 @@
         <w:spacing w:after="160" w:line="300"/>
       </w:pPr>
       <w:r>
-        <w:t>Nettoyage du 25/09/2026 : suppression des variables et imports inutilisés signalés par tsc --noUnusedLocals --noUnusedParameters (10 occurrences dans Navbar, useData, AnimalHealthPage, BookPage, DoctorDashboard, MessagesPage, RegisterPage, sans effet sur le comportement) et retrait du suivi git des fichiers .DS_Store, déjà exclus par .gitignore. Points connus, laissés en l'état : npm run lint échoue car eslint n'est pas installé en dépendance, et la fonction referralStatusLabel (src/lib/animalReferrals.ts) est testée mais n'est plus affichée dans l'interface.</w:t>
+        <w:t>Nettoyage du 25/09/2026 : suppression des variables et imports inutilisés signalés par tsc --noEmit --noUnusedLocals --noUnusedParameters (10 occurrences dans Navbar, useData, AnimalHealthPage, BookPage, DoctorDashboard, MessagesPage, RegisterPage, sans effet sur le comportement) et retrait du suivi git des fichiers .DS_Store, déjà exclus par .gitignore. La commande npm run lint, qui échouait depuis toujours car eslint n'a jamais été installé en dépendance, exécute désormais cette vérification TypeScript (aucune nouvelle dépendance). Le statut d'un partage de dossier est maintenant visible du praticien qui l'a envoyé : sur la fiche de santé de l'animal, chaque envoi affiche le confrère destinataire et une pastille (en attente de l'accord du propriétaire, accepté, refusé, accès révoqué), via useSentReferralsForAnimal et les fonctions referralSenderStatusLabel / referralBadgeClass (src/lib/animalReferrals.ts, testées). Nombre de tests : 486.</w:t>
       </w:r>
     </w:p>
     <w:sectPr>

</xml_diff>

<commit_message>
Enrichir les statistiques praticien : comparaison mensuelle, histogramme 6 mois, jours/heures chargés, motifs, avis, patients à recontacter, espèces, délais, liste d'attente
Co-Authored-By: Claude Sonnet 5 <noreply@anthropic.com>
</commit_message>
<xml_diff>
--- a/cahier_des_charges_animeaux.docx
+++ b/cahier_des_charges_animeaux.docx
@@ -58,7 +58,7 @@
           <w:sz w:val="22"/>
           <w:szCs w:val="22"/>
         </w:rPr>
-        <w:t>Version 1.53 — document mis à jour avec les évolutions de juillet, août et septembre 2026 (vérification des praticiens par documents, correctif critique inscriptions, espace secrétariat en compte dédié, statut administrateur découplé du rôle, tableau de bord admin complet, domaine d'envoi Resend vérifié, carte Leaflet sur la fiche praticien avec géocodage des cabinets, domaine monanimeaux.fr connecté au site et indexé par Google, modération avancée admin, rappels de RDV par SMS, liste d'attente, rappels de vaccin proactifs, statistiques praticien, 368 tests unitaires, code-splitting par route, PWA installable, référencement de base, découpage vendor du bundle, réponse du praticien aux avis, export .ics du RDV, carnet de santé exportable, tri par prochaine disponibilité en recherche, notifications push navigateur, email + SMS de confirmation immédiate à la réservation, pages légales finalisées avec le SIRET, annulation de RDV patient corrigée, interface mobile dédiée pour l'espace patient avec recherche à deux champs et cartes animaux en bannière photo, rappel automatique pour laisser un avis après un RDV terminé, favoris praticiens, annulation de RDV côté praticien avec notification patient (in-app, email, SMS), correctif de redirection post-connexion, logo Animéaux dans tous les emails transactionnels, recherche de bugs applicative complète le 24 août 2026 : faille XSS critique corrigée sur la biographie praticien, durcissement de la sécurité au niveau colonne sur les rendez-vous/profils praticiens/messages/notifications, sécurisation des fonctions serveur d'envoi d'email-SMS-push contre les appels non autorisés, correctifs messagerie temps réel/documents de vérification/statistiques praticien/actions de modération admin, système de rappels automatiques (RDV à 24h, vaccin, avis) entièrement fiabilisé début septembre 2026 après plusieurs pannes silencieuses en cascade (vérification JWT de la plateforme, délai réseau trop court, désynchronisation de clé secrète, mauvaise colonne interrogée), erreurs de requête serveur désormais toujours visibles au lieu d'être ignorées silencieusement, adresse postale ajoutée au profil praticien, code de messagerie temps réel unifié entre l'espace patient et praticien, audit applicatif complet du 04/09/2026 : reconstruction de secours de 4 tables jamais commitées (animaux/vaccins/poids/dossiers de santé), verrouillage RLS niveau colonne étendu (avis, dossiers médicaux), durée de rendez-vous alignée sur la configuration réelle du praticien (45/60 min au lieu de 30 min fixe), garde-fou anti-doublon sur le rappel de RDV à 24h, rappel de vaccin en retard qui repart, confirmations ajoutées avant les actions destructrices du cabinet (retirer un membre, supprimer un tarif), renouvellement d'abonnement push géré, notification qui réutilise l'onglet déjà ouvert, plusieurs correctifs de fiabilité (connexion, invalidations de cache, routage administrateur), report de rendez-vous en libre-service pour le patient (au même titre que l'annulation), délai minimum d'1h avant le rendez-vous imposé au patient pour annuler ou reporter, flux calendrier abonnable (ICS) pour le praticien permettant de synchroniser tout son agenda confirmé en un clic dans Google Agenda ou Apple Calendrier, audit de sécurité complet du 05/09/2026 (8 revues croisées) : contournement RLS corrigé permettant à un patient de confirmer lui-même un RDV en attente et de le déplacer à sa guise, motif de rejet administratif d'un praticien retiré de la lecture publique, faille de remplacement de fichier de stockage entre utilisateurs corrigée, verrou ajouté empêchant un patient de forger la réponse du praticien à son propre avis, emails de confirmation/annulation/report de RDV et lien de confirmation de présence fiabilisés (requête ambiguë), échappement HTML généralisé dans les emails, correction du destinataire de l'email de report de RDV quand c'est le patient qui reporte, auto-réparation de l'abonnement aux notifications push, confirmations à deux clics harmonisées sur les annulations de RDV, messages d'erreur explicites au lieu d'échecs silencieux sur les actions de rendez-vous; puis du 22 au 25/09/2026 : notifications push enfin fonctionnelles, pipeline de déploiement automatisé (fonctions Edge, tests bloquants, Sentry), corrections de récursions RLS sur l'espace praticien, performances mobile (graphique et carte chargés à la demande, images en lazy loading), rappels de suivi généralisés (vaccin, vermifuge, bilan annuel), partage de dossier animal entre praticiens avec l'accord du propriétaire, praticiens à plusieurs métiers, page Mes animaux allégée, relance des patients inactifs, interrupteur de messagerie par praticien, visite guidée de première connexion, 486 tests unitaires, email de confirmation d'inscription refait (lien cliquable, en français))</w:t>
+        <w:t>Version 1.53 — document mis à jour avec les évolutions de juillet, août et septembre 2026 (vérification des praticiens par documents, correctif critique inscriptions, espace secrétariat en compte dédié, statut administrateur découplé du rôle, tableau de bord admin complet, domaine d'envoi Resend vérifié, carte Leaflet sur la fiche praticien avec géocodage des cabinets, domaine monanimeaux.fr connecté au site et indexé par Google, modération avancée admin, rappels de RDV par SMS, liste d'attente, rappels de vaccin proactifs, statistiques praticien, 368 tests unitaires, code-splitting par route, PWA installable, référencement de base, découpage vendor du bundle, réponse du praticien aux avis, export .ics du RDV, carnet de santé exportable, tri par prochaine disponibilité en recherche, notifications push navigateur, email + SMS de confirmation immédiate à la réservation, pages légales finalisées avec le SIRET, annulation de RDV patient corrigée, interface mobile dédiée pour l'espace patient avec recherche à deux champs et cartes animaux en bannière photo, rappel automatique pour laisser un avis après un RDV terminé, favoris praticiens, annulation de RDV côté praticien avec notification patient (in-app, email, SMS), correctif de redirection post-connexion, logo Animéaux dans tous les emails transactionnels, recherche de bugs applicative complète le 24 août 2026 : faille XSS critique corrigée sur la biographie praticien, durcissement de la sécurité au niveau colonne sur les rendez-vous/profils praticiens/messages/notifications, sécurisation des fonctions serveur d'envoi d'email-SMS-push contre les appels non autorisés, correctifs messagerie temps réel/documents de vérification/statistiques praticien/actions de modération admin, système de rappels automatiques (RDV à 24h, vaccin, avis) entièrement fiabilisé début septembre 2026 après plusieurs pannes silencieuses en cascade (vérification JWT de la plateforme, délai réseau trop court, désynchronisation de clé secrète, mauvaise colonne interrogée), erreurs de requête serveur désormais toujours visibles au lieu d'être ignorées silencieusement, adresse postale ajoutée au profil praticien, code de messagerie temps réel unifié entre l'espace patient et praticien, audit applicatif complet du 04/09/2026 : reconstruction de secours de 4 tables jamais commitées (animaux/vaccins/poids/dossiers de santé), verrouillage RLS niveau colonne étendu (avis, dossiers médicaux), durée de rendez-vous alignée sur la configuration réelle du praticien (45/60 min au lieu de 30 min fixe), garde-fou anti-doublon sur le rappel de RDV à 24h, rappel de vaccin en retard qui repart, confirmations ajoutées avant les actions destructrices du cabinet (retirer un membre, supprimer un tarif), renouvellement d'abonnement push géré, notification qui réutilise l'onglet déjà ouvert, plusieurs correctifs de fiabilité (connexion, invalidations de cache, routage administrateur), report de rendez-vous en libre-service pour le patient (au même titre que l'annulation), délai minimum d'1h avant le rendez-vous imposé au patient pour annuler ou reporter, flux calendrier abonnable (ICS) pour le praticien permettant de synchroniser tout son agenda confirmé en un clic dans Google Agenda ou Apple Calendrier, audit de sécurité complet du 05/09/2026 (8 revues croisées) : contournement RLS corrigé permettant à un patient de confirmer lui-même un RDV en attente et de le déplacer à sa guise, motif de rejet administratif d'un praticien retiré de la lecture publique, faille de remplacement de fichier de stockage entre utilisateurs corrigée, verrou ajouté empêchant un patient de forger la réponse du praticien à son propre avis, emails de confirmation/annulation/report de RDV et lien de confirmation de présence fiabilisés (requête ambiguë), échappement HTML généralisé dans les emails, correction du destinataire de l'email de report de RDV quand c'est le patient qui reporte, auto-réparation de l'abonnement aux notifications push, confirmations à deux clics harmonisées sur les annulations de RDV, messages d'erreur explicites au lieu d'échecs silencieux sur les actions de rendez-vous; puis du 22 au 25/09/2026 : notifications push enfin fonctionnelles, pipeline de déploiement automatisé (fonctions Edge, tests bloquants, Sentry), corrections de récursions RLS sur l'espace praticien, performances mobile (graphique et carte chargés à la demande, images en lazy loading), rappels de suivi généralisés (vaccin, vermifuge, bilan annuel), partage de dossier animal entre praticiens avec l'accord du propriétaire, praticiens à plusieurs métiers, page Mes animaux allégée, relance des patients inactifs, interrupteur de messagerie par praticien, visite guidée de première connexion, 524 tests unitaires, email de confirmation d'inscription refait (lien cliquable, en français), statistiques praticien enrichies)</w:t>
       </w:r>
     </w:p>
     <w:p>
@@ -4861,6 +4861,14 @@
     </w:p>
     <w:p>
       <w:pPr>
+        <w:spacing w:after="160" w:line="300"/>
+      </w:pPr>
+      <w:r>
+        <w:t>Enrichi le 02/10/2026, à la demande d'Anaïs. Toujours calculé côté client, sans nouvelle requête lourde (les champs manquants — created_at, updated_at — ont juste été ajoutés à la sélection déjà faite par useDoctorAppointments) ; une seule exception, voir migration 111 ci-dessous. Nouveau bloc « Ce mois-ci » : RDV terminés, revenu estimé, taux d'absence et taux d'annulation du mois calendaire en cours, chacun comparé au mois précédent (évolution en points si la référence est à 0, pour ne jamais afficher un pourcentage trompeur). Histogramme empilé (terminés/annulés/absences) sur les 6 derniers mois. Jours de la semaine les plus chargés et répartition patients nouveaux/déjà venus sur les 90 derniers jours. Motifs de consultation les plus fréquents (seule la partie choisie dans la liste fermée du motif est comptée, jamais les détails en texte libre ajoutés par le patient). Avis : évolution de la note moyenne mois par mois et taux de réponse du praticien. Espèces des animaux vus. Liste des patients dont le dernier rendez-vous terminé remonte à plus de 6 mois (même seuil que la relance automatique, section 9.2), avec le taux de retour global. Trois indicateurs complémentaires : délai moyen entre réservation et rendez-vous, part des annulations survenues moins de 24h avant le RDV (estimée via updated_at, la table n'a pas de colonne dédiée à la date d'annulation), et part des RDV confirmés par le patient via le rappel à 24h. Heure la plus demandée et la plus calme sur les 90 derniers jours. Logique entièrement dans src/lib/doctorStats.ts (fonctions pures testées, 40 cas), affichage dans le nouveau composant src/components/doctor/DoctorStatsPanel.tsx.</w:t>
+      </w:r>
+    </w:p>
+    <w:p>
+      <w:pPr>
         <w:pStyle w:val="Heading1"/>
         <w:spacing w:after="200" w:before="400"/>
       </w:pPr>
@@ -7592,6 +7600,14 @@
       </w:pPr>
       <w:r>
         <w:t>Nettoyage du 25/09/2026 : suppression des variables et imports inutilisés signalés par tsc --noEmit --noUnusedLocals --noUnusedParameters (10 occurrences dans Navbar, useData, AnimalHealthPage, BookPage, DoctorDashboard, MessagesPage, RegisterPage, sans effet sur le comportement) et retrait du suivi git des fichiers .DS_Store, déjà exclus par .gitignore. La commande npm run lint, qui échouait depuis toujours car eslint n'a jamais été installé en dépendance, exécute désormais cette vérification TypeScript (aucune nouvelle dépendance). Le statut d'un partage de dossier est maintenant visible du praticien qui l'a envoyé : sur la fiche de santé de l'animal, chaque envoi affiche le confrère destinataire et une pastille (en attente de l'accord du propriétaire, accepté, refusé, accès révoqué), via useSentReferralsForAnimal et les fonctions referralSenderStatusLabel / referralBadgeClass (src/lib/animalReferrals.ts, testées). Nombre de tests : 486.</w:t>
+      </w:r>
+    </w:p>
+    <w:p>
+      <w:pPr>
+        <w:spacing w:after="160" w:line="300"/>
+      </w:pPr>
+      <w:r>
+        <w:t>Migration 111 (02/10/2026) : la seule donnée des nouvelles statistiques praticien (section 7.8) qui n'était pas déjà accessible — le nombre de patients en liste d'attente chez lui. waitlist_entries (migration 065) n'avait jusque-là qu'une policy réservée au patient lui-même. Plutôt qu'une policy SELECT qui exposerait l'identité de chaque patient en attente, une RPC security definer get_my_waitlist_count() ne renvoie qu'un compte agrégé pour le praticien connecté.</w:t>
       </w:r>
     </w:p>
     <w:sectPr>

</xml_diff>

<commit_message>
Permettre au créateur d'un cabinet de le fermer (reprise d'activité seule/salariée)
Bouton dans la zone dangereuse de l'onglet Mon cabinet, bloqué tant que
d'autres praticiens en sont membres (migration 112, trigger serveur).
Aucune donnée patient/RDV perdue : seuls le cabinet, ses tarifs communs
et l'accès du secrétariat disparaissent.

Co-Authored-By: Claude Sonnet 5 <noreply@anthropic.com>
</commit_message>
<xml_diff>
--- a/cahier_des_charges_animeaux.docx
+++ b/cahier_des_charges_animeaux.docx
@@ -58,7 +58,7 @@
           <w:sz w:val="22"/>
           <w:szCs w:val="22"/>
         </w:rPr>
-        <w:t>Version 1.53 — document mis à jour avec les évolutions de juillet, août et septembre 2026 (vérification des praticiens par documents, correctif critique inscriptions, espace secrétariat en compte dédié, statut administrateur découplé du rôle, tableau de bord admin complet, domaine d'envoi Resend vérifié, carte Leaflet sur la fiche praticien avec géocodage des cabinets, domaine monanimeaux.fr connecté au site et indexé par Google, modération avancée admin, rappels de RDV par SMS, liste d'attente, rappels de vaccin proactifs, statistiques praticien, 368 tests unitaires, code-splitting par route, PWA installable, référencement de base, découpage vendor du bundle, réponse du praticien aux avis, export .ics du RDV, carnet de santé exportable, tri par prochaine disponibilité en recherche, notifications push navigateur, email + SMS de confirmation immédiate à la réservation, pages légales finalisées avec le SIRET, annulation de RDV patient corrigée, interface mobile dédiée pour l'espace patient avec recherche à deux champs et cartes animaux en bannière photo, rappel automatique pour laisser un avis après un RDV terminé, favoris praticiens, annulation de RDV côté praticien avec notification patient (in-app, email, SMS), correctif de redirection post-connexion, logo Animéaux dans tous les emails transactionnels, recherche de bugs applicative complète le 24 août 2026 : faille XSS critique corrigée sur la biographie praticien, durcissement de la sécurité au niveau colonne sur les rendez-vous/profils praticiens/messages/notifications, sécurisation des fonctions serveur d'envoi d'email-SMS-push contre les appels non autorisés, correctifs messagerie temps réel/documents de vérification/statistiques praticien/actions de modération admin, système de rappels automatiques (RDV à 24h, vaccin, avis) entièrement fiabilisé début septembre 2026 après plusieurs pannes silencieuses en cascade (vérification JWT de la plateforme, délai réseau trop court, désynchronisation de clé secrète, mauvaise colonne interrogée), erreurs de requête serveur désormais toujours visibles au lieu d'être ignorées silencieusement, adresse postale ajoutée au profil praticien, code de messagerie temps réel unifié entre l'espace patient et praticien, audit applicatif complet du 04/09/2026 : reconstruction de secours de 4 tables jamais commitées (animaux/vaccins/poids/dossiers de santé), verrouillage RLS niveau colonne étendu (avis, dossiers médicaux), durée de rendez-vous alignée sur la configuration réelle du praticien (45/60 min au lieu de 30 min fixe), garde-fou anti-doublon sur le rappel de RDV à 24h, rappel de vaccin en retard qui repart, confirmations ajoutées avant les actions destructrices du cabinet (retirer un membre, supprimer un tarif), renouvellement d'abonnement push géré, notification qui réutilise l'onglet déjà ouvert, plusieurs correctifs de fiabilité (connexion, invalidations de cache, routage administrateur), report de rendez-vous en libre-service pour le patient (au même titre que l'annulation), délai minimum d'1h avant le rendez-vous imposé au patient pour annuler ou reporter, flux calendrier abonnable (ICS) pour le praticien permettant de synchroniser tout son agenda confirmé en un clic dans Google Agenda ou Apple Calendrier, audit de sécurité complet du 05/09/2026 (8 revues croisées) : contournement RLS corrigé permettant à un patient de confirmer lui-même un RDV en attente et de le déplacer à sa guise, motif de rejet administratif d'un praticien retiré de la lecture publique, faille de remplacement de fichier de stockage entre utilisateurs corrigée, verrou ajouté empêchant un patient de forger la réponse du praticien à son propre avis, emails de confirmation/annulation/report de RDV et lien de confirmation de présence fiabilisés (requête ambiguë), échappement HTML généralisé dans les emails, correction du destinataire de l'email de report de RDV quand c'est le patient qui reporte, auto-réparation de l'abonnement aux notifications push, confirmations à deux clics harmonisées sur les annulations de RDV, messages d'erreur explicites au lieu d'échecs silencieux sur les actions de rendez-vous; puis du 22 au 25/09/2026 : notifications push enfin fonctionnelles, pipeline de déploiement automatisé (fonctions Edge, tests bloquants, Sentry), corrections de récursions RLS sur l'espace praticien, performances mobile (graphique et carte chargés à la demande, images en lazy loading), rappels de suivi généralisés (vaccin, vermifuge, bilan annuel), partage de dossier animal entre praticiens avec l'accord du propriétaire, praticiens à plusieurs métiers, page Mes animaux allégée, relance des patients inactifs, interrupteur de messagerie par praticien, visite guidée de première connexion, 524 tests unitaires, email de confirmation d'inscription refait (lien cliquable, en français), statistiques praticien enrichies)</w:t>
+        <w:t>Version 1.53 — document mis à jour avec les évolutions de juillet, août et septembre 2026 (vérification des praticiens par documents, correctif critique inscriptions, espace secrétariat en compte dédié, statut administrateur découplé du rôle, tableau de bord admin complet, domaine d'envoi Resend vérifié, carte Leaflet sur la fiche praticien avec géocodage des cabinets, domaine monanimeaux.fr connecté au site et indexé par Google, modération avancée admin, rappels de RDV par SMS, liste d'attente, rappels de vaccin proactifs, statistiques praticien, 368 tests unitaires, code-splitting par route, PWA installable, référencement de base, découpage vendor du bundle, réponse du praticien aux avis, export .ics du RDV, carnet de santé exportable, tri par prochaine disponibilité en recherche, notifications push navigateur, email + SMS de confirmation immédiate à la réservation, pages légales finalisées avec le SIRET, annulation de RDV patient corrigée, interface mobile dédiée pour l'espace patient avec recherche à deux champs et cartes animaux en bannière photo, rappel automatique pour laisser un avis après un RDV terminé, favoris praticiens, annulation de RDV côté praticien avec notification patient (in-app, email, SMS), correctif de redirection post-connexion, logo Animéaux dans tous les emails transactionnels, recherche de bugs applicative complète le 24 août 2026 : faille XSS critique corrigée sur la biographie praticien, durcissement de la sécurité au niveau colonne sur les rendez-vous/profils praticiens/messages/notifications, sécurisation des fonctions serveur d'envoi d'email-SMS-push contre les appels non autorisés, correctifs messagerie temps réel/documents de vérification/statistiques praticien/actions de modération admin, système de rappels automatiques (RDV à 24h, vaccin, avis) entièrement fiabilisé début septembre 2026 après plusieurs pannes silencieuses en cascade (vérification JWT de la plateforme, délai réseau trop court, désynchronisation de clé secrète, mauvaise colonne interrogée), erreurs de requête serveur désormais toujours visibles au lieu d'être ignorées silencieusement, adresse postale ajoutée au profil praticien, code de messagerie temps réel unifié entre l'espace patient et praticien, audit applicatif complet du 04/09/2026 : reconstruction de secours de 4 tables jamais commitées (animaux/vaccins/poids/dossiers de santé), verrouillage RLS niveau colonne étendu (avis, dossiers médicaux), durée de rendez-vous alignée sur la configuration réelle du praticien (45/60 min au lieu de 30 min fixe), garde-fou anti-doublon sur le rappel de RDV à 24h, rappel de vaccin en retard qui repart, confirmations ajoutées avant les actions destructrices du cabinet (retirer un membre, supprimer un tarif), renouvellement d'abonnement push géré, notification qui réutilise l'onglet déjà ouvert, plusieurs correctifs de fiabilité (connexion, invalidations de cache, routage administrateur), report de rendez-vous en libre-service pour le patient (au même titre que l'annulation), délai minimum d'1h avant le rendez-vous imposé au patient pour annuler ou reporter, flux calendrier abonnable (ICS) pour le praticien permettant de synchroniser tout son agenda confirmé en un clic dans Google Agenda ou Apple Calendrier, audit de sécurité complet du 05/09/2026 (8 revues croisées) : contournement RLS corrigé permettant à un patient de confirmer lui-même un RDV en attente et de le déplacer à sa guise, motif de rejet administratif d'un praticien retiré de la lecture publique, faille de remplacement de fichier de stockage entre utilisateurs corrigée, verrou ajouté empêchant un patient de forger la réponse du praticien à son propre avis, emails de confirmation/annulation/report de RDV et lien de confirmation de présence fiabilisés (requête ambiguë), échappement HTML généralisé dans les emails, correction du destinataire de l'email de report de RDV quand c'est le patient qui reporte, auto-réparation de l'abonnement aux notifications push, confirmations à deux clics harmonisées sur les annulations de RDV, messages d'erreur explicites au lieu d'échecs silencieux sur les actions de rendez-vous; puis du 22 au 25/09/2026 : notifications push enfin fonctionnelles, pipeline de déploiement automatisé (fonctions Edge, tests bloquants, Sentry), corrections de récursions RLS sur l'espace praticien, performances mobile (graphique et carte chargés à la demande, images en lazy loading), rappels de suivi généralisés (vaccin, vermifuge, bilan annuel), partage de dossier animal entre praticiens avec l'accord du propriétaire, praticiens à plusieurs métiers, page Mes animaux allégée, relance des patients inactifs, interrupteur de messagerie par praticien, visite guidée de première connexion, 524 tests unitaires, email de confirmation d'inscription refait (lien cliquable, en français), statistiques praticien enrichies, fermeture de cabinet)</w:t>
       </w:r>
     </w:p>
     <w:p>
@@ -2475,6 +2475,14 @@
       </w:pPr>
       <w:r>
         <w:t>La table clinics regroupe plusieurs praticiens sous une même structure (adresse, logo, tarifs et créneaux partagés — voir section 6.6), et clinic_members y rattache les comptes doctor membres. Un accès secrétariat (rôle secretary) est distinct : la table clinic_staff associe un compte secretary à un cabinet. Depuis le 22 juillet 2026, cet accès est toujours un compte dédié avec ses propres identifiants, créé par le propriétaire du cabinet depuis l'Edge Function invite-clinic-secretary — jamais un rattachement à un compte praticien ou patient existant, pour que le tableau de bord secrétariat (/dashboard/secretariat) reste un espace réellement séparé plutôt qu'un onglet supplémentaire du dashboard praticien. Depuis le 23 juillet 2026, l'identifiant de connexion Supabase Auth n'est plus l'email tapé par le praticien mais un code généré (ex. CAB4X9QZ, converti en email synthétique code@secretariat.animeaux.internal en interne) : l'email saisi à l'invitation ne sert plus qu'à l'envoi des identifiants par courrier (jamais à la connexion), ce qui rend le rattachement à un compte existant impossible par construction et évite toute confusion avec un vrai email personnel. Le formulaire /login accepte les deux formats (email ou identifiant généré) dans le même champ.</w:t>
+      </w:r>
+    </w:p>
+    <w:p>
+      <w:pPr>
+        <w:spacing w:after="160" w:line="300"/>
+      </w:pPr>
+      <w:r>
+        <w:t>Ajouté le 02/10/2026 : le créateur d'un cabinet peut désormais le fermer (bouton « Fermer le cabinet », zone dangereuse de l'onglet Mon cabinet) — jusque-là impossible, repéré par Anaïs pour le cas d'un praticien qui change d'activité (reprise en solo ou en tant que salarié). Aucune donnée patient ni rendez-vous n'est perdue (appointments ne référence que doctor_id/patient_id, jamais clinic_id) : seuls disparaissent le cabinet lui-même, ses tarifs communs (clinic_services) et l'accès de son éventuel secrétariat (clinic_staff), tous les trois en cascade depuis clinics. Bloqué tant que d'autres praticiens sont membres (migration 112, trigger clinics_prevent_deletion_with_members) : le créateur doit d'abord les retirer un par un (fonctionnalité déjà existante) — sans ce garde-fou, un cabinet pourrait disparaître silencieusement sous des confrères qui le partagent encore.</w:t>
       </w:r>
     </w:p>
     <w:tbl>

</xml_diff>

<commit_message>
Double authentification (TOTP) facultative pour praticiens et admins
Activation depuis le profil, code demandé à la connexion, garde-fou dans
App.tsx (session aal1 d'un compte avec 2FA non traitée comme connectée).

Co-Authored-By: Claude Sonnet 5.5 <noreply@anthropic.com>
</commit_message>
<xml_diff>
--- a/cahier_des_charges_animeaux.docx
+++ b/cahier_des_charges_animeaux.docx
@@ -58,7 +58,7 @@
           <w:sz w:val="22"/>
           <w:szCs w:val="22"/>
         </w:rPr>
-        <w:t>Version 1.53 — document mis à jour avec les évolutions de juillet, août et septembre 2026 (vérification des praticiens par documents, correctif critique inscriptions, espace secrétariat en compte dédié, statut administrateur découplé du rôle, tableau de bord admin complet, domaine d'envoi Resend vérifié, carte Leaflet sur la fiche praticien avec géocodage des cabinets, domaine monanimeaux.fr connecté au site et indexé par Google, modération avancée admin, rappels de RDV par SMS, liste d'attente, rappels de vaccin proactifs, statistiques praticien, 368 tests unitaires, code-splitting par route, PWA installable, référencement de base, découpage vendor du bundle, réponse du praticien aux avis, export .ics du RDV, carnet de santé exportable, tri par prochaine disponibilité en recherche, notifications push navigateur, email + SMS de confirmation immédiate à la réservation, pages légales finalisées avec le SIRET, annulation de RDV patient corrigée, interface mobile dédiée pour l'espace patient avec recherche à deux champs et cartes animaux en bannière photo, rappel automatique pour laisser un avis après un RDV terminé, favoris praticiens, annulation de RDV côté praticien avec notification patient (in-app, email, SMS), correctif de redirection post-connexion, logo Animéaux dans tous les emails transactionnels, recherche de bugs applicative complète le 24 août 2026 : faille XSS critique corrigée sur la biographie praticien, durcissement de la sécurité au niveau colonne sur les rendez-vous/profils praticiens/messages/notifications, sécurisation des fonctions serveur d'envoi d'email-SMS-push contre les appels non autorisés, correctifs messagerie temps réel/documents de vérification/statistiques praticien/actions de modération admin, système de rappels automatiques (RDV à 24h, vaccin, avis) entièrement fiabilisé début septembre 2026 après plusieurs pannes silencieuses en cascade (vérification JWT de la plateforme, délai réseau trop court, désynchronisation de clé secrète, mauvaise colonne interrogée), erreurs de requête serveur désormais toujours visibles au lieu d'être ignorées silencieusement, adresse postale ajoutée au profil praticien, code de messagerie temps réel unifié entre l'espace patient et praticien, audit applicatif complet du 04/09/2026 : reconstruction de secours de 4 tables jamais commitées (animaux/vaccins/poids/dossiers de santé), verrouillage RLS niveau colonne étendu (avis, dossiers médicaux), durée de rendez-vous alignée sur la configuration réelle du praticien (45/60 min au lieu de 30 min fixe), garde-fou anti-doublon sur le rappel de RDV à 24h, rappel de vaccin en retard qui repart, confirmations ajoutées avant les actions destructrices du cabinet (retirer un membre, supprimer un tarif), renouvellement d'abonnement push géré, notification qui réutilise l'onglet déjà ouvert, plusieurs correctifs de fiabilité (connexion, invalidations de cache, routage administrateur), report de rendez-vous en libre-service pour le patient (au même titre que l'annulation), délai minimum d'1h avant le rendez-vous imposé au patient pour annuler ou reporter, flux calendrier abonnable (ICS) pour le praticien permettant de synchroniser tout son agenda confirmé en un clic dans Google Agenda ou Apple Calendrier, audit de sécurité complet du 05/09/2026 (8 revues croisées) : contournement RLS corrigé permettant à un patient de confirmer lui-même un RDV en attente et de le déplacer à sa guise, motif de rejet administratif d'un praticien retiré de la lecture publique, faille de remplacement de fichier de stockage entre utilisateurs corrigée, verrou ajouté empêchant un patient de forger la réponse du praticien à son propre avis, emails de confirmation/annulation/report de RDV et lien de confirmation de présence fiabilisés (requête ambiguë), échappement HTML généralisé dans les emails, correction du destinataire de l'email de report de RDV quand c'est le patient qui reporte, auto-réparation de l'abonnement aux notifications push, confirmations à deux clics harmonisées sur les annulations de RDV, messages d'erreur explicites au lieu d'échecs silencieux sur les actions de rendez-vous; puis du 22 au 25/09/2026 : notifications push enfin fonctionnelles, pipeline de déploiement automatisé (fonctions Edge, tests bloquants, Sentry), corrections de récursions RLS sur l'espace praticien, performances mobile (graphique et carte chargés à la demande, images en lazy loading), rappels de suivi généralisés (vaccin, vermifuge, bilan annuel), partage de dossier animal entre praticiens avec l'accord du propriétaire, praticiens à plusieurs métiers, page Mes animaux allégée, relance des patients inactifs, interrupteur de messagerie par praticien, visite guidée de première connexion, 524 tests unitaires, email de confirmation d'inscription refait (lien cliquable, en français), statistiques praticien enrichies, fermeture de cabinet)</w:t>
+        <w:t>Version 1.53 — document mis à jour avec les évolutions de juillet, août et septembre 2026 (vérification des praticiens par documents, correctif critique inscriptions, espace secrétariat en compte dédié, statut administrateur découplé du rôle, tableau de bord admin complet, domaine d'envoi Resend vérifié, carte Leaflet sur la fiche praticien avec géocodage des cabinets, domaine monanimeaux.fr connecté au site et indexé par Google, modération avancée admin, rappels de RDV par SMS, liste d'attente, rappels de vaccin proactifs, statistiques praticien, 368 tests unitaires, code-splitting par route, PWA installable, référencement de base, découpage vendor du bundle, réponse du praticien aux avis, export .ics du RDV, carnet de santé exportable, tri par prochaine disponibilité en recherche, notifications push navigateur, email + SMS de confirmation immédiate à la réservation, pages légales finalisées avec le SIRET, annulation de RDV patient corrigée, interface mobile dédiée pour l'espace patient avec recherche à deux champs et cartes animaux en bannière photo, rappel automatique pour laisser un avis après un RDV terminé, favoris praticiens, annulation de RDV côté praticien avec notification patient (in-app, email, SMS), correctif de redirection post-connexion, logo Animéaux dans tous les emails transactionnels, recherche de bugs applicative complète le 24 août 2026 : faille XSS critique corrigée sur la biographie praticien, durcissement de la sécurité au niveau colonne sur les rendez-vous/profils praticiens/messages/notifications, sécurisation des fonctions serveur d'envoi d'email-SMS-push contre les appels non autorisés, correctifs messagerie temps réel/documents de vérification/statistiques praticien/actions de modération admin, système de rappels automatiques (RDV à 24h, vaccin, avis) entièrement fiabilisé début septembre 2026 après plusieurs pannes silencieuses en cascade (vérification JWT de la plateforme, délai réseau trop court, désynchronisation de clé secrète, mauvaise colonne interrogée), erreurs de requête serveur désormais toujours visibles au lieu d'être ignorées silencieusement, adresse postale ajoutée au profil praticien, code de messagerie temps réel unifié entre l'espace patient et praticien, audit applicatif complet du 04/09/2026 : reconstruction de secours de 4 tables jamais commitées (animaux/vaccins/poids/dossiers de santé), verrouillage RLS niveau colonne étendu (avis, dossiers médicaux), durée de rendez-vous alignée sur la configuration réelle du praticien (45/60 min au lieu de 30 min fixe), garde-fou anti-doublon sur le rappel de RDV à 24h, rappel de vaccin en retard qui repart, confirmations ajoutées avant les actions destructrices du cabinet (retirer un membre, supprimer un tarif), renouvellement d'abonnement push géré, notification qui réutilise l'onglet déjà ouvert, plusieurs correctifs de fiabilité (connexion, invalidations de cache, routage administrateur), report de rendez-vous en libre-service pour le patient (au même titre que l'annulation), délai minimum d'1h avant le rendez-vous imposé au patient pour annuler ou reporter, flux calendrier abonnable (ICS) pour le praticien permettant de synchroniser tout son agenda confirmé en un clic dans Google Agenda ou Apple Calendrier, audit de sécurité complet du 05/09/2026 (8 revues croisées) : contournement RLS corrigé permettant à un patient de confirmer lui-même un RDV en attente et de le déplacer à sa guise, motif de rejet administratif d'un praticien retiré de la lecture publique, faille de remplacement de fichier de stockage entre utilisateurs corrigée, verrou ajouté empêchant un patient de forger la réponse du praticien à son propre avis, emails de confirmation/annulation/report de RDV et lien de confirmation de présence fiabilisés (requête ambiguë), échappement HTML généralisé dans les emails, correction du destinataire de l'email de report de RDV quand c'est le patient qui reporte, auto-réparation de l'abonnement aux notifications push, confirmations à deux clics harmonisées sur les annulations de RDV, messages d'erreur explicites au lieu d'échecs silencieux sur les actions de rendez-vous; puis du 22 au 25/09/2026 : notifications push enfin fonctionnelles, pipeline de déploiement automatisé (fonctions Edge, tests bloquants, Sentry), corrections de récursions RLS sur l'espace praticien, performances mobile (graphique et carte chargés à la demande, images en lazy loading), rappels de suivi généralisés (vaccin, vermifuge, bilan annuel), partage de dossier animal entre praticiens avec l'accord du propriétaire, praticiens à plusieurs métiers, page Mes animaux allégée, relance des patients inactifs, interrupteur de messagerie par praticien, visite guidée de première connexion, 550 tests unitaires, email de confirmation d'inscription refait (lien cliquable, en français), statistiques praticien enrichies, fermeture de cabinet, export comptable, double authentification)</w:t>
       </w:r>
     </w:p>
     <w:p>
@@ -4704,6 +4704,14 @@
       </w:pPr>
       <w:r>
         <w:t>Affichage unique par compte : la colonne profiles.onboarding_completed_at (migration 110) est renseignée à la fin de la visite ou à sa fermeture ; elle est nulle pour un nouveau compte et remplie d'office pour tous les comptes existants (seuls les nouveaux comptes voient donc la visite). Pas de bouton « revoir » (choix produit). Un praticien encore bloqué sur l'écran de dépôt de document ne déclenche pas la visite, qui démarre à sa première arrivée sur le vrai tableau de bord. Admins et secrétariat ne sont pas concernés. Code : src/lib/onboardingTour.ts (logique pure testée), src/components/onboarding/OnboardingTour.tsx (monté dans App.tsx), repères data-tour sur Navbar, MobileHeader, MobileTabBar et DoctorMobileTabBar.</w:t>
+      </w:r>
+    </w:p>
+    <w:p>
+      <w:pPr>
+        <w:spacing w:after="160" w:line="300"/>
+      </w:pPr>
+      <w:r>
+        <w:t>Double authentification (ajoutée le 05/10/2026) : proposée aux praticiens et aux administrateurs, facultative. Activation depuis la page profil (carte « Double authentification », présente sur les deux pages profil) : QR code à scanner avec une application (Google Authenticator, Authy, Microsoft Authenticator), puis saisie d'un code à 6 chiffres pour valider ; désactivation possible au même endroit. Une fois activée, LoginPage demande ce code après le mot de passe (écran dédié, bouton « Annuler »). Technique : Supabase Auth MFA (TOTP, mfa.enroll / challengeAndVerify) ; la session issue du seul mot de passe est de niveau aal1 et App.tsx ne la traite pas comme une connexion tant que le code n'est pas validé (lecture du niveau aal dans le JWT et des facteurs de session.user, sans appel réseau, pour éviter un blocage dans le callback onAuthStateChange) — logique pure dans src/lib/mfa.ts (testée), composant src/components/auth/TwoFactorSettings.tsx. LIMITE ASSUMÉE : le contrôle est côté application ; la base (RLS) n'exige pas encore le niveau aal2, donc quelqu'un qui contournerait l'interface avec un mot de passe volé et appellerait l'API directement ne serait pas arrêté — une exigence aal2 dans les policies des tables sensibles serait une seconde phase. Perte du téléphone : pas de codes de secours (non fournis par Supabase) ; un administrateur supprime le facteur en base (delete from auth.mfa_factors where user_id = '...') pour permettre une nouvelle connexion.</w:t>
       </w:r>
     </w:p>
     <w:p>

</xml_diff>

<commit_message>
Revert "Double authentification (TOTP) facultative pour praticiens et admins"
This reverts commit f07e56e43824e43fa6e02280a933019517ff6192.
</commit_message>
<xml_diff>
--- a/cahier_des_charges_animeaux.docx
+++ b/cahier_des_charges_animeaux.docx
@@ -58,7 +58,7 @@
           <w:sz w:val="22"/>
           <w:szCs w:val="22"/>
         </w:rPr>
-        <w:t>Version 1.53 — document mis à jour avec les évolutions de juillet, août et septembre 2026 (vérification des praticiens par documents, correctif critique inscriptions, espace secrétariat en compte dédié, statut administrateur découplé du rôle, tableau de bord admin complet, domaine d'envoi Resend vérifié, carte Leaflet sur la fiche praticien avec géocodage des cabinets, domaine monanimeaux.fr connecté au site et indexé par Google, modération avancée admin, rappels de RDV par SMS, liste d'attente, rappels de vaccin proactifs, statistiques praticien, 368 tests unitaires, code-splitting par route, PWA installable, référencement de base, découpage vendor du bundle, réponse du praticien aux avis, export .ics du RDV, carnet de santé exportable, tri par prochaine disponibilité en recherche, notifications push navigateur, email + SMS de confirmation immédiate à la réservation, pages légales finalisées avec le SIRET, annulation de RDV patient corrigée, interface mobile dédiée pour l'espace patient avec recherche à deux champs et cartes animaux en bannière photo, rappel automatique pour laisser un avis après un RDV terminé, favoris praticiens, annulation de RDV côté praticien avec notification patient (in-app, email, SMS), correctif de redirection post-connexion, logo Animéaux dans tous les emails transactionnels, recherche de bugs applicative complète le 24 août 2026 : faille XSS critique corrigée sur la biographie praticien, durcissement de la sécurité au niveau colonne sur les rendez-vous/profils praticiens/messages/notifications, sécurisation des fonctions serveur d'envoi d'email-SMS-push contre les appels non autorisés, correctifs messagerie temps réel/documents de vérification/statistiques praticien/actions de modération admin, système de rappels automatiques (RDV à 24h, vaccin, avis) entièrement fiabilisé début septembre 2026 après plusieurs pannes silencieuses en cascade (vérification JWT de la plateforme, délai réseau trop court, désynchronisation de clé secrète, mauvaise colonne interrogée), erreurs de requête serveur désormais toujours visibles au lieu d'être ignorées silencieusement, adresse postale ajoutée au profil praticien, code de messagerie temps réel unifié entre l'espace patient et praticien, audit applicatif complet du 04/09/2026 : reconstruction de secours de 4 tables jamais commitées (animaux/vaccins/poids/dossiers de santé), verrouillage RLS niveau colonne étendu (avis, dossiers médicaux), durée de rendez-vous alignée sur la configuration réelle du praticien (45/60 min au lieu de 30 min fixe), garde-fou anti-doublon sur le rappel de RDV à 24h, rappel de vaccin en retard qui repart, confirmations ajoutées avant les actions destructrices du cabinet (retirer un membre, supprimer un tarif), renouvellement d'abonnement push géré, notification qui réutilise l'onglet déjà ouvert, plusieurs correctifs de fiabilité (connexion, invalidations de cache, routage administrateur), report de rendez-vous en libre-service pour le patient (au même titre que l'annulation), délai minimum d'1h avant le rendez-vous imposé au patient pour annuler ou reporter, flux calendrier abonnable (ICS) pour le praticien permettant de synchroniser tout son agenda confirmé en un clic dans Google Agenda ou Apple Calendrier, audit de sécurité complet du 05/09/2026 (8 revues croisées) : contournement RLS corrigé permettant à un patient de confirmer lui-même un RDV en attente et de le déplacer à sa guise, motif de rejet administratif d'un praticien retiré de la lecture publique, faille de remplacement de fichier de stockage entre utilisateurs corrigée, verrou ajouté empêchant un patient de forger la réponse du praticien à son propre avis, emails de confirmation/annulation/report de RDV et lien de confirmation de présence fiabilisés (requête ambiguë), échappement HTML généralisé dans les emails, correction du destinataire de l'email de report de RDV quand c'est le patient qui reporte, auto-réparation de l'abonnement aux notifications push, confirmations à deux clics harmonisées sur les annulations de RDV, messages d'erreur explicites au lieu d'échecs silencieux sur les actions de rendez-vous; puis du 22 au 25/09/2026 : notifications push enfin fonctionnelles, pipeline de déploiement automatisé (fonctions Edge, tests bloquants, Sentry), corrections de récursions RLS sur l'espace praticien, performances mobile (graphique et carte chargés à la demande, images en lazy loading), rappels de suivi généralisés (vaccin, vermifuge, bilan annuel), partage de dossier animal entre praticiens avec l'accord du propriétaire, praticiens à plusieurs métiers, page Mes animaux allégée, relance des patients inactifs, interrupteur de messagerie par praticien, visite guidée de première connexion, 550 tests unitaires, email de confirmation d'inscription refait (lien cliquable, en français), statistiques praticien enrichies, fermeture de cabinet, export comptable, double authentification)</w:t>
+        <w:t>Version 1.53 — document mis à jour avec les évolutions de juillet, août et septembre 2026 (vérification des praticiens par documents, correctif critique inscriptions, espace secrétariat en compte dédié, statut administrateur découplé du rôle, tableau de bord admin complet, domaine d'envoi Resend vérifié, carte Leaflet sur la fiche praticien avec géocodage des cabinets, domaine monanimeaux.fr connecté au site et indexé par Google, modération avancée admin, rappels de RDV par SMS, liste d'attente, rappels de vaccin proactifs, statistiques praticien, 368 tests unitaires, code-splitting par route, PWA installable, référencement de base, découpage vendor du bundle, réponse du praticien aux avis, export .ics du RDV, carnet de santé exportable, tri par prochaine disponibilité en recherche, notifications push navigateur, email + SMS de confirmation immédiate à la réservation, pages légales finalisées avec le SIRET, annulation de RDV patient corrigée, interface mobile dédiée pour l'espace patient avec recherche à deux champs et cartes animaux en bannière photo, rappel automatique pour laisser un avis après un RDV terminé, favoris praticiens, annulation de RDV côté praticien avec notification patient (in-app, email, SMS), correctif de redirection post-connexion, logo Animéaux dans tous les emails transactionnels, recherche de bugs applicative complète le 24 août 2026 : faille XSS critique corrigée sur la biographie praticien, durcissement de la sécurité au niveau colonne sur les rendez-vous/profils praticiens/messages/notifications, sécurisation des fonctions serveur d'envoi d'email-SMS-push contre les appels non autorisés, correctifs messagerie temps réel/documents de vérification/statistiques praticien/actions de modération admin, système de rappels automatiques (RDV à 24h, vaccin, avis) entièrement fiabilisé début septembre 2026 après plusieurs pannes silencieuses en cascade (vérification JWT de la plateforme, délai réseau trop court, désynchronisation de clé secrète, mauvaise colonne interrogée), erreurs de requête serveur désormais toujours visibles au lieu d'être ignorées silencieusement, adresse postale ajoutée au profil praticien, code de messagerie temps réel unifié entre l'espace patient et praticien, audit applicatif complet du 04/09/2026 : reconstruction de secours de 4 tables jamais commitées (animaux/vaccins/poids/dossiers de santé), verrouillage RLS niveau colonne étendu (avis, dossiers médicaux), durée de rendez-vous alignée sur la configuration réelle du praticien (45/60 min au lieu de 30 min fixe), garde-fou anti-doublon sur le rappel de RDV à 24h, rappel de vaccin en retard qui repart, confirmations ajoutées avant les actions destructrices du cabinet (retirer un membre, supprimer un tarif), renouvellement d'abonnement push géré, notification qui réutilise l'onglet déjà ouvert, plusieurs correctifs de fiabilité (connexion, invalidations de cache, routage administrateur), report de rendez-vous en libre-service pour le patient (au même titre que l'annulation), délai minimum d'1h avant le rendez-vous imposé au patient pour annuler ou reporter, flux calendrier abonnable (ICS) pour le praticien permettant de synchroniser tout son agenda confirmé en un clic dans Google Agenda ou Apple Calendrier, audit de sécurité complet du 05/09/2026 (8 revues croisées) : contournement RLS corrigé permettant à un patient de confirmer lui-même un RDV en attente et de le déplacer à sa guise, motif de rejet administratif d'un praticien retiré de la lecture publique, faille de remplacement de fichier de stockage entre utilisateurs corrigée, verrou ajouté empêchant un patient de forger la réponse du praticien à son propre avis, emails de confirmation/annulation/report de RDV et lien de confirmation de présence fiabilisés (requête ambiguë), échappement HTML généralisé dans les emails, correction du destinataire de l'email de report de RDV quand c'est le patient qui reporte, auto-réparation de l'abonnement aux notifications push, confirmations à deux clics harmonisées sur les annulations de RDV, messages d'erreur explicites au lieu d'échecs silencieux sur les actions de rendez-vous; puis du 22 au 25/09/2026 : notifications push enfin fonctionnelles, pipeline de déploiement automatisé (fonctions Edge, tests bloquants, Sentry), corrections de récursions RLS sur l'espace praticien, performances mobile (graphique et carte chargés à la demande, images en lazy loading), rappels de suivi généralisés (vaccin, vermifuge, bilan annuel), partage de dossier animal entre praticiens avec l'accord du propriétaire, praticiens à plusieurs métiers, page Mes animaux allégée, relance des patients inactifs, interrupteur de messagerie par praticien, visite guidée de première connexion, 524 tests unitaires, email de confirmation d'inscription refait (lien cliquable, en français), statistiques praticien enrichies, fermeture de cabinet)</w:t>
       </w:r>
     </w:p>
     <w:p>
@@ -4704,14 +4704,6 @@
       </w:pPr>
       <w:r>
         <w:t>Affichage unique par compte : la colonne profiles.onboarding_completed_at (migration 110) est renseignée à la fin de la visite ou à sa fermeture ; elle est nulle pour un nouveau compte et remplie d'office pour tous les comptes existants (seuls les nouveaux comptes voient donc la visite). Pas de bouton « revoir » (choix produit). Un praticien encore bloqué sur l'écran de dépôt de document ne déclenche pas la visite, qui démarre à sa première arrivée sur le vrai tableau de bord. Admins et secrétariat ne sont pas concernés. Code : src/lib/onboardingTour.ts (logique pure testée), src/components/onboarding/OnboardingTour.tsx (monté dans App.tsx), repères data-tour sur Navbar, MobileHeader, MobileTabBar et DoctorMobileTabBar.</w:t>
-      </w:r>
-    </w:p>
-    <w:p>
-      <w:pPr>
-        <w:spacing w:after="160" w:line="300"/>
-      </w:pPr>
-      <w:r>
-        <w:t>Double authentification (ajoutée le 05/10/2026) : proposée aux praticiens et aux administrateurs, facultative. Activation depuis la page profil (carte « Double authentification », présente sur les deux pages profil) : QR code à scanner avec une application (Google Authenticator, Authy, Microsoft Authenticator), puis saisie d'un code à 6 chiffres pour valider ; désactivation possible au même endroit. Une fois activée, LoginPage demande ce code après le mot de passe (écran dédié, bouton « Annuler »). Technique : Supabase Auth MFA (TOTP, mfa.enroll / challengeAndVerify) ; la session issue du seul mot de passe est de niveau aal1 et App.tsx ne la traite pas comme une connexion tant que le code n'est pas validé (lecture du niveau aal dans le JWT et des facteurs de session.user, sans appel réseau, pour éviter un blocage dans le callback onAuthStateChange) — logique pure dans src/lib/mfa.ts (testée), composant src/components/auth/TwoFactorSettings.tsx. LIMITE ASSUMÉE : le contrôle est côté application ; la base (RLS) n'exige pas encore le niveau aal2, donc quelqu'un qui contournerait l'interface avec un mot de passe volé et appellerait l'API directement ne serait pas arrêté — une exigence aal2 dans les policies des tables sensibles serait une seconde phase. Perte du téléphone : pas de codes de secours (non fournis par Supabase) ; un administrateur supprime le facteur en base (delete from auth.mfa_factors where user_id = '...') pour permettre une nouvelle connexion.</w:t>
       </w:r>
     </w:p>
     <w:p>

</xml_diff>

<commit_message>
Docs : double authentification essayée puis retirée (décision d'Anaïs)
Co-Authored-By: Claude Sonnet 5.5 <noreply@anthropic.com>
</commit_message>
<xml_diff>
--- a/cahier_des_charges_animeaux.docx
+++ b/cahier_des_charges_animeaux.docx
@@ -58,7 +58,7 @@
           <w:sz w:val="22"/>
           <w:szCs w:val="22"/>
         </w:rPr>
-        <w:t>Version 1.53 — document mis à jour avec les évolutions de juillet, août et septembre 2026 (vérification des praticiens par documents, correctif critique inscriptions, espace secrétariat en compte dédié, statut administrateur découplé du rôle, tableau de bord admin complet, domaine d'envoi Resend vérifié, carte Leaflet sur la fiche praticien avec géocodage des cabinets, domaine monanimeaux.fr connecté au site et indexé par Google, modération avancée admin, rappels de RDV par SMS, liste d'attente, rappels de vaccin proactifs, statistiques praticien, 368 tests unitaires, code-splitting par route, PWA installable, référencement de base, découpage vendor du bundle, réponse du praticien aux avis, export .ics du RDV, carnet de santé exportable, tri par prochaine disponibilité en recherche, notifications push navigateur, email + SMS de confirmation immédiate à la réservation, pages légales finalisées avec le SIRET, annulation de RDV patient corrigée, interface mobile dédiée pour l'espace patient avec recherche à deux champs et cartes animaux en bannière photo, rappel automatique pour laisser un avis après un RDV terminé, favoris praticiens, annulation de RDV côté praticien avec notification patient (in-app, email, SMS), correctif de redirection post-connexion, logo Animéaux dans tous les emails transactionnels, recherche de bugs applicative complète le 24 août 2026 : faille XSS critique corrigée sur la biographie praticien, durcissement de la sécurité au niveau colonne sur les rendez-vous/profils praticiens/messages/notifications, sécurisation des fonctions serveur d'envoi d'email-SMS-push contre les appels non autorisés, correctifs messagerie temps réel/documents de vérification/statistiques praticien/actions de modération admin, système de rappels automatiques (RDV à 24h, vaccin, avis) entièrement fiabilisé début septembre 2026 après plusieurs pannes silencieuses en cascade (vérification JWT de la plateforme, délai réseau trop court, désynchronisation de clé secrète, mauvaise colonne interrogée), erreurs de requête serveur désormais toujours visibles au lieu d'être ignorées silencieusement, adresse postale ajoutée au profil praticien, code de messagerie temps réel unifié entre l'espace patient et praticien, audit applicatif complet du 04/09/2026 : reconstruction de secours de 4 tables jamais commitées (animaux/vaccins/poids/dossiers de santé), verrouillage RLS niveau colonne étendu (avis, dossiers médicaux), durée de rendez-vous alignée sur la configuration réelle du praticien (45/60 min au lieu de 30 min fixe), garde-fou anti-doublon sur le rappel de RDV à 24h, rappel de vaccin en retard qui repart, confirmations ajoutées avant les actions destructrices du cabinet (retirer un membre, supprimer un tarif), renouvellement d'abonnement push géré, notification qui réutilise l'onglet déjà ouvert, plusieurs correctifs de fiabilité (connexion, invalidations de cache, routage administrateur), report de rendez-vous en libre-service pour le patient (au même titre que l'annulation), délai minimum d'1h avant le rendez-vous imposé au patient pour annuler ou reporter, flux calendrier abonnable (ICS) pour le praticien permettant de synchroniser tout son agenda confirmé en un clic dans Google Agenda ou Apple Calendrier, audit de sécurité complet du 05/09/2026 (8 revues croisées) : contournement RLS corrigé permettant à un patient de confirmer lui-même un RDV en attente et de le déplacer à sa guise, motif de rejet administratif d'un praticien retiré de la lecture publique, faille de remplacement de fichier de stockage entre utilisateurs corrigée, verrou ajouté empêchant un patient de forger la réponse du praticien à son propre avis, emails de confirmation/annulation/report de RDV et lien de confirmation de présence fiabilisés (requête ambiguë), échappement HTML généralisé dans les emails, correction du destinataire de l'email de report de RDV quand c'est le patient qui reporte, auto-réparation de l'abonnement aux notifications push, confirmations à deux clics harmonisées sur les annulations de RDV, messages d'erreur explicites au lieu d'échecs silencieux sur les actions de rendez-vous; puis du 22 au 25/09/2026 : notifications push enfin fonctionnelles, pipeline de déploiement automatisé (fonctions Edge, tests bloquants, Sentry), corrections de récursions RLS sur l'espace praticien, performances mobile (graphique et carte chargés à la demande, images en lazy loading), rappels de suivi généralisés (vaccin, vermifuge, bilan annuel), partage de dossier animal entre praticiens avec l'accord du propriétaire, praticiens à plusieurs métiers, page Mes animaux allégée, relance des patients inactifs, interrupteur de messagerie par praticien, visite guidée de première connexion, 524 tests unitaires, email de confirmation d'inscription refait (lien cliquable, en français), statistiques praticien enrichies, fermeture de cabinet)</w:t>
+        <w:t>Version 1.53 — document mis à jour avec les évolutions de juillet, août et septembre 2026 (vérification des praticiens par documents, correctif critique inscriptions, espace secrétariat en compte dédié, statut administrateur découplé du rôle, tableau de bord admin complet, domaine d'envoi Resend vérifié, carte Leaflet sur la fiche praticien avec géocodage des cabinets, domaine monanimeaux.fr connecté au site et indexé par Google, modération avancée admin, rappels de RDV par SMS, liste d'attente, rappels de vaccin proactifs, statistiques praticien, 368 tests unitaires, code-splitting par route, PWA installable, référencement de base, découpage vendor du bundle, réponse du praticien aux avis, export .ics du RDV, carnet de santé exportable, tri par prochaine disponibilité en recherche, notifications push navigateur, email + SMS de confirmation immédiate à la réservation, pages légales finalisées avec le SIRET, annulation de RDV patient corrigée, interface mobile dédiée pour l'espace patient avec recherche à deux champs et cartes animaux en bannière photo, rappel automatique pour laisser un avis après un RDV terminé, favoris praticiens, annulation de RDV côté praticien avec notification patient (in-app, email, SMS), correctif de redirection post-connexion, logo Animéaux dans tous les emails transactionnels, recherche de bugs applicative complète le 24 août 2026 : faille XSS critique corrigée sur la biographie praticien, durcissement de la sécurité au niveau colonne sur les rendez-vous/profils praticiens/messages/notifications, sécurisation des fonctions serveur d'envoi d'email-SMS-push contre les appels non autorisés, correctifs messagerie temps réel/documents de vérification/statistiques praticien/actions de modération admin, système de rappels automatiques (RDV à 24h, vaccin, avis) entièrement fiabilisé début septembre 2026 après plusieurs pannes silencieuses en cascade (vérification JWT de la plateforme, délai réseau trop court, désynchronisation de clé secrète, mauvaise colonne interrogée), erreurs de requête serveur désormais toujours visibles au lieu d'être ignorées silencieusement, adresse postale ajoutée au profil praticien, code de messagerie temps réel unifié entre l'espace patient et praticien, audit applicatif complet du 04/09/2026 : reconstruction de secours de 4 tables jamais commitées (animaux/vaccins/poids/dossiers de santé), verrouillage RLS niveau colonne étendu (avis, dossiers médicaux), durée de rendez-vous alignée sur la configuration réelle du praticien (45/60 min au lieu de 30 min fixe), garde-fou anti-doublon sur le rappel de RDV à 24h, rappel de vaccin en retard qui repart, confirmations ajoutées avant les actions destructrices du cabinet (retirer un membre, supprimer un tarif), renouvellement d'abonnement push géré, notification qui réutilise l'onglet déjà ouvert, plusieurs correctifs de fiabilité (connexion, invalidations de cache, routage administrateur), report de rendez-vous en libre-service pour le patient (au même titre que l'annulation), délai minimum d'1h avant le rendez-vous imposé au patient pour annuler ou reporter, flux calendrier abonnable (ICS) pour le praticien permettant de synchroniser tout son agenda confirmé en un clic dans Google Agenda ou Apple Calendrier, audit de sécurité complet du 05/09/2026 (8 revues croisées) : contournement RLS corrigé permettant à un patient de confirmer lui-même un RDV en attente et de le déplacer à sa guise, motif de rejet administratif d'un praticien retiré de la lecture publique, faille de remplacement de fichier de stockage entre utilisateurs corrigée, verrou ajouté empêchant un patient de forger la réponse du praticien à son propre avis, emails de confirmation/annulation/report de RDV et lien de confirmation de présence fiabilisés (requête ambiguë), échappement HTML généralisé dans les emails, correction du destinataire de l'email de report de RDV quand c'est le patient qui reporte, auto-réparation de l'abonnement aux notifications push, confirmations à deux clics harmonisées sur les annulations de RDV, messages d'erreur explicites au lieu d'échecs silencieux sur les actions de rendez-vous; puis du 22 au 25/09/2026 : notifications push enfin fonctionnelles, pipeline de déploiement automatisé (fonctions Edge, tests bloquants, Sentry), corrections de récursions RLS sur l'espace praticien, performances mobile (graphique et carte chargés à la demande, images en lazy loading), rappels de suivi généralisés (vaccin, vermifuge, bilan annuel), partage de dossier animal entre praticiens avec l'accord du propriétaire, praticiens à plusieurs métiers, page Mes animaux allégée, relance des patients inactifs, interrupteur de messagerie par praticien, visite guidée de première connexion, 533 tests unitaires, email de confirmation d'inscription refait (lien cliquable, en français), statistiques praticien enrichies, fermeture de cabinet)</w:t>
       </w:r>
     </w:p>
     <w:p>
@@ -7616,6 +7616,14 @@
       </w:pPr>
       <w:r>
         <w:t>Migration 111 (02/10/2026) : la seule donnée des nouvelles statistiques praticien (section 7.8) qui n'était pas déjà accessible — le nombre de patients en liste d'attente chez lui. waitlist_entries (migration 065) n'avait jusque-là qu'une policy réservée au patient lui-même. Plutôt qu'une policy SELECT qui exposerait l'identité de chaque patient en attente, une RPC security definer get_my_waitlist_count() ne renvoie qu'un compte agrégé pour le praticien connecté.</w:t>
+      </w:r>
+    </w:p>
+    <w:p>
+      <w:pPr>
+        <w:spacing w:after="160" w:line="300"/>
+      </w:pPr>
+      <w:r>
+        <w:t>Essayée puis retirée le 05/10/2026 : une double authentification par application (TOTP, Supabase MFA) avait été développée pour les praticiens et administrateurs (commit f07e56e), jugée trop complexe par Anaïs — retirée entièrement (commit de revert), aucune migration concernée. Si elle revient un jour : le contrôle n'était que côté application (les policies RLS n'exigeaient pas le niveau aal2) ; en cas de perte du téléphone, un admin supprimait le facteur en base (delete from auth.mfa_factors where user_id = ...). Un compte qui avait activé un facteur pendant les essais se connecte désormais avec son seul mot de passe ; ses facteurs inutilisés peuvent être purgés en base.</w:t>
       </w:r>
     </w:p>
     <w:sectPr>

</xml_diff>

<commit_message>
Bandeau « nouvelle version disponible » pour éviter l'ancienne version en cache
Co-Authored-By: Claude Sonnet 5.5 <noreply@anthropic.com>
</commit_message>
<xml_diff>
--- a/cahier_des_charges_animeaux.docx
+++ b/cahier_des_charges_animeaux.docx
@@ -58,7 +58,7 @@
           <w:sz w:val="22"/>
           <w:szCs w:val="22"/>
         </w:rPr>
-        <w:t>Version 1.53 — document mis à jour avec les évolutions de juillet, août et septembre 2026 (vérification des praticiens par documents, correctif critique inscriptions, espace secrétariat en compte dédié, statut administrateur découplé du rôle, tableau de bord admin complet, domaine d'envoi Resend vérifié, carte Leaflet sur la fiche praticien avec géocodage des cabinets, domaine monanimeaux.fr connecté au site et indexé par Google, modération avancée admin, rappels de RDV par SMS, liste d'attente, rappels de vaccin proactifs, statistiques praticien, 368 tests unitaires, code-splitting par route, PWA installable, référencement de base, découpage vendor du bundle, réponse du praticien aux avis, export .ics du RDV, carnet de santé exportable, tri par prochaine disponibilité en recherche, notifications push navigateur, email + SMS de confirmation immédiate à la réservation, pages légales finalisées avec le SIRET, annulation de RDV patient corrigée, interface mobile dédiée pour l'espace patient avec recherche à deux champs et cartes animaux en bannière photo, rappel automatique pour laisser un avis après un RDV terminé, favoris praticiens, annulation de RDV côté praticien avec notification patient (in-app, email, SMS), correctif de redirection post-connexion, logo Animéaux dans tous les emails transactionnels, recherche de bugs applicative complète le 24 août 2026 : faille XSS critique corrigée sur la biographie praticien, durcissement de la sécurité au niveau colonne sur les rendez-vous/profils praticiens/messages/notifications, sécurisation des fonctions serveur d'envoi d'email-SMS-push contre les appels non autorisés, correctifs messagerie temps réel/documents de vérification/statistiques praticien/actions de modération admin, système de rappels automatiques (RDV à 24h, vaccin, avis) entièrement fiabilisé début septembre 2026 après plusieurs pannes silencieuses en cascade (vérification JWT de la plateforme, délai réseau trop court, désynchronisation de clé secrète, mauvaise colonne interrogée), erreurs de requête serveur désormais toujours visibles au lieu d'être ignorées silencieusement, adresse postale ajoutée au profil praticien, code de messagerie temps réel unifié entre l'espace patient et praticien, audit applicatif complet du 04/09/2026 : reconstruction de secours de 4 tables jamais commitées (animaux/vaccins/poids/dossiers de santé), verrouillage RLS niveau colonne étendu (avis, dossiers médicaux), durée de rendez-vous alignée sur la configuration réelle du praticien (45/60 min au lieu de 30 min fixe), garde-fou anti-doublon sur le rappel de RDV à 24h, rappel de vaccin en retard qui repart, confirmations ajoutées avant les actions destructrices du cabinet (retirer un membre, supprimer un tarif), renouvellement d'abonnement push géré, notification qui réutilise l'onglet déjà ouvert, plusieurs correctifs de fiabilité (connexion, invalidations de cache, routage administrateur), report de rendez-vous en libre-service pour le patient (au même titre que l'annulation), délai minimum d'1h avant le rendez-vous imposé au patient pour annuler ou reporter, flux calendrier abonnable (ICS) pour le praticien permettant de synchroniser tout son agenda confirmé en un clic dans Google Agenda ou Apple Calendrier, audit de sécurité complet du 05/09/2026 (8 revues croisées) : contournement RLS corrigé permettant à un patient de confirmer lui-même un RDV en attente et de le déplacer à sa guise, motif de rejet administratif d'un praticien retiré de la lecture publique, faille de remplacement de fichier de stockage entre utilisateurs corrigée, verrou ajouté empêchant un patient de forger la réponse du praticien à son propre avis, emails de confirmation/annulation/report de RDV et lien de confirmation de présence fiabilisés (requête ambiguë), échappement HTML généralisé dans les emails, correction du destinataire de l'email de report de RDV quand c'est le patient qui reporte, auto-réparation de l'abonnement aux notifications push, confirmations à deux clics harmonisées sur les annulations de RDV, messages d'erreur explicites au lieu d'échecs silencieux sur les actions de rendez-vous; puis du 22 au 25/09/2026 : notifications push enfin fonctionnelles, pipeline de déploiement automatisé (fonctions Edge, tests bloquants, Sentry), corrections de récursions RLS sur l'espace praticien, performances mobile (graphique et carte chargés à la demande, images en lazy loading), rappels de suivi généralisés (vaccin, vermifuge, bilan annuel), partage de dossier animal entre praticiens avec l'accord du propriétaire, praticiens à plusieurs métiers, page Mes animaux allégée, relance des patients inactifs, interrupteur de messagerie par praticien, visite guidée de première connexion, 533 tests unitaires, email de confirmation d'inscription refait (lien cliquable, en français), statistiques praticien enrichies, fermeture de cabinet)</w:t>
+        <w:t>Version 1.53 — document mis à jour avec les évolutions de juillet, août et septembre 2026 (vérification des praticiens par documents, correctif critique inscriptions, espace secrétariat en compte dédié, statut administrateur découplé du rôle, tableau de bord admin complet, domaine d'envoi Resend vérifié, carte Leaflet sur la fiche praticien avec géocodage des cabinets, domaine monanimeaux.fr connecté au site et indexé par Google, modération avancée admin, rappels de RDV par SMS, liste d'attente, rappels de vaccin proactifs, statistiques praticien, 368 tests unitaires, code-splitting par route, PWA installable, référencement de base, découpage vendor du bundle, réponse du praticien aux avis, export .ics du RDV, carnet de santé exportable, tri par prochaine disponibilité en recherche, notifications push navigateur, email + SMS de confirmation immédiate à la réservation, pages légales finalisées avec le SIRET, annulation de RDV patient corrigée, interface mobile dédiée pour l'espace patient avec recherche à deux champs et cartes animaux en bannière photo, rappel automatique pour laisser un avis après un RDV terminé, favoris praticiens, annulation de RDV côté praticien avec notification patient (in-app, email, SMS), correctif de redirection post-connexion, logo Animéaux dans tous les emails transactionnels, recherche de bugs applicative complète le 24 août 2026 : faille XSS critique corrigée sur la biographie praticien, durcissement de la sécurité au niveau colonne sur les rendez-vous/profils praticiens/messages/notifications, sécurisation des fonctions serveur d'envoi d'email-SMS-push contre les appels non autorisés, correctifs messagerie temps réel/documents de vérification/statistiques praticien/actions de modération admin, système de rappels automatiques (RDV à 24h, vaccin, avis) entièrement fiabilisé début septembre 2026 après plusieurs pannes silencieuses en cascade (vérification JWT de la plateforme, délai réseau trop court, désynchronisation de clé secrète, mauvaise colonne interrogée), erreurs de requête serveur désormais toujours visibles au lieu d'être ignorées silencieusement, adresse postale ajoutée au profil praticien, code de messagerie temps réel unifié entre l'espace patient et praticien, audit applicatif complet du 04/09/2026 : reconstruction de secours de 4 tables jamais commitées (animaux/vaccins/poids/dossiers de santé), verrouillage RLS niveau colonne étendu (avis, dossiers médicaux), durée de rendez-vous alignée sur la configuration réelle du praticien (45/60 min au lieu de 30 min fixe), garde-fou anti-doublon sur le rappel de RDV à 24h, rappel de vaccin en retard qui repart, confirmations ajoutées avant les actions destructrices du cabinet (retirer un membre, supprimer un tarif), renouvellement d'abonnement push géré, notification qui réutilise l'onglet déjà ouvert, plusieurs correctifs de fiabilité (connexion, invalidations de cache, routage administrateur), report de rendez-vous en libre-service pour le patient (au même titre que l'annulation), délai minimum d'1h avant le rendez-vous imposé au patient pour annuler ou reporter, flux calendrier abonnable (ICS) pour le praticien permettant de synchroniser tout son agenda confirmé en un clic dans Google Agenda ou Apple Calendrier, audit de sécurité complet du 05/09/2026 (8 revues croisées) : contournement RLS corrigé permettant à un patient de confirmer lui-même un RDV en attente et de le déplacer à sa guise, motif de rejet administratif d'un praticien retiré de la lecture publique, faille de remplacement de fichier de stockage entre utilisateurs corrigée, verrou ajouté empêchant un patient de forger la réponse du praticien à son propre avis, emails de confirmation/annulation/report de RDV et lien de confirmation de présence fiabilisés (requête ambiguë), échappement HTML généralisé dans les emails, correction du destinataire de l'email de report de RDV quand c'est le patient qui reporte, auto-réparation de l'abonnement aux notifications push, confirmations à deux clics harmonisées sur les annulations de RDV, messages d'erreur explicites au lieu d'échecs silencieux sur les actions de rendez-vous; puis du 22 au 25/09/2026 : notifications push enfin fonctionnelles, pipeline de déploiement automatisé (fonctions Edge, tests bloquants, Sentry), corrections de récursions RLS sur l'espace praticien, performances mobile (graphique et carte chargés à la demande, images en lazy loading), rappels de suivi généralisés (vaccin, vermifuge, bilan annuel), partage de dossier animal entre praticiens avec l'accord du propriétaire, praticiens à plusieurs métiers, page Mes animaux allégée, relance des patients inactifs, interrupteur de messagerie par praticien, visite guidée de première connexion, 536 tests unitaires, email de confirmation d'inscription refait (lien cliquable, en français), statistiques praticien enrichies, fermeture de cabinet)</w:t>
       </w:r>
     </w:p>
     <w:p>
@@ -7624,6 +7624,14 @@
       </w:pPr>
       <w:r>
         <w:t>Essayée puis retirée le 05/10/2026 : une double authentification par application (TOTP, Supabase MFA) avait été développée pour les praticiens et administrateurs (commit f07e56e), jugée trop complexe par Anaïs — retirée entièrement (commit de revert), aucune migration concernée. Si elle revient un jour : le contrôle n'était que côté application (les policies RLS n'exigeaient pas le niveau aal2) ; en cas de perte du téléphone, un admin supprimait le facteur en base (delete from auth.mfa_factors where user_id = ...). Un compte qui avait activé un facteur pendant les essais se connecte désormais avec son seul mot de passe ; ses facteurs inutilisés peuvent être purgés en base.</w:t>
+      </w:r>
+    </w:p>
+    <w:p>
+      <w:pPr>
+        <w:spacing w:after="160" w:line="300"/>
+      </w:pPr>
+      <w:r>
+        <w:t>Ajouté le 05/10/2026 : bandeau « Une nouvelle version d'Animéaux est disponible » (bouton Recharger), composant src/components/ui/UpdateBanner.tsx monté dans App.tsx. Cause : le service worker (skipWaiting + clientsClaim) prend la main dès qu'une version est téléchargée, mais la page ouverte garde l'ancien code jusqu'au rechargement — l'application installée restait sur une vieille version (repéré lors des tests : fonctionnalités récentes invisibles). Le bandeau s'affiche sur l'événement controllerchange, seulement si la page avait déjà un service worker (pas à la toute première installation), et une vérification de mise à jour est relancée au retour sur l'application. Tests : 536.</w:t>
       </w:r>
     </w:p>
     <w:sectPr>

</xml_diff>

<commit_message>
Carte dans la recherche, partages terminés visibles du propriétaire, retrait d'un compte secrétariat, textes de la visite guidée
Co-Authored-By: Claude Sonnet 5.5 <noreply@anthropic.com>
</commit_message>
<xml_diff>
--- a/cahier_des_charges_animeaux.docx
+++ b/cahier_des_charges_animeaux.docx
@@ -58,7 +58,7 @@
           <w:sz w:val="22"/>
           <w:szCs w:val="22"/>
         </w:rPr>
-        <w:t>Version 1.53 — document mis à jour avec les évolutions de juillet, août et septembre 2026 (vérification des praticiens par documents, correctif critique inscriptions, espace secrétariat en compte dédié, statut administrateur découplé du rôle, tableau de bord admin complet, domaine d'envoi Resend vérifié, carte Leaflet sur la fiche praticien avec géocodage des cabinets, domaine monanimeaux.fr connecté au site et indexé par Google, modération avancée admin, rappels de RDV par SMS, liste d'attente, rappels de vaccin proactifs, statistiques praticien, 368 tests unitaires, code-splitting par route, PWA installable, référencement de base, découpage vendor du bundle, réponse du praticien aux avis, export .ics du RDV, carnet de santé exportable, tri par prochaine disponibilité en recherche, notifications push navigateur, email + SMS de confirmation immédiate à la réservation, pages légales finalisées avec le SIRET, annulation de RDV patient corrigée, interface mobile dédiée pour l'espace patient avec recherche à deux champs et cartes animaux en bannière photo, rappel automatique pour laisser un avis après un RDV terminé, favoris praticiens, annulation de RDV côté praticien avec notification patient (in-app, email, SMS), correctif de redirection post-connexion, logo Animéaux dans tous les emails transactionnels, recherche de bugs applicative complète le 24 août 2026 : faille XSS critique corrigée sur la biographie praticien, durcissement de la sécurité au niveau colonne sur les rendez-vous/profils praticiens/messages/notifications, sécurisation des fonctions serveur d'envoi d'email-SMS-push contre les appels non autorisés, correctifs messagerie temps réel/documents de vérification/statistiques praticien/actions de modération admin, système de rappels automatiques (RDV à 24h, vaccin, avis) entièrement fiabilisé début septembre 2026 après plusieurs pannes silencieuses en cascade (vérification JWT de la plateforme, délai réseau trop court, désynchronisation de clé secrète, mauvaise colonne interrogée), erreurs de requête serveur désormais toujours visibles au lieu d'être ignorées silencieusement, adresse postale ajoutée au profil praticien, code de messagerie temps réel unifié entre l'espace patient et praticien, audit applicatif complet du 04/09/2026 : reconstruction de secours de 4 tables jamais commitées (animaux/vaccins/poids/dossiers de santé), verrouillage RLS niveau colonne étendu (avis, dossiers médicaux), durée de rendez-vous alignée sur la configuration réelle du praticien (45/60 min au lieu de 30 min fixe), garde-fou anti-doublon sur le rappel de RDV à 24h, rappel de vaccin en retard qui repart, confirmations ajoutées avant les actions destructrices du cabinet (retirer un membre, supprimer un tarif), renouvellement d'abonnement push géré, notification qui réutilise l'onglet déjà ouvert, plusieurs correctifs de fiabilité (connexion, invalidations de cache, routage administrateur), report de rendez-vous en libre-service pour le patient (au même titre que l'annulation), délai minimum d'1h avant le rendez-vous imposé au patient pour annuler ou reporter, flux calendrier abonnable (ICS) pour le praticien permettant de synchroniser tout son agenda confirmé en un clic dans Google Agenda ou Apple Calendrier, audit de sécurité complet du 05/09/2026 (8 revues croisées) : contournement RLS corrigé permettant à un patient de confirmer lui-même un RDV en attente et de le déplacer à sa guise, motif de rejet administratif d'un praticien retiré de la lecture publique, faille de remplacement de fichier de stockage entre utilisateurs corrigée, verrou ajouté empêchant un patient de forger la réponse du praticien à son propre avis, emails de confirmation/annulation/report de RDV et lien de confirmation de présence fiabilisés (requête ambiguë), échappement HTML généralisé dans les emails, correction du destinataire de l'email de report de RDV quand c'est le patient qui reporte, auto-réparation de l'abonnement aux notifications push, confirmations à deux clics harmonisées sur les annulations de RDV, messages d'erreur explicites au lieu d'échecs silencieux sur les actions de rendez-vous; puis du 22 au 25/09/2026 : notifications push enfin fonctionnelles, pipeline de déploiement automatisé (fonctions Edge, tests bloquants, Sentry), corrections de récursions RLS sur l'espace praticien, performances mobile (graphique et carte chargés à la demande, images en lazy loading), rappels de suivi généralisés (vaccin, vermifuge, bilan annuel), partage de dossier animal entre praticiens avec l'accord du propriétaire, praticiens à plusieurs métiers, page Mes animaux allégée, relance des patients inactifs, interrupteur de messagerie par praticien, visite guidée de première connexion, 536 tests unitaires, email de confirmation d'inscription refait (lien cliquable, en français), statistiques praticien enrichies, fermeture de cabinet)</w:t>
+        <w:t>Version 1.53 — document mis à jour avec les évolutions de juillet, août et septembre 2026 (vérification des praticiens par documents, correctif critique inscriptions, espace secrétariat en compte dédié, statut administrateur découplé du rôle, tableau de bord admin complet, domaine d'envoi Resend vérifié, carte Leaflet sur la fiche praticien avec géocodage des cabinets, domaine monanimeaux.fr connecté au site et indexé par Google, modération avancée admin, rappels de RDV par SMS, liste d'attente, rappels de vaccin proactifs, statistiques praticien, 368 tests unitaires, code-splitting par route, PWA installable, référencement de base, découpage vendor du bundle, réponse du praticien aux avis, export .ics du RDV, carnet de santé exportable, tri par prochaine disponibilité en recherche, notifications push navigateur, email + SMS de confirmation immédiate à la réservation, pages légales finalisées avec le SIRET, annulation de RDV patient corrigée, interface mobile dédiée pour l'espace patient avec recherche à deux champs et cartes animaux en bannière photo, rappel automatique pour laisser un avis après un RDV terminé, favoris praticiens, annulation de RDV côté praticien avec notification patient (in-app, email, SMS), correctif de redirection post-connexion, logo Animéaux dans tous les emails transactionnels, recherche de bugs applicative complète le 24 août 2026 : faille XSS critique corrigée sur la biographie praticien, durcissement de la sécurité au niveau colonne sur les rendez-vous/profils praticiens/messages/notifications, sécurisation des fonctions serveur d'envoi d'email-SMS-push contre les appels non autorisés, correctifs messagerie temps réel/documents de vérification/statistiques praticien/actions de modération admin, système de rappels automatiques (RDV à 24h, vaccin, avis) entièrement fiabilisé début septembre 2026 après plusieurs pannes silencieuses en cascade (vérification JWT de la plateforme, délai réseau trop court, désynchronisation de clé secrète, mauvaise colonne interrogée), erreurs de requête serveur désormais toujours visibles au lieu d'être ignorées silencieusement, adresse postale ajoutée au profil praticien, code de messagerie temps réel unifié entre l'espace patient et praticien, audit applicatif complet du 04/09/2026 : reconstruction de secours de 4 tables jamais commitées (animaux/vaccins/poids/dossiers de santé), verrouillage RLS niveau colonne étendu (avis, dossiers médicaux), durée de rendez-vous alignée sur la configuration réelle du praticien (45/60 min au lieu de 30 min fixe), garde-fou anti-doublon sur le rappel de RDV à 24h, rappel de vaccin en retard qui repart, confirmations ajoutées avant les actions destructrices du cabinet (retirer un membre, supprimer un tarif), renouvellement d'abonnement push géré, notification qui réutilise l'onglet déjà ouvert, plusieurs correctifs de fiabilité (connexion, invalidations de cache, routage administrateur), report de rendez-vous en libre-service pour le patient (au même titre que l'annulation), délai minimum d'1h avant le rendez-vous imposé au patient pour annuler ou reporter, flux calendrier abonnable (ICS) pour le praticien permettant de synchroniser tout son agenda confirmé en un clic dans Google Agenda ou Apple Calendrier, audit de sécurité complet du 05/09/2026 (8 revues croisées) : contournement RLS corrigé permettant à un patient de confirmer lui-même un RDV en attente et de le déplacer à sa guise, motif de rejet administratif d'un praticien retiré de la lecture publique, faille de remplacement de fichier de stockage entre utilisateurs corrigée, verrou ajouté empêchant un patient de forger la réponse du praticien à son propre avis, emails de confirmation/annulation/report de RDV et lien de confirmation de présence fiabilisés (requête ambiguë), échappement HTML généralisé dans les emails, correction du destinataire de l'email de report de RDV quand c'est le patient qui reporte, auto-réparation de l'abonnement aux notifications push, confirmations à deux clics harmonisées sur les annulations de RDV, messages d'erreur explicites au lieu d'échecs silencieux sur les actions de rendez-vous; puis du 22 au 25/09/2026 : notifications push enfin fonctionnelles, pipeline de déploiement automatisé (fonctions Edge, tests bloquants, Sentry), corrections de récursions RLS sur l'espace praticien, performances mobile (graphique et carte chargés à la demande, images en lazy loading), rappels de suivi généralisés (vaccin, vermifuge, bilan annuel), partage de dossier animal entre praticiens avec l'accord du propriétaire, praticiens à plusieurs métiers, page Mes animaux allégée, relance des patients inactifs, interrupteur de messagerie par praticien, visite guidée de première connexion, 544 tests unitaires, email de confirmation d'inscription refait (lien cliquable, en français), statistiques praticien enrichies, fermeture de cabinet, carte dans la recherche, retrait d'un compte secrétariat, partages terminés visibles du propriétaire)</w:t>
       </w:r>
     </w:p>
     <w:p>
@@ -7632,6 +7632,22 @@
       </w:pPr>
       <w:r>
         <w:t>Ajouté le 05/10/2026 : bandeau « Une nouvelle version d'Animéaux est disponible » (bouton Recharger), composant src/components/ui/UpdateBanner.tsx monté dans App.tsx. Cause : le service worker (skipWaiting + clientsClaim) prend la main dès qu'une version est téléchargée, mais la page ouverte garde l'ancien code jusqu'au rechargement — l'application installée restait sur une vieille version (repéré lors des tests : fonctionnalités récentes invisibles). Le bandeau s'affiche sur l'événement controllerchange, seulement si la page avait déjà un service worker (pas à la toute première installation), et une vérification de mise à jour est relancée au retour sur l'application. Tests : 536.</w:t>
+      </w:r>
+    </w:p>
+    <w:p>
+      <w:pPr>
+        <w:spacing w:after="160" w:line="300"/>
+      </w:pPr>
+      <w:r>
+        <w:t>Ajouté le 05/10/2026 — carte dans la recherche : un sélecteur Liste / Carte (paramètre d'URL ?view=map) sur /search affiche les praticiens (pin orange) et les cabinets (pin vert) ayant des coordonnées, avec une fenêtre (nom, métiers, ville, lien « Voir la fiche ») et un recadrage automatique sur les résultats. Les résultats sans coordonnées (adresse pas encore géocodée) sont comptés et signalés sous la carte plutôt que perdus. Leaflet est chargé à la demande (composant SearchResultsMap en lazy, comme la carte de la fiche praticien) ; logique pure dans src/lib/searchMap.ts (testée).</w:t>
+      </w:r>
+    </w:p>
+    <w:p>
+      <w:pPr>
+        <w:spacing w:after="160" w:line="300"/>
+      </w:pPr>
+      <w:r>
+        <w:t>Ajouté le 05/10/2026 — partages de dossier : le propriétaire voit désormais aussi les partages refusés ou révoqués (section « Partages terminés » de la fiche de santé), qui disparaissaient sans trace. Retrait d'un compte secrétariat (migration 115, RPC remove_clinic_secretary, réservée au créateur) : bouton « Retirer » dans la section Secrétariat de l'onglet Mon cabinet ; le compte est supprimé s'il n'appartient à aucun autre cabinet, sinon seul son lien avec ce cabinet est retiré. Textes de la visite guidée mis à jour (Statistiques : export comptable ; Cabinet : secrétariat). Tests : 544.</w:t>
       </w:r>
     </w:p>
     <w:sectPr>

</xml_diff>

<commit_message>
Nouvelle règle d'accès praticien au dossier animal : rendez-vous maintenu de moins d'un an (migration 116)
Co-Authored-By: Claude Sonnet 5.5 <noreply@anthropic.com>
</commit_message>
<xml_diff>
--- a/cahier_des_charges_animeaux.docx
+++ b/cahier_des_charges_animeaux.docx
@@ -58,7 +58,7 @@
           <w:sz w:val="22"/>
           <w:szCs w:val="22"/>
         </w:rPr>
-        <w:t>Version 1.53 — document mis à jour avec les évolutions de juillet, août et septembre 2026 (vérification des praticiens par documents, correctif critique inscriptions, espace secrétariat en compte dédié, statut administrateur découplé du rôle, tableau de bord admin complet, domaine d'envoi Resend vérifié, carte Leaflet sur la fiche praticien avec géocodage des cabinets, domaine monanimeaux.fr connecté au site et indexé par Google, modération avancée admin, rappels de RDV par SMS, liste d'attente, rappels de vaccin proactifs, statistiques praticien, 368 tests unitaires, code-splitting par route, PWA installable, référencement de base, découpage vendor du bundle, réponse du praticien aux avis, export .ics du RDV, carnet de santé exportable, tri par prochaine disponibilité en recherche, notifications push navigateur, email + SMS de confirmation immédiate à la réservation, pages légales finalisées avec le SIRET, annulation de RDV patient corrigée, interface mobile dédiée pour l'espace patient avec recherche à deux champs et cartes animaux en bannière photo, rappel automatique pour laisser un avis après un RDV terminé, favoris praticiens, annulation de RDV côté praticien avec notification patient (in-app, email, SMS), correctif de redirection post-connexion, logo Animéaux dans tous les emails transactionnels, recherche de bugs applicative complète le 24 août 2026 : faille XSS critique corrigée sur la biographie praticien, durcissement de la sécurité au niveau colonne sur les rendez-vous/profils praticiens/messages/notifications, sécurisation des fonctions serveur d'envoi d'email-SMS-push contre les appels non autorisés, correctifs messagerie temps réel/documents de vérification/statistiques praticien/actions de modération admin, système de rappels automatiques (RDV à 24h, vaccin, avis) entièrement fiabilisé début septembre 2026 après plusieurs pannes silencieuses en cascade (vérification JWT de la plateforme, délai réseau trop court, désynchronisation de clé secrète, mauvaise colonne interrogée), erreurs de requête serveur désormais toujours visibles au lieu d'être ignorées silencieusement, adresse postale ajoutée au profil praticien, code de messagerie temps réel unifié entre l'espace patient et praticien, audit applicatif complet du 04/09/2026 : reconstruction de secours de 4 tables jamais commitées (animaux/vaccins/poids/dossiers de santé), verrouillage RLS niveau colonne étendu (avis, dossiers médicaux), durée de rendez-vous alignée sur la configuration réelle du praticien (45/60 min au lieu de 30 min fixe), garde-fou anti-doublon sur le rappel de RDV à 24h, rappel de vaccin en retard qui repart, confirmations ajoutées avant les actions destructrices du cabinet (retirer un membre, supprimer un tarif), renouvellement d'abonnement push géré, notification qui réutilise l'onglet déjà ouvert, plusieurs correctifs de fiabilité (connexion, invalidations de cache, routage administrateur), report de rendez-vous en libre-service pour le patient (au même titre que l'annulation), délai minimum d'1h avant le rendez-vous imposé au patient pour annuler ou reporter, flux calendrier abonnable (ICS) pour le praticien permettant de synchroniser tout son agenda confirmé en un clic dans Google Agenda ou Apple Calendrier, audit de sécurité complet du 05/09/2026 (8 revues croisées) : contournement RLS corrigé permettant à un patient de confirmer lui-même un RDV en attente et de le déplacer à sa guise, motif de rejet administratif d'un praticien retiré de la lecture publique, faille de remplacement de fichier de stockage entre utilisateurs corrigée, verrou ajouté empêchant un patient de forger la réponse du praticien à son propre avis, emails de confirmation/annulation/report de RDV et lien de confirmation de présence fiabilisés (requête ambiguë), échappement HTML généralisé dans les emails, correction du destinataire de l'email de report de RDV quand c'est le patient qui reporte, auto-réparation de l'abonnement aux notifications push, confirmations à deux clics harmonisées sur les annulations de RDV, messages d'erreur explicites au lieu d'échecs silencieux sur les actions de rendez-vous; puis du 22 au 25/09/2026 : notifications push enfin fonctionnelles, pipeline de déploiement automatisé (fonctions Edge, tests bloquants, Sentry), corrections de récursions RLS sur l'espace praticien, performances mobile (graphique et carte chargés à la demande, images en lazy loading), rappels de suivi généralisés (vaccin, vermifuge, bilan annuel), partage de dossier animal entre praticiens avec l'accord du propriétaire, praticiens à plusieurs métiers, page Mes animaux allégée, relance des patients inactifs, interrupteur de messagerie par praticien, visite guidée de première connexion, 544 tests unitaires, email de confirmation d'inscription refait (lien cliquable, en français), statistiques praticien enrichies, fermeture de cabinet, carte dans la recherche, retrait d'un compte secrétariat, partages terminés visibles du propriétaire)</w:t>
+        <w:t>Version 1.53 — document mis à jour avec les évolutions de juillet, août et septembre 2026 (vérification des praticiens par documents, correctif critique inscriptions, espace secrétariat en compte dédié, statut administrateur découplé du rôle, tableau de bord admin complet, domaine d'envoi Resend vérifié, carte Leaflet sur la fiche praticien avec géocodage des cabinets, domaine monanimeaux.fr connecté au site et indexé par Google, modération avancée admin, rappels de RDV par SMS, liste d'attente, rappels de vaccin proactifs, statistiques praticien, 368 tests unitaires, code-splitting par route, PWA installable, référencement de base, découpage vendor du bundle, réponse du praticien aux avis, export .ics du RDV, carnet de santé exportable, tri par prochaine disponibilité en recherche, notifications push navigateur, email + SMS de confirmation immédiate à la réservation, pages légales finalisées avec le SIRET, annulation de RDV patient corrigée, interface mobile dédiée pour l'espace patient avec recherche à deux champs et cartes animaux en bannière photo, rappel automatique pour laisser un avis après un RDV terminé, favoris praticiens, annulation de RDV côté praticien avec notification patient (in-app, email, SMS), correctif de redirection post-connexion, logo Animéaux dans tous les emails transactionnels, recherche de bugs applicative complète le 24 août 2026 : faille XSS critique corrigée sur la biographie praticien, durcissement de la sécurité au niveau colonne sur les rendez-vous/profils praticiens/messages/notifications, sécurisation des fonctions serveur d'envoi d'email-SMS-push contre les appels non autorisés, correctifs messagerie temps réel/documents de vérification/statistiques praticien/actions de modération admin, système de rappels automatiques (RDV à 24h, vaccin, avis) entièrement fiabilisé début septembre 2026 après plusieurs pannes silencieuses en cascade (vérification JWT de la plateforme, délai réseau trop court, désynchronisation de clé secrète, mauvaise colonne interrogée), erreurs de requête serveur désormais toujours visibles au lieu d'être ignorées silencieusement, adresse postale ajoutée au profil praticien, code de messagerie temps réel unifié entre l'espace patient et praticien, audit applicatif complet du 04/09/2026 : reconstruction de secours de 4 tables jamais commitées (animaux/vaccins/poids/dossiers de santé), verrouillage RLS niveau colonne étendu (avis, dossiers médicaux), durée de rendez-vous alignée sur la configuration réelle du praticien (45/60 min au lieu de 30 min fixe), garde-fou anti-doublon sur le rappel de RDV à 24h, rappel de vaccin en retard qui repart, confirmations ajoutées avant les actions destructrices du cabinet (retirer un membre, supprimer un tarif), renouvellement d'abonnement push géré, notification qui réutilise l'onglet déjà ouvert, plusieurs correctifs de fiabilité (connexion, invalidations de cache, routage administrateur), report de rendez-vous en libre-service pour le patient (au même titre que l'annulation), délai minimum d'1h avant le rendez-vous imposé au patient pour annuler ou reporter, flux calendrier abonnable (ICS) pour le praticien permettant de synchroniser tout son agenda confirmé en un clic dans Google Agenda ou Apple Calendrier, audit de sécurité complet du 05/09/2026 (8 revues croisées) : contournement RLS corrigé permettant à un patient de confirmer lui-même un RDV en attente et de le déplacer à sa guise, motif de rejet administratif d'un praticien retiré de la lecture publique, faille de remplacement de fichier de stockage entre utilisateurs corrigée, verrou ajouté empêchant un patient de forger la réponse du praticien à son propre avis, emails de confirmation/annulation/report de RDV et lien de confirmation de présence fiabilisés (requête ambiguë), échappement HTML généralisé dans les emails, correction du destinataire de l'email de report de RDV quand c'est le patient qui reporte, auto-réparation de l'abonnement aux notifications push, confirmations à deux clics harmonisées sur les annulations de RDV, messages d'erreur explicites au lieu d'échecs silencieux sur les actions de rendez-vous; puis du 22 au 25/09/2026 : notifications push enfin fonctionnelles, pipeline de déploiement automatisé (fonctions Edge, tests bloquants, Sentry), corrections de récursions RLS sur l'espace praticien, performances mobile (graphique et carte chargés à la demande, images en lazy loading), rappels de suivi généralisés (vaccin, vermifuge, bilan annuel), partage de dossier animal entre praticiens avec l'accord du propriétaire, praticiens à plusieurs métiers, page Mes animaux allégée, relance des patients inactifs, interrupteur de messagerie par praticien, visite guidée de première connexion, 552 tests unitaires, email de confirmation d'inscription refait (lien cliquable, en français), statistiques praticien enrichies, fermeture de cabinet, carte dans la recherche, retrait d'un compte secrétariat, partages terminés visibles du propriétaire, nouvelle règle d'accès praticien aux dossiers d'animaux)</w:t>
       </w:r>
     </w:p>
     <w:p>
@@ -3951,6 +3951,14 @@
       </w:pPr>
       <w:r>
         <w:t xml:space="preserve">Un praticien obtient un accès en lecture (et en ajout) aux tables animals, vaccines, weight_tracking et health_records d'un animal uniquement lorsqu'il existe, entre lui et le propriétaire de l'animal, un rendez-vous au statut confirmed ou completed. Cette règle est portée par les politiques RLS ajoutées en migration 002 puis étendue au contexte des cabinets par les migrations 026 à 031 (un praticien voit alors aussi les patients de ses confrères du même cabinet, avec des index de performance dédiés).</w:t>
+      </w:r>
+    </w:p>
+    <w:p>
+      <w:pPr>
+        <w:spacing w:after="160" w:line="300"/>
+      </w:pPr>
+      <w:r>
+        <w:t>MISE À JOUR du 05/10/2026 (migration 116) — nouvelle règle d'accès, qui remplace celle décrite ci-dessus : un praticien (ou un confrère de son cabinet) voit un animal tant qu'il existe un rendez-vous MAINTENU (confirmé ou terminé) datant de moins d'un an, futur compris. Premier rendez-vous annulé : aucun accès. Animal déjà vu : l'annulation d'un rendez-vous ultérieur ne retire rien. Plus de rendez-vous depuis un an : l'accès est perdu et retrouvé dès un nouveau rendez-vous. « Absent(e) » et annulé ne comptent jamais ; un rendez-vous passé resté « confirmé » (non clôturé) compte comme tenu. Mise en œuvre : fonctions security definer doctor_has_care_link / doctor_has_care_link_for_animal (pas de récursion RLS) utilisées par les policies praticien de animals, care_items, weight_tracking, health_records et animal_documents (les policies « cabinet » séparées sont fusionnées, ce qui supprime l'accès des confrères à des rendez-vous annulés). Inchangés : policies propriétaire, partage de dossier entre praticiens (animal_referrals), et policies sur profiles — nom et coordonnées du propriétaire restent lisibles pour l'agenda même après annulation. Les données saisies par le praticien restent en base. Côté écran, « Mes patients » (useDoctorPatientAnimals) ne liste que les patients avec un lien de soin valide (src/lib/careLink.ts, miroir de la règle SQL, testé) ; les anciens rendez-vous de plus d'un an s'affichent dans l'agenda sans nom d'animal.</w:t>
       </w:r>
     </w:p>
     <w:p>

</xml_diff>

<commit_message>
Nettoyage général : README réécrit, CLAUDE.md et cahier des charges à jour (v1.54), script de diagnostic aligné sur la règle d'accès
Co-Authored-By: Claude Sonnet 5.5 <noreply@anthropic.com>
</commit_message>
<xml_diff>
--- a/cahier_des_charges_animeaux.docx
+++ b/cahier_des_charges_animeaux.docx
@@ -58,7 +58,7 @@
           <w:sz w:val="22"/>
           <w:szCs w:val="22"/>
         </w:rPr>
-        <w:t>Version 1.53 — document mis à jour avec les évolutions de juillet, août et septembre 2026 (vérification des praticiens par documents, correctif critique inscriptions, espace secrétariat en compte dédié, statut administrateur découplé du rôle, tableau de bord admin complet, domaine d'envoi Resend vérifié, carte Leaflet sur la fiche praticien avec géocodage des cabinets, domaine monanimeaux.fr connecté au site et indexé par Google, modération avancée admin, rappels de RDV par SMS, liste d'attente, rappels de vaccin proactifs, statistiques praticien, 368 tests unitaires, code-splitting par route, PWA installable, référencement de base, découpage vendor du bundle, réponse du praticien aux avis, export .ics du RDV, carnet de santé exportable, tri par prochaine disponibilité en recherche, notifications push navigateur, email + SMS de confirmation immédiate à la réservation, pages légales finalisées avec le SIRET, annulation de RDV patient corrigée, interface mobile dédiée pour l'espace patient avec recherche à deux champs et cartes animaux en bannière photo, rappel automatique pour laisser un avis après un RDV terminé, favoris praticiens, annulation de RDV côté praticien avec notification patient (in-app, email, SMS), correctif de redirection post-connexion, logo Animéaux dans tous les emails transactionnels, recherche de bugs applicative complète le 24 août 2026 : faille XSS critique corrigée sur la biographie praticien, durcissement de la sécurité au niveau colonne sur les rendez-vous/profils praticiens/messages/notifications, sécurisation des fonctions serveur d'envoi d'email-SMS-push contre les appels non autorisés, correctifs messagerie temps réel/documents de vérification/statistiques praticien/actions de modération admin, système de rappels automatiques (RDV à 24h, vaccin, avis) entièrement fiabilisé début septembre 2026 après plusieurs pannes silencieuses en cascade (vérification JWT de la plateforme, délai réseau trop court, désynchronisation de clé secrète, mauvaise colonne interrogée), erreurs de requête serveur désormais toujours visibles au lieu d'être ignorées silencieusement, adresse postale ajoutée au profil praticien, code de messagerie temps réel unifié entre l'espace patient et praticien, audit applicatif complet du 04/09/2026 : reconstruction de secours de 4 tables jamais commitées (animaux/vaccins/poids/dossiers de santé), verrouillage RLS niveau colonne étendu (avis, dossiers médicaux), durée de rendez-vous alignée sur la configuration réelle du praticien (45/60 min au lieu de 30 min fixe), garde-fou anti-doublon sur le rappel de RDV à 24h, rappel de vaccin en retard qui repart, confirmations ajoutées avant les actions destructrices du cabinet (retirer un membre, supprimer un tarif), renouvellement d'abonnement push géré, notification qui réutilise l'onglet déjà ouvert, plusieurs correctifs de fiabilité (connexion, invalidations de cache, routage administrateur), report de rendez-vous en libre-service pour le patient (au même titre que l'annulation), délai minimum d'1h avant le rendez-vous imposé au patient pour annuler ou reporter, flux calendrier abonnable (ICS) pour le praticien permettant de synchroniser tout son agenda confirmé en un clic dans Google Agenda ou Apple Calendrier, audit de sécurité complet du 05/09/2026 (8 revues croisées) : contournement RLS corrigé permettant à un patient de confirmer lui-même un RDV en attente et de le déplacer à sa guise, motif de rejet administratif d'un praticien retiré de la lecture publique, faille de remplacement de fichier de stockage entre utilisateurs corrigée, verrou ajouté empêchant un patient de forger la réponse du praticien à son propre avis, emails de confirmation/annulation/report de RDV et lien de confirmation de présence fiabilisés (requête ambiguë), échappement HTML généralisé dans les emails, correction du destinataire de l'email de report de RDV quand c'est le patient qui reporte, auto-réparation de l'abonnement aux notifications push, confirmations à deux clics harmonisées sur les annulations de RDV, messages d'erreur explicites au lieu d'échecs silencieux sur les actions de rendez-vous; puis du 22 au 25/09/2026 : notifications push enfin fonctionnelles, pipeline de déploiement automatisé (fonctions Edge, tests bloquants, Sentry), corrections de récursions RLS sur l'espace praticien, performances mobile (graphique et carte chargés à la demande, images en lazy loading), rappels de suivi généralisés (vaccin, vermifuge, bilan annuel), partage de dossier animal entre praticiens avec l'accord du propriétaire, praticiens à plusieurs métiers, page Mes animaux allégée, relance des patients inactifs, interrupteur de messagerie par praticien, visite guidée de première connexion, 552 tests unitaires, email de confirmation d'inscription refait (lien cliquable, en français), statistiques praticien enrichies, fermeture de cabinet, carte dans la recherche, retrait d'un compte secrétariat, partages terminés visibles du propriétaire, nouvelle règle d'accès praticien aux dossiers d'animaux)</w:t>
+        <w:t>Version 1.54 — document mis à jour avec les évolutions de juillet, août et septembre 2026 (vérification des praticiens par documents, correctif critique inscriptions, espace secrétariat en compte dédié, statut administrateur découplé du rôle, tableau de bord admin complet, domaine d'envoi Resend vérifié, carte Leaflet sur la fiche praticien avec géocodage des cabinets, domaine monanimeaux.fr connecté au site et indexé par Google, modération avancée admin, rappels de RDV par SMS, liste d'attente, rappels de vaccin proactifs, statistiques praticien, 368 tests unitaires, code-splitting par route, PWA installable, référencement de base, découpage vendor du bundle, réponse du praticien aux avis, export .ics du RDV, carnet de santé exportable, tri par prochaine disponibilité en recherche, notifications push navigateur, email + SMS de confirmation immédiate à la réservation, pages légales finalisées avec le SIRET, annulation de RDV patient corrigée, interface mobile dédiée pour l'espace patient avec recherche à deux champs et cartes animaux en bannière photo, rappel automatique pour laisser un avis après un RDV terminé, favoris praticiens, annulation de RDV côté praticien avec notification patient (in-app, email, SMS), correctif de redirection post-connexion, logo Animéaux dans tous les emails transactionnels, recherche de bugs applicative complète le 24 août 2026 : faille XSS critique corrigée sur la biographie praticien, durcissement de la sécurité au niveau colonne sur les rendez-vous/profils praticiens/messages/notifications, sécurisation des fonctions serveur d'envoi d'email-SMS-push contre les appels non autorisés, correctifs messagerie temps réel/documents de vérification/statistiques praticien/actions de modération admin, système de rappels automatiques (RDV à 24h, vaccin, avis) entièrement fiabilisé début septembre 2026 après plusieurs pannes silencieuses en cascade (vérification JWT de la plateforme, délai réseau trop court, désynchronisation de clé secrète, mauvaise colonne interrogée), erreurs de requête serveur désormais toujours visibles au lieu d'être ignorées silencieusement, adresse postale ajoutée au profil praticien, code de messagerie temps réel unifié entre l'espace patient et praticien, audit applicatif complet du 04/09/2026 : reconstruction de secours de 4 tables jamais commitées (animaux/vaccins/poids/dossiers de santé), verrouillage RLS niveau colonne étendu (avis, dossiers médicaux), durée de rendez-vous alignée sur la configuration réelle du praticien (45/60 min au lieu de 30 min fixe), garde-fou anti-doublon sur le rappel de RDV à 24h, rappel de vaccin en retard qui repart, confirmations ajoutées avant les actions destructrices du cabinet (retirer un membre, supprimer un tarif), renouvellement d'abonnement push géré, notification qui réutilise l'onglet déjà ouvert, plusieurs correctifs de fiabilité (connexion, invalidations de cache, routage administrateur), report de rendez-vous en libre-service pour le patient (au même titre que l'annulation), délai minimum d'1h avant le rendez-vous imposé au patient pour annuler ou reporter, flux calendrier abonnable (ICS) pour le praticien permettant de synchroniser tout son agenda confirmé en un clic dans Google Agenda ou Apple Calendrier, audit de sécurité complet du 05/09/2026 (8 revues croisées) : contournement RLS corrigé permettant à un patient de confirmer lui-même un RDV en attente et de le déplacer à sa guise, motif de rejet administratif d'un praticien retiré de la lecture publique, faille de remplacement de fichier de stockage entre utilisateurs corrigée, verrou ajouté empêchant un patient de forger la réponse du praticien à son propre avis, emails de confirmation/annulation/report de RDV et lien de confirmation de présence fiabilisés (requête ambiguë), échappement HTML généralisé dans les emails, correction du destinataire de l'email de report de RDV quand c'est le patient qui reporte, auto-réparation de l'abonnement aux notifications push, confirmations à deux clics harmonisées sur les annulations de RDV, messages d'erreur explicites au lieu d'échecs silencieux sur les actions de rendez-vous; puis du 22 au 25/09/2026 : notifications push enfin fonctionnelles, pipeline de déploiement automatisé (fonctions Edge, tests bloquants, Sentry), corrections de récursions RLS sur l'espace praticien, performances mobile (graphique et carte chargés à la demande, images en lazy loading), rappels de suivi généralisés (vaccin, vermifuge, bilan annuel), partage de dossier animal entre praticiens avec l'accord du propriétaire, praticiens à plusieurs métiers, page Mes animaux allégée, relance des patients inactifs, interrupteur de messagerie par praticien, visite guidée de première connexion, 552 tests unitaires, email de confirmation d'inscription refait (lien cliquable, en français), statistiques praticien enrichies, fermeture de cabinet, carte dans la recherche, retrait d'un compte secrétariat, partages terminés visibles du propriétaire, nouvelle règle d'accès praticien aux dossiers d'animaux)</w:t>
       </w:r>
     </w:p>
     <w:p>
@@ -1136,7 +1136,7 @@
         <w:spacing w:after="100"/>
       </w:pPr>
       <w:r>
-        <w:t>supabase/migrations/ — historique SQL versionné (110 fichiers à ce jour)</w:t>
+        <w:t>supabase/migrations/ — historique SQL versionné (116 fichiers à ce jour)</w:t>
       </w:r>
     </w:p>
     <w:p>
@@ -1287,7 +1287,7 @@
         <w:spacing w:after="160" w:line="300"/>
       </w:pPr>
       <w:r>
-        <w:t>Le schéma de base (enums, tables principales, RLS) est versionné dans supabase/migrations/001_schema.sql, complété par 109 migrations correctives et additives. Sept tables (animals, vaccines, weight_tracking, health_records, clinics, clinic_members, clinic_services) ont été créées directement depuis le tableau de bord Supabase et n'apparaissent dans aucune migration committée : leur schéma ci-dessous est donc reconstitué à partir de leur usage réel dans le code TypeScript (src/types/index.ts et src/hooks/useData.ts), pas d'un fichier SQL source. Ce point est confirmé explicitement par un commentaire de la migration 023.</w:t>
+        <w:t>Le schéma de base (enums, tables principales, RLS) est versionné dans supabase/migrations/001_schema.sql, complété par 115 migrations correctives et additives. Sept tables (animals, vaccines, weight_tracking, health_records, clinics, clinic_members, clinic_services) ont été créées directement depuis le tableau de bord Supabase et n'apparaissent dans aucune migration committée : leur schéma ci-dessous est donc reconstitué à partir de leur usage réel dans le code TypeScript (src/types/index.ts et src/hooks/useData.ts), pas d'un fichier SQL source. Ce point est confirmé explicitement par un commentaire de la migration 023.</w:t>
       </w:r>
     </w:p>
     <w:p>

</xml_diff>

<commit_message>
Audit complet : verrouille l'énumération du stockage, exige une relation pour la messagerie, répare export_my_data, ajoute les en-têtes de sécurité (migrations 117-119)
Co-Authored-By: Claude Sonnet 5.5 <noreply@anthropic.com>
</commit_message>
<xml_diff>
--- a/cahier_des_charges_animeaux.docx
+++ b/cahier_des_charges_animeaux.docx
@@ -7656,6 +7656,14 @@
       </w:pPr>
       <w:r>
         <w:t>Ajouté le 05/10/2026 — partages de dossier : le propriétaire voit désormais aussi les partages refusés ou révoqués (section « Partages terminés » de la fiche de santé), qui disparaissaient sans trace. Retrait d'un compte secrétariat (migration 115, RPC remove_clinic_secretary, réservée au créateur) : bouton « Retirer » dans la section Secrétariat de l'onglet Mon cabinet ; le compte est supprimé s'il n'appartient à aucun autre cabinet, sinon seul son lien avec ce cabinet est retiré. Textes de la visite guidée mis à jour (Statistiques : export comptable ; Cabinet : secrétariat). Tests : 544.</w:t>
+      </w:r>
+    </w:p>
+    <w:p>
+      <w:pPr>
+        <w:spacing w:after="160" w:line="300"/>
+      </w:pPr>
+      <w:r>
+        <w:t>Audit de sécurité et de cohérence du 05/10/2026 (code, migrations, Edge Functions, site en production). Trouvé et corrigé : (1) les buckets de stockage « avatars » et « documents » autorisaient n'importe quel visiteur muni de la clé publique du site à LISTER tous les fichiers (13 documents et 11 avatars énumérés en direct) — énumération fermée (migration 117, lecture limitée à ses propres fichiers ; les URLs publiques existantes continuent de fonctionner) ; (2) la messagerie n'imposait aucune relation côté base : tout utilisateur connecté pouvait écrire à tout autre, la restriction « uniquement les praticiens avec un rendez-vous » n'existant que dans l'écran — policy restrictive et fonction can_message (migration 118) ; (3) export_my_data() (droit à la portabilité) lisait encore la table vaccines renommée care_items le 23/09 : l'export échouait pour tous depuis cette date — réécrit et complété (migration 119 : suivis, partages de dossier, favoris, liste d'attente, prestations, cabinet créé) ; (4) en-têtes de sécurité HTTP absents du site (clickjacking, sniffing de type, referrer) — ajoutés dans vercel.json (X-Frame-Options, X-Content-Type-Options, Referrer-Policy, Permissions-Policy). Vérifié sans anomalie : toutes les tables ont RLS, aucune fonction security definer sans search_path (les deux signalées l'avaient reçu en migration 053), les 19 fonctions admin_* contrôlent is_admin(), le jeton du flux calendrier est régénérable, invite-clinic-secretary vérifie que l'appelant est le créateur du cabinet, l'élévation de privilèges (is_verified, note, statut de vérification) est verrouillée par triggers, aucune clé dans le dépôt, bio praticien assainie avant affichage. Points ouverts, à décider : les documents restent lisibles par quiconque possède leur URL (bucket public — les rendre privés impose des URLs signées partout) ; à vérifier côté tableau de bord Supabase : protection CAPTCHA activée dans Authentication, liste des URLs de redirection autorisées, durée de vie des sessions ; les déclencheurs d'emails d'annulation/report/liste d'attente utilisent la clé du coffre (Vault) comme la notification push avant son correctif du 22/09 — à contrôler (longueur du secret, réponses réelles) ; pas de Content-Security-Policy (risque de casser Turnstile, cartes, Sentry sans test dédié).</w:t>
       </w:r>
     </w:p>
     <w:sectPr>

</xml_diff>

<commit_message>
Notifie le praticien d'une nouvelle réservation et d'une annulation par le patient (app + push, sans email), heures de Paris dans les notifications (migration 121)
Co-Authored-By: Claude Sonnet 5.5 <noreply@anthropic.com>
</commit_message>
<xml_diff>
--- a/cahier_des_charges_animeaux.docx
+++ b/cahier_des_charges_animeaux.docx
@@ -7664,6 +7664,14 @@
       </w:pPr>
       <w:r>
         <w:t>Audit de sécurité et de cohérence du 05/10/2026 (code, migrations, Edge Functions, site en production). Trouvé et corrigé : (1) les buckets de stockage « avatars » et « documents » autorisaient n'importe quel visiteur muni de la clé publique du site à LISTER tous les fichiers (13 documents et 11 avatars énumérés en direct) — énumération fermée (migration 117, lecture limitée à ses propres fichiers ; les URLs publiques existantes continuent de fonctionner) ; (2) la messagerie n'imposait aucune relation côté base : tout utilisateur connecté pouvait écrire à tout autre, la restriction « uniquement les praticiens avec un rendez-vous » n'existant que dans l'écran — policy restrictive et fonction can_message (migration 118) ; (3) export_my_data() (droit à la portabilité) lisait encore la table vaccines renommée care_items le 23/09 : l'export échouait pour tous depuis cette date — réécrit et complété (migration 119 : suivis, partages de dossier, favoris, liste d'attente, prestations, cabinet créé) ; (4) en-têtes de sécurité HTTP absents du site (clickjacking, sniffing de type, referrer) — ajoutés dans vercel.json (X-Frame-Options, X-Content-Type-Options, Referrer-Policy, Permissions-Policy). Vérifié sans anomalie : toutes les tables ont RLS, aucune fonction security definer sans search_path (les deux signalées l'avaient reçu en migration 053), les 19 fonctions admin_* contrôlent is_admin(), le jeton du flux calendrier est régénérable, invite-clinic-secretary vérifie que l'appelant est le créateur du cabinet, l'élévation de privilèges (is_verified, note, statut de vérification) est verrouillée par triggers, aucune clé dans le dépôt, bio praticien assainie avant affichage. Points ouverts, à décider : les documents restent lisibles par quiconque possède leur URL (bucket public — les rendre privés impose des URLs signées partout) ; à vérifier côté tableau de bord Supabase : protection CAPTCHA activée dans Authentication, liste des URLs de redirection autorisées, durée de vie des sessions ; pas de Content-Security-Policy (risque de casser Turnstile, cartes, Sentry sans test dédié). Complément — emails d'annulation, de report et de liste d'attente : le contrôle a confirmé que la clé 'service_role_key' du coffre Vault fait 219 caractères (ancien format) alors que la valeur injectée dans les fonctions Edge en fait 41 : les trois fonctions send-appointment-cancellation, send-appointment-reschedule et send-waitlist-email répondaient 401 à leurs déclencheurs SQL, donc ces emails/SMS n'étaient probablement jamais envoyés (échec silencieux, même cause que le push avant le 22/09). Corrigé : les fonctions acceptent désormais le secret dédié PUSH_TRIGGER_SECRET (ou la clé service_role) et les trois déclencheurs lisent 'push_trigger_secret' dans Vault (migration 120).</w:t>
+      </w:r>
+    </w:p>
+    <w:p>
+      <w:pPr>
+        <w:spacing w:after="160" w:line="300"/>
+      </w:pPr>
+      <w:r>
+        <w:t>Ajouté le 05/10/2026 (migration 121) — notifications du praticien : jusqu'ici il n'était jamais prévenu d'une nouvelle réservation ni de l'annulation d'un rendez-vous par le patient (seul le report par le patient le notifiait) et découvrait ces changements en ouvrant son agenda. Deux nouveaux types de notification, appointment_booked et appointment_cancelled_by_patient, créés par des triggers SQL (jamais côté client) : notification dans l'application et push navigateur (le push part pour toute ligne de notifications), volontairement SANS email ni SMS (décision d'Anaïs : trop lourd) — les triggers d'email/SMS ne ciblent que d'autres types. Un clic mène à l'onglet RDV du praticien. Corrigé au passage : les textes des notifications existantes de rendez-vous (annulé/reporté par le praticien, reporté par le patient) affichaient l'heure UTC au lieu de l'heure de Paris. Rappel : une annulation faite par le patient ne notifiait pas le praticien — le test de réparation des emails (migration 120) doit se faire en faisant annuler le rendez-vous par le PRATICIEN, le patient devant alors recevoir notification et email.</w:t>
       </w:r>
     </w:p>
     <w:sectPr>

</xml_diff>

<commit_message>
Préparation à la publication : mentions légales, politique de confidentialité à jour, Google Fonts retiré, Open Graph, robots.txt
Co-Authored-By: Claude Sonnet 5.5 <noreply@anthropic.com>
</commit_message>
<xml_diff>
--- a/cahier_des_charges_animeaux.docx
+++ b/cahier_des_charges_animeaux.docx
@@ -58,7 +58,7 @@
           <w:sz w:val="22"/>
           <w:szCs w:val="22"/>
         </w:rPr>
-        <w:t>Version 1.54 — document mis à jour avec les évolutions de juillet, août et septembre 2026 (vérification des praticiens par documents, correctif critique inscriptions, espace secrétariat en compte dédié, statut administrateur découplé du rôle, tableau de bord admin complet, domaine d'envoi Resend vérifié, carte Leaflet sur la fiche praticien avec géocodage des cabinets, domaine monanimeaux.fr connecté au site et indexé par Google, modération avancée admin, rappels de RDV par SMS, liste d'attente, rappels de vaccin proactifs, statistiques praticien, 368 tests unitaires, code-splitting par route, PWA installable, référencement de base, découpage vendor du bundle, réponse du praticien aux avis, export .ics du RDV, carnet de santé exportable, tri par prochaine disponibilité en recherche, notifications push navigateur, email + SMS de confirmation immédiate à la réservation, pages légales finalisées avec le SIRET, annulation de RDV patient corrigée, interface mobile dédiée pour l'espace patient avec recherche à deux champs et cartes animaux en bannière photo, rappel automatique pour laisser un avis après un RDV terminé, favoris praticiens, annulation de RDV côté praticien avec notification patient (in-app, email, SMS), correctif de redirection post-connexion, logo Animéaux dans tous les emails transactionnels, recherche de bugs applicative complète le 24 août 2026 : faille XSS critique corrigée sur la biographie praticien, durcissement de la sécurité au niveau colonne sur les rendez-vous/profils praticiens/messages/notifications, sécurisation des fonctions serveur d'envoi d'email-SMS-push contre les appels non autorisés, correctifs messagerie temps réel/documents de vérification/statistiques praticien/actions de modération admin, système de rappels automatiques (RDV à 24h, vaccin, avis) entièrement fiabilisé début septembre 2026 après plusieurs pannes silencieuses en cascade (vérification JWT de la plateforme, délai réseau trop court, désynchronisation de clé secrète, mauvaise colonne interrogée), erreurs de requête serveur désormais toujours visibles au lieu d'être ignorées silencieusement, adresse postale ajoutée au profil praticien, code de messagerie temps réel unifié entre l'espace patient et praticien, audit applicatif complet du 04/09/2026 : reconstruction de secours de 4 tables jamais commitées (animaux/vaccins/poids/dossiers de santé), verrouillage RLS niveau colonne étendu (avis, dossiers médicaux), durée de rendez-vous alignée sur la configuration réelle du praticien (45/60 min au lieu de 30 min fixe), garde-fou anti-doublon sur le rappel de RDV à 24h, rappel de vaccin en retard qui repart, confirmations ajoutées avant les actions destructrices du cabinet (retirer un membre, supprimer un tarif), renouvellement d'abonnement push géré, notification qui réutilise l'onglet déjà ouvert, plusieurs correctifs de fiabilité (connexion, invalidations de cache, routage administrateur), report de rendez-vous en libre-service pour le patient (au même titre que l'annulation), délai minimum d'1h avant le rendez-vous imposé au patient pour annuler ou reporter, flux calendrier abonnable (ICS) pour le praticien permettant de synchroniser tout son agenda confirmé en un clic dans Google Agenda ou Apple Calendrier, audit de sécurité complet du 05/09/2026 (8 revues croisées) : contournement RLS corrigé permettant à un patient de confirmer lui-même un RDV en attente et de le déplacer à sa guise, motif de rejet administratif d'un praticien retiré de la lecture publique, faille de remplacement de fichier de stockage entre utilisateurs corrigée, verrou ajouté empêchant un patient de forger la réponse du praticien à son propre avis, emails de confirmation/annulation/report de RDV et lien de confirmation de présence fiabilisés (requête ambiguë), échappement HTML généralisé dans les emails, correction du destinataire de l'email de report de RDV quand c'est le patient qui reporte, auto-réparation de l'abonnement aux notifications push, confirmations à deux clics harmonisées sur les annulations de RDV, messages d'erreur explicites au lieu d'échecs silencieux sur les actions de rendez-vous; puis du 22 au 25/09/2026 : notifications push enfin fonctionnelles, pipeline de déploiement automatisé (fonctions Edge, tests bloquants, Sentry), corrections de récursions RLS sur l'espace praticien, performances mobile (graphique et carte chargés à la demande, images en lazy loading), rappels de suivi généralisés (vaccin, vermifuge, bilan annuel), partage de dossier animal entre praticiens avec l'accord du propriétaire, praticiens à plusieurs métiers, page Mes animaux allégée, relance des patients inactifs, interrupteur de messagerie par praticien, visite guidée de première connexion, 552 tests unitaires, email de confirmation d'inscription refait (lien cliquable, en français), statistiques praticien enrichies, fermeture de cabinet, carte dans la recherche, retrait d'un compte secrétariat, partages terminés visibles du propriétaire, nouvelle règle d'accès praticien aux dossiers d'animaux)</w:t>
+        <w:t>Version 1.54 — document mis à jour avec les évolutions de juillet, août et septembre 2026 (vérification des praticiens par documents, correctif critique inscriptions, espace secrétariat en compte dédié, statut administrateur découplé du rôle, tableau de bord admin complet, domaine d'envoi Resend vérifié, carte Leaflet sur la fiche praticien avec géocodage des cabinets, domaine monanimeaux.fr connecté au site et indexé par Google, modération avancée admin, rappels de RDV par SMS, liste d'attente, rappels de vaccin proactifs, statistiques praticien, 368 tests unitaires, code-splitting par route, PWA installable, référencement de base, découpage vendor du bundle, réponse du praticien aux avis, export .ics du RDV, carnet de santé exportable, tri par prochaine disponibilité en recherche, notifications push navigateur, email + SMS de confirmation immédiate à la réservation, pages légales finalisées avec le SIRET, annulation de RDV patient corrigée, interface mobile dédiée pour l'espace patient avec recherche à deux champs et cartes animaux en bannière photo, rappel automatique pour laisser un avis après un RDV terminé, favoris praticiens, annulation de RDV côté praticien avec notification patient (in-app, email, SMS), correctif de redirection post-connexion, logo Animéaux dans tous les emails transactionnels, recherche de bugs applicative complète le 24 août 2026 : faille XSS critique corrigée sur la biographie praticien, durcissement de la sécurité au niveau colonne sur les rendez-vous/profils praticiens/messages/notifications, sécurisation des fonctions serveur d'envoi d'email-SMS-push contre les appels non autorisés, correctifs messagerie temps réel/documents de vérification/statistiques praticien/actions de modération admin, système de rappels automatiques (RDV à 24h, vaccin, avis) entièrement fiabilisé début septembre 2026 après plusieurs pannes silencieuses en cascade (vérification JWT de la plateforme, délai réseau trop court, désynchronisation de clé secrète, mauvaise colonne interrogée), erreurs de requête serveur désormais toujours visibles au lieu d'être ignorées silencieusement, adresse postale ajoutée au profil praticien, code de messagerie temps réel unifié entre l'espace patient et praticien, audit applicatif complet du 04/09/2026 : reconstruction de secours de 4 tables jamais commitées (animaux/vaccins/poids/dossiers de santé), verrouillage RLS niveau colonne étendu (avis, dossiers médicaux), durée de rendez-vous alignée sur la configuration réelle du praticien (45/60 min au lieu de 30 min fixe), garde-fou anti-doublon sur le rappel de RDV à 24h, rappel de vaccin en retard qui repart, confirmations ajoutées avant les actions destructrices du cabinet (retirer un membre, supprimer un tarif), renouvellement d'abonnement push géré, notification qui réutilise l'onglet déjà ouvert, plusieurs correctifs de fiabilité (connexion, invalidations de cache, routage administrateur), report de rendez-vous en libre-service pour le patient (au même titre que l'annulation), délai minimum d'1h avant le rendez-vous imposé au patient pour annuler ou reporter, flux calendrier abonnable (ICS) pour le praticien permettant de synchroniser tout son agenda confirmé en un clic dans Google Agenda ou Apple Calendrier, audit de sécurité complet du 05/09/2026 (8 revues croisées) : contournement RLS corrigé permettant à un patient de confirmer lui-même un RDV en attente et de le déplacer à sa guise, motif de rejet administratif d'un praticien retiré de la lecture publique, faille de remplacement de fichier de stockage entre utilisateurs corrigée, verrou ajouté empêchant un patient de forger la réponse du praticien à son propre avis, emails de confirmation/annulation/report de RDV et lien de confirmation de présence fiabilisés (requête ambiguë), échappement HTML généralisé dans les emails, correction du destinataire de l'email de report de RDV quand c'est le patient qui reporte, auto-réparation de l'abonnement aux notifications push, confirmations à deux clics harmonisées sur les annulations de RDV, messages d'erreur explicites au lieu d'échecs silencieux sur les actions de rendez-vous; puis du 22 au 25/09/2026 : notifications push enfin fonctionnelles, pipeline de déploiement automatisé (fonctions Edge, tests bloquants, Sentry), corrections de récursions RLS sur l'espace praticien, performances mobile (graphique et carte chargés à la demande, images en lazy loading), rappels de suivi généralisés (vaccin, vermifuge, bilan annuel), partage de dossier animal entre praticiens avec l'accord du propriétaire, praticiens à plusieurs métiers, page Mes animaux allégée, relance des patients inactifs, interrupteur de messagerie par praticien, visite guidée de première connexion, 563 tests unitaires, email de confirmation d'inscription refait (lien cliquable, en français), statistiques praticien enrichies, fermeture de cabinet, carte dans la recherche, retrait d'un compte secrétariat, partages terminés visibles du propriétaire, nouvelle règle d'accès praticien aux dossiers d'animaux)</w:t>
       </w:r>
     </w:p>
     <w:p>
@@ -7672,6 +7672,14 @@
       </w:pPr>
       <w:r>
         <w:t>Ajouté le 05/10/2026 (migration 121) — notifications du praticien : jusqu'ici il n'était jamais prévenu d'une nouvelle réservation ni de l'annulation d'un rendez-vous par le patient (seul le report par le patient le notifiait) et découvrait ces changements en ouvrant son agenda. Deux nouveaux types de notification, appointment_booked et appointment_cancelled_by_patient, créés par des triggers SQL (jamais côté client) : notification dans l'application et push navigateur (le push part pour toute ligne de notifications), volontairement SANS email ni SMS (décision d'Anaïs : trop lourd) — les triggers d'email/SMS ne ciblent que d'autres types. Un clic mène à l'onglet RDV du praticien. Corrigé au passage : les textes des notifications existantes de rendez-vous (annulé/reporté par le praticien, reporté par le patient) affichaient l'heure UTC au lieu de l'heure de Paris. Rappel : une annulation faite par le patient ne notifiait pas le praticien — le test de réparation des emails (migration 120) doit se faire en faisant annuler le rendez-vous par le PRATICIEN, le patient devant alors recevoir notification et email.</w:t>
+      </w:r>
+    </w:p>
+    <w:p>
+      <w:pPr>
+        <w:spacing w:after="160" w:line="300"/>
+      </w:pPr>
+      <w:r>
+        <w:t>Préparation à la publication — 05/10/2026. (1) Documents (ordonnances, comptes rendus) : lecture par liens signés d'1 h (hook useSignedDocumentUrls, src/lib/storageUrls.ts) au lieu d'URLs publiques ; migration 122 (policy de lecture : déposant, ou toute personne qui peut voir la ligne animal_documents / appointment_documents correspondante, donc règles du lien de soin incluses) puis migration 123 (bucket « documents » passé en privé, à lancer seulement après vérification ; retour arrière : update storage.buckets set public = true where id = 'documents'). Repli : tant que le lien signé n'est pas prêt, l'URL d'origine est utilisée, ce qui garde l'affichage fonctionnel pendant la transition. (2) Pages légales : ajout des Mentions légales (/mentions-legales, éditeur, directrice de publication, hébergeurs, lien dans le pied de page et le sitemap) ; politique de confidentialité corrigée pour refléter la réalité — sous-traitants complétés (OVH SMS, Cloudflare Turnstile, Sentry, CARTO/OpenStreetMap, API Adresse), règle d'accès aux dossiers (rendez-vous maintenu de moins d'un an), cookies et traceurs ; date de mise à jour 05/10/2026. Le bandeau « en attente de relecture par un professionnel du droit » est conservé : à retirer après relecture. (3) Vie privée : suppression du chargement de Google Fonts dans index.html (la police Inter n'était plus utilisée, et chaque visiteur envoyait son adresse IP à Google alors que les autres polices sont auto-hébergées). (4) Partage et référencement : balises Open Graph et Twitter, lien canonique, image de partage 1200×630 (public/og-image.png), robots.txt excluant les espaces connectés. Avant ouverture publique, hors code : passer Supabase et Vercel en offre payante (le plan gratuit de Supabase met le projet en pause après une semaine d'inactivité et n'offre pas de sauvegardes ; l'offre gratuite de Vercel exclut l'usage commercial), purger les comptes de test, activer la protection CAPTCHA et vérifier les URLs de redirection dans Supabase Auth, faire relire les pages légales.</w:t>
       </w:r>
     </w:p>
     <w:sectPr>

</xml_diff>

<commit_message>
Nettoyage des fichiers de stockage : suppression avec la ligne, purge hebdomadaire des orphelins, checklist de lancement (migrations 124-125)
Co-Authored-By: Claude Sonnet 5.5 <noreply@anthropic.com>
</commit_message>
<xml_diff>
--- a/cahier_des_charges_animeaux.docx
+++ b/cahier_des_charges_animeaux.docx
@@ -58,7 +58,7 @@
           <w:sz w:val="22"/>
           <w:szCs w:val="22"/>
         </w:rPr>
-        <w:t>Version 1.54 — document mis à jour avec les évolutions de juillet, août et septembre 2026 (vérification des praticiens par documents, correctif critique inscriptions, espace secrétariat en compte dédié, statut administrateur découplé du rôle, tableau de bord admin complet, domaine d'envoi Resend vérifié, carte Leaflet sur la fiche praticien avec géocodage des cabinets, domaine monanimeaux.fr connecté au site et indexé par Google, modération avancée admin, rappels de RDV par SMS, liste d'attente, rappels de vaccin proactifs, statistiques praticien, 368 tests unitaires, code-splitting par route, PWA installable, référencement de base, découpage vendor du bundle, réponse du praticien aux avis, export .ics du RDV, carnet de santé exportable, tri par prochaine disponibilité en recherche, notifications push navigateur, email + SMS de confirmation immédiate à la réservation, pages légales finalisées avec le SIRET, annulation de RDV patient corrigée, interface mobile dédiée pour l'espace patient avec recherche à deux champs et cartes animaux en bannière photo, rappel automatique pour laisser un avis après un RDV terminé, favoris praticiens, annulation de RDV côté praticien avec notification patient (in-app, email, SMS), correctif de redirection post-connexion, logo Animéaux dans tous les emails transactionnels, recherche de bugs applicative complète le 24 août 2026 : faille XSS critique corrigée sur la biographie praticien, durcissement de la sécurité au niveau colonne sur les rendez-vous/profils praticiens/messages/notifications, sécurisation des fonctions serveur d'envoi d'email-SMS-push contre les appels non autorisés, correctifs messagerie temps réel/documents de vérification/statistiques praticien/actions de modération admin, système de rappels automatiques (RDV à 24h, vaccin, avis) entièrement fiabilisé début septembre 2026 après plusieurs pannes silencieuses en cascade (vérification JWT de la plateforme, délai réseau trop court, désynchronisation de clé secrète, mauvaise colonne interrogée), erreurs de requête serveur désormais toujours visibles au lieu d'être ignorées silencieusement, adresse postale ajoutée au profil praticien, code de messagerie temps réel unifié entre l'espace patient et praticien, audit applicatif complet du 04/09/2026 : reconstruction de secours de 4 tables jamais commitées (animaux/vaccins/poids/dossiers de santé), verrouillage RLS niveau colonne étendu (avis, dossiers médicaux), durée de rendez-vous alignée sur la configuration réelle du praticien (45/60 min au lieu de 30 min fixe), garde-fou anti-doublon sur le rappel de RDV à 24h, rappel de vaccin en retard qui repart, confirmations ajoutées avant les actions destructrices du cabinet (retirer un membre, supprimer un tarif), renouvellement d'abonnement push géré, notification qui réutilise l'onglet déjà ouvert, plusieurs correctifs de fiabilité (connexion, invalidations de cache, routage administrateur), report de rendez-vous en libre-service pour le patient (au même titre que l'annulation), délai minimum d'1h avant le rendez-vous imposé au patient pour annuler ou reporter, flux calendrier abonnable (ICS) pour le praticien permettant de synchroniser tout son agenda confirmé en un clic dans Google Agenda ou Apple Calendrier, audit de sécurité complet du 05/09/2026 (8 revues croisées) : contournement RLS corrigé permettant à un patient de confirmer lui-même un RDV en attente et de le déplacer à sa guise, motif de rejet administratif d'un praticien retiré de la lecture publique, faille de remplacement de fichier de stockage entre utilisateurs corrigée, verrou ajouté empêchant un patient de forger la réponse du praticien à son propre avis, emails de confirmation/annulation/report de RDV et lien de confirmation de présence fiabilisés (requête ambiguë), échappement HTML généralisé dans les emails, correction du destinataire de l'email de report de RDV quand c'est le patient qui reporte, auto-réparation de l'abonnement aux notifications push, confirmations à deux clics harmonisées sur les annulations de RDV, messages d'erreur explicites au lieu d'échecs silencieux sur les actions de rendez-vous; puis du 22 au 25/09/2026 : notifications push enfin fonctionnelles, pipeline de déploiement automatisé (fonctions Edge, tests bloquants, Sentry), corrections de récursions RLS sur l'espace praticien, performances mobile (graphique et carte chargés à la demande, images en lazy loading), rappels de suivi généralisés (vaccin, vermifuge, bilan annuel), partage de dossier animal entre praticiens avec l'accord du propriétaire, praticiens à plusieurs métiers, page Mes animaux allégée, relance des patients inactifs, interrupteur de messagerie par praticien, visite guidée de première connexion, 563 tests unitaires, email de confirmation d'inscription refait (lien cliquable, en français), statistiques praticien enrichies, fermeture de cabinet, carte dans la recherche, retrait d'un compte secrétariat, partages terminés visibles du propriétaire, nouvelle règle d'accès praticien aux dossiers d'animaux)</w:t>
+        <w:t>Version 1.54 — document mis à jour avec les évolutions de juillet, août et septembre 2026 (vérification des praticiens par documents, correctif critique inscriptions, espace secrétariat en compte dédié, statut administrateur découplé du rôle, tableau de bord admin complet, domaine d'envoi Resend vérifié, carte Leaflet sur la fiche praticien avec géocodage des cabinets, domaine monanimeaux.fr connecté au site et indexé par Google, modération avancée admin, rappels de RDV par SMS, liste d'attente, rappels de vaccin proactifs, statistiques praticien, 368 tests unitaires, code-splitting par route, PWA installable, référencement de base, découpage vendor du bundle, réponse du praticien aux avis, export .ics du RDV, carnet de santé exportable, tri par prochaine disponibilité en recherche, notifications push navigateur, email + SMS de confirmation immédiate à la réservation, pages légales finalisées avec le SIRET, annulation de RDV patient corrigée, interface mobile dédiée pour l'espace patient avec recherche à deux champs et cartes animaux en bannière photo, rappel automatique pour laisser un avis après un RDV terminé, favoris praticiens, annulation de RDV côté praticien avec notification patient (in-app, email, SMS), correctif de redirection post-connexion, logo Animéaux dans tous les emails transactionnels, recherche de bugs applicative complète le 24 août 2026 : faille XSS critique corrigée sur la biographie praticien, durcissement de la sécurité au niveau colonne sur les rendez-vous/profils praticiens/messages/notifications, sécurisation des fonctions serveur d'envoi d'email-SMS-push contre les appels non autorisés, correctifs messagerie temps réel/documents de vérification/statistiques praticien/actions de modération admin, système de rappels automatiques (RDV à 24h, vaccin, avis) entièrement fiabilisé début septembre 2026 après plusieurs pannes silencieuses en cascade (vérification JWT de la plateforme, délai réseau trop court, désynchronisation de clé secrète, mauvaise colonne interrogée), erreurs de requête serveur désormais toujours visibles au lieu d'être ignorées silencieusement, adresse postale ajoutée au profil praticien, code de messagerie temps réel unifié entre l'espace patient et praticien, audit applicatif complet du 04/09/2026 : reconstruction de secours de 4 tables jamais commitées (animaux/vaccins/poids/dossiers de santé), verrouillage RLS niveau colonne étendu (avis, dossiers médicaux), durée de rendez-vous alignée sur la configuration réelle du praticien (45/60 min au lieu de 30 min fixe), garde-fou anti-doublon sur le rappel de RDV à 24h, rappel de vaccin en retard qui repart, confirmations ajoutées avant les actions destructrices du cabinet (retirer un membre, supprimer un tarif), renouvellement d'abonnement push géré, notification qui réutilise l'onglet déjà ouvert, plusieurs correctifs de fiabilité (connexion, invalidations de cache, routage administrateur), report de rendez-vous en libre-service pour le patient (au même titre que l'annulation), délai minimum d'1h avant le rendez-vous imposé au patient pour annuler ou reporter, flux calendrier abonnable (ICS) pour le praticien permettant de synchroniser tout son agenda confirmé en un clic dans Google Agenda ou Apple Calendrier, audit de sécurité complet du 05/09/2026 (8 revues croisées) : contournement RLS corrigé permettant à un patient de confirmer lui-même un RDV en attente et de le déplacer à sa guise, motif de rejet administratif d'un praticien retiré de la lecture publique, faille de remplacement de fichier de stockage entre utilisateurs corrigée, verrou ajouté empêchant un patient de forger la réponse du praticien à son propre avis, emails de confirmation/annulation/report de RDV et lien de confirmation de présence fiabilisés (requête ambiguë), échappement HTML généralisé dans les emails, correction du destinataire de l'email de report de RDV quand c'est le patient qui reporte, auto-réparation de l'abonnement aux notifications push, confirmations à deux clics harmonisées sur les annulations de RDV, messages d'erreur explicites au lieu d'échecs silencieux sur les actions de rendez-vous; puis du 22 au 25/09/2026 : notifications push enfin fonctionnelles, pipeline de déploiement automatisé (fonctions Edge, tests bloquants, Sentry), corrections de récursions RLS sur l'espace praticien, performances mobile (graphique et carte chargés à la demande, images en lazy loading), rappels de suivi généralisés (vaccin, vermifuge, bilan annuel), partage de dossier animal entre praticiens avec l'accord du propriétaire, praticiens à plusieurs métiers, page Mes animaux allégée, relance des patients inactifs, interrupteur de messagerie par praticien, visite guidée de première connexion, 572 tests unitaires, email de confirmation d'inscription refait (lien cliquable, en français), statistiques praticien enrichies, fermeture de cabinet, carte dans la recherche, retrait d'un compte secrétariat, partages terminés visibles du propriétaire, nouvelle règle d'accès praticien aux dossiers d'animaux)</w:t>
       </w:r>
     </w:p>
     <w:p>
@@ -7680,6 +7680,14 @@
       </w:pPr>
       <w:r>
         <w:t>Préparation à la publication — 05/10/2026. (1) Documents (ordonnances, comptes rendus) : lecture par liens signés d'1 h (hook useSignedDocumentUrls, src/lib/storageUrls.ts) au lieu d'URLs publiques ; migration 122 (policy de lecture : déposant, ou toute personne qui peut voir la ligne animal_documents / appointment_documents correspondante, donc règles du lien de soin incluses) puis migration 123 (bucket « documents » passé en privé, à lancer seulement après vérification ; retour arrière : update storage.buckets set public = true where id = 'documents'). Repli : tant que le lien signé n'est pas prêt, l'URL d'origine est utilisée, ce qui garde l'affichage fonctionnel pendant la transition. (2) Pages légales : ajout des Mentions légales (/mentions-legales, éditeur, directrice de publication, hébergeurs, lien dans le pied de page et le sitemap) ; politique de confidentialité corrigée pour refléter la réalité — sous-traitants complétés (OVH SMS, Cloudflare Turnstile, Sentry, CARTO/OpenStreetMap, API Adresse), règle d'accès aux dossiers (rendez-vous maintenu de moins d'un an), cookies et traceurs ; date de mise à jour 05/10/2026. Le bandeau « en attente de relecture par un professionnel du droit » est conservé : à retirer après relecture. (3) Vie privée : suppression du chargement de Google Fonts dans index.html (la police Inter n'était plus utilisée, et chaque visiteur envoyait son adresse IP à Google alors que les autres polices sont auto-hébergées). (4) Partage et référencement : balises Open Graph et Twitter, lien canonique, image de partage 1200×630 (public/og-image.png), robots.txt excluant les espaces connectés. Avant ouverture publique, hors code : passer Supabase et Vercel en offre payante (le plan gratuit de Supabase met le projet en pause après une semaine d'inactivité et n'offre pas de sauvegardes ; l'offre gratuite de Vercel exclut l'usage commercial), purger les comptes de test, activer la protection CAPTCHA et vérifier les URLs de redirection dans Supabase Auth, faire relire les pages légales.</w:t>
+      </w:r>
+    </w:p>
+    <w:p>
+      <w:pPr>
+        <w:spacing w:after="160" w:line="300"/>
+      </w:pPr>
+      <w:r>
+        <w:t>Ajouté le 06/10/2026 — fichiers de stockage : constat que supprimer un document, une photo ou un compte ne supprimait que la ligne en base, jamais le fichier réel (24 fichiers orphelins accumulés pendant les tests, dont des justificatifs d'identité de praticiens supprimés — enjeu RGPD). Corrigé à trois niveaux : (1) l'application supprime désormais le fichier avec sa ligne (document supprimé, animal supprimé avec sa photo et ses documents, photo de profil/animal/logo de cabinet remplacée) via removeStoredFiles (src/lib/storageCleanup.ts, « au mieux » : n'échoue jamais), avec la migration 124 qui ajoute la policy DELETE manquante sur le bucket avatars ; (2) l'Edge Function purge-orphan-files supprime chaque dimanche les fichiers que plus rien ne référence, avec garde-fous (jamais un fichier de moins de 24 h car un document de réservation est téléversé avant sa ligne en base, arrêt si plus de la moitié d'un dossier semble orphelin, 200 suppressions maximum, mode simulation ?dry_run=1), planifiée par la migration 125 (secret relu dans Vault, rien en clair) ; (3) les 24 orphelins existants ont été supprimés à la main via l'API Storage. Un delete SQL sur storage.objects ne supprime pas le fichier réel : toujours passer par l'API. Documents de lancement : LANCEMENT.md (abonnements, réglages Supabase Auth, surveillance, juridique, données de test, scénario de test complet).</w:t>
       </w:r>
     </w:p>
     <w:sectPr>

</xml_diff>

<commit_message>
Docs : compteurs de migrations (125)
Co-Authored-By: Claude Sonnet 5.5 <noreply@anthropic.com>
</commit_message>
<xml_diff>
--- a/cahier_des_charges_animeaux.docx
+++ b/cahier_des_charges_animeaux.docx
@@ -1136,7 +1136,7 @@
         <w:spacing w:after="100"/>
       </w:pPr>
       <w:r>
-        <w:t>supabase/migrations/ — historique SQL versionné (116 fichiers à ce jour)</w:t>
+        <w:t>supabase/migrations/ — historique SQL versionné (125 fichiers à ce jour)</w:t>
       </w:r>
     </w:p>
     <w:p>
@@ -1287,7 +1287,7 @@
         <w:spacing w:after="160" w:line="300"/>
       </w:pPr>
       <w:r>
-        <w:t>Le schéma de base (enums, tables principales, RLS) est versionné dans supabase/migrations/001_schema.sql, complété par 115 migrations correctives et additives. Sept tables (animals, vaccines, weight_tracking, health_records, clinics, clinic_members, clinic_services) ont été créées directement depuis le tableau de bord Supabase et n'apparaissent dans aucune migration committée : leur schéma ci-dessous est donc reconstitué à partir de leur usage réel dans le code TypeScript (src/types/index.ts et src/hooks/useData.ts), pas d'un fichier SQL source. Ce point est confirmé explicitement par un commentaire de la migration 023.</w:t>
+        <w:t>Le schéma de base (enums, tables principales, RLS) est versionné dans supabase/migrations/001_schema.sql, complété par 124 migrations correctives et additives. Sept tables (animals, vaccines, weight_tracking, health_records, clinics, clinic_members, clinic_services) ont été créées directement depuis le tableau de bord Supabase et n'apparaissent dans aucune migration committée : leur schéma ci-dessous est donc reconstitué à partir de leur usage réel dans le code TypeScript (src/types/index.ts et src/hooks/useData.ts), pas d'un fichier SQL source. Ce point est confirmé explicitement par un commentaire de la migration 023.</w:t>
       </w:r>
     </w:p>
     <w:p>

</xml_diff>

<commit_message>
Bouton « Renvoyer l'email de confirmation » sur la page de connexion (avec captcha), classement des erreurs d'auth testé
Co-Authored-By: Claude Sonnet 5.5 <noreply@anthropic.com>
</commit_message>
<xml_diff>
--- a/cahier_des_charges_animeaux.docx
+++ b/cahier_des_charges_animeaux.docx
@@ -7688,6 +7688,14 @@
       </w:pPr>
       <w:r>
         <w:t>Ajouté le 06/10/2026 — fichiers de stockage : constat que supprimer un document, une photo ou un compte ne supprimait que la ligne en base, jamais le fichier réel (24 fichiers orphelins accumulés pendant les tests, dont des justificatifs d'identité de praticiens supprimés — enjeu RGPD). Corrigé à trois niveaux : (1) l'application supprime désormais le fichier avec sa ligne (document supprimé, animal supprimé avec sa photo et ses documents, photo de profil/animal/logo de cabinet remplacée) via removeStoredFiles (src/lib/storageCleanup.ts, « au mieux » : n'échoue jamais), avec la migration 124 qui ajoute la policy DELETE manquante sur le bucket avatars ; (2) l'Edge Function purge-orphan-files supprime chaque dimanche les fichiers que plus rien ne référence, avec garde-fous (jamais un fichier de moins de 24 h car un document de réservation est téléversé avant sa ligne en base, arrêt si plus de la moitié d'un dossier semble orphelin, 200 suppressions maximum, mode simulation ?dry_run=1), planifiée par la migration 125 (secret relu dans Vault, rien en clair) ; (3) les 24 orphelins existants ont été supprimés à la main via l'API Storage. Un delete SQL sur storage.objects ne supprime pas le fichier réel : toujours passer par l'API. Documents de lancement : LANCEMENT.md (abonnements, réglages Supabase Auth, surveillance, juridique, données de test, scénario de test complet).</w:t>
+      </w:r>
+    </w:p>
+    <w:p>
+      <w:pPr>
+        <w:spacing w:after="160" w:line="300"/>
+      </w:pPr>
+      <w:r>
+        <w:t>Ajouté le 07/10/2026 — renvoi de l'email de confirmation : un compte non confirmé qui tente de se connecter voit désormais un bouton « Renvoyer l'email de confirmation » (LoginPage), qui appelle supabase.auth.resend avec un jeton Turnstile frais (la protection CAPTCHA de Supabase Auth, activée, s'applique aussi à resend ; jeton à usage unique donc le widget est réinitialisé après chaque tentative) ; messages dédiés pour captcha expiré et limite de débit ; l'écran de succès d'inscription indique la marche à suivre. Raison : un lien de confirmation expire et l'application n'offrait aucun moyen d'en redemander un, l'utilisateur restait bloqué — ce qui avait conduit à porter la durée de validité des liens à 24 h (alerte « OTP expiry exceeds recommended threshold » dans Supabase), à ramener à 1 h une fois ce bouton en production. Classement des erreurs d'authentification extrait dans src/lib/authErrors.ts (testé) ; premier test de page pour LoginPage. Réglages Supabase Auth relevés ce jour : CAPTCHA Turnstile activé, Site URL corrigée vers https://monanimeaux.fr (elle pointait vers l'ancien domaine vercel.app, vers lequel renvoyaient les liens de confirmation), seule redirection autorisée https://monanimeaux.fr/**, mot de passe minimum 8, changement de mot de passe sécurisé activé, confirmation d'email activée ; l'invitation secrétariat renvoie aussi vers le bon domaine.</w:t>
       </w:r>
     </w:p>
     <w:sectPr>

</xml_diff>

<commit_message>
Rechargement automatique (une fois) quand un fichier chargé à la demande a disparu après une mise en ligne
Relevé dans Sentry : 'Failed to fetch dynamically imported module' et
'text/html is not a valid JavaScript MIME type'.

Co-Authored-By: Claude Sonnet 5.5 <noreply@anthropic.com>
</commit_message>
<xml_diff>
--- a/cahier_des_charges_animeaux.docx
+++ b/cahier_des_charges_animeaux.docx
@@ -58,7 +58,7 @@
           <w:sz w:val="22"/>
           <w:szCs w:val="22"/>
         </w:rPr>
-        <w:t>Version 1.54 — document mis à jour avec les évolutions de juillet, août et septembre 2026 (vérification des praticiens par documents, correctif critique inscriptions, espace secrétariat en compte dédié, statut administrateur découplé du rôle, tableau de bord admin complet, domaine d'envoi Resend vérifié, carte Leaflet sur la fiche praticien avec géocodage des cabinets, domaine monanimeaux.fr connecté au site et indexé par Google, modération avancée admin, rappels de RDV par SMS, liste d'attente, rappels de vaccin proactifs, statistiques praticien, 368 tests unitaires, code-splitting par route, PWA installable, référencement de base, découpage vendor du bundle, réponse du praticien aux avis, export .ics du RDV, carnet de santé exportable, tri par prochaine disponibilité en recherche, notifications push navigateur, email + SMS de confirmation immédiate à la réservation, pages légales finalisées avec le SIRET, annulation de RDV patient corrigée, interface mobile dédiée pour l'espace patient avec recherche à deux champs et cartes animaux en bannière photo, rappel automatique pour laisser un avis après un RDV terminé, favoris praticiens, annulation de RDV côté praticien avec notification patient (in-app, email, SMS), correctif de redirection post-connexion, logo Animéaux dans tous les emails transactionnels, recherche de bugs applicative complète le 24 août 2026 : faille XSS critique corrigée sur la biographie praticien, durcissement de la sécurité au niveau colonne sur les rendez-vous/profils praticiens/messages/notifications, sécurisation des fonctions serveur d'envoi d'email-SMS-push contre les appels non autorisés, correctifs messagerie temps réel/documents de vérification/statistiques praticien/actions de modération admin, système de rappels automatiques (RDV à 24h, vaccin, avis) entièrement fiabilisé début septembre 2026 après plusieurs pannes silencieuses en cascade (vérification JWT de la plateforme, délai réseau trop court, désynchronisation de clé secrète, mauvaise colonne interrogée), erreurs de requête serveur désormais toujours visibles au lieu d'être ignorées silencieusement, adresse postale ajoutée au profil praticien, code de messagerie temps réel unifié entre l'espace patient et praticien, audit applicatif complet du 04/09/2026 : reconstruction de secours de 4 tables jamais commitées (animaux/vaccins/poids/dossiers de santé), verrouillage RLS niveau colonne étendu (avis, dossiers médicaux), durée de rendez-vous alignée sur la configuration réelle du praticien (45/60 min au lieu de 30 min fixe), garde-fou anti-doublon sur le rappel de RDV à 24h, rappel de vaccin en retard qui repart, confirmations ajoutées avant les actions destructrices du cabinet (retirer un membre, supprimer un tarif), renouvellement d'abonnement push géré, notification qui réutilise l'onglet déjà ouvert, plusieurs correctifs de fiabilité (connexion, invalidations de cache, routage administrateur), report de rendez-vous en libre-service pour le patient (au même titre que l'annulation), délai minimum d'1h avant le rendez-vous imposé au patient pour annuler ou reporter, flux calendrier abonnable (ICS) pour le praticien permettant de synchroniser tout son agenda confirmé en un clic dans Google Agenda ou Apple Calendrier, audit de sécurité complet du 05/09/2026 (8 revues croisées) : contournement RLS corrigé permettant à un patient de confirmer lui-même un RDV en attente et de le déplacer à sa guise, motif de rejet administratif d'un praticien retiré de la lecture publique, faille de remplacement de fichier de stockage entre utilisateurs corrigée, verrou ajouté empêchant un patient de forger la réponse du praticien à son propre avis, emails de confirmation/annulation/report de RDV et lien de confirmation de présence fiabilisés (requête ambiguë), échappement HTML généralisé dans les emails, correction du destinataire de l'email de report de RDV quand c'est le patient qui reporte, auto-réparation de l'abonnement aux notifications push, confirmations à deux clics harmonisées sur les annulations de RDV, messages d'erreur explicites au lieu d'échecs silencieux sur les actions de rendez-vous; puis du 22 au 25/09/2026 : notifications push enfin fonctionnelles, pipeline de déploiement automatisé (fonctions Edge, tests bloquants, Sentry), corrections de récursions RLS sur l'espace praticien, performances mobile (graphique et carte chargés à la demande, images en lazy loading), rappels de suivi généralisés (vaccin, vermifuge, bilan annuel), partage de dossier animal entre praticiens avec l'accord du propriétaire, praticiens à plusieurs métiers, page Mes animaux allégée, relance des patients inactifs, interrupteur de messagerie par praticien, visite guidée de première connexion, 572 tests unitaires, email de confirmation d'inscription refait (lien cliquable, en français), statistiques praticien enrichies, fermeture de cabinet, carte dans la recherche, retrait d'un compte secrétariat, partages terminés visibles du propriétaire, nouvelle règle d'accès praticien aux dossiers d'animaux)</w:t>
+        <w:t>Version 1.54 — document mis à jour avec les évolutions de juillet, août et septembre 2026 (vérification des praticiens par documents, correctif critique inscriptions, espace secrétariat en compte dédié, statut administrateur découplé du rôle, tableau de bord admin complet, domaine d'envoi Resend vérifié, carte Leaflet sur la fiche praticien avec géocodage des cabinets, domaine monanimeaux.fr connecté au site et indexé par Google, modération avancée admin, rappels de RDV par SMS, liste d'attente, rappels de vaccin proactifs, statistiques praticien, 368 tests unitaires, code-splitting par route, PWA installable, référencement de base, découpage vendor du bundle, réponse du praticien aux avis, export .ics du RDV, carnet de santé exportable, tri par prochaine disponibilité en recherche, notifications push navigateur, email + SMS de confirmation immédiate à la réservation, pages légales finalisées avec le SIRET, annulation de RDV patient corrigée, interface mobile dédiée pour l'espace patient avec recherche à deux champs et cartes animaux en bannière photo, rappel automatique pour laisser un avis après un RDV terminé, favoris praticiens, annulation de RDV côté praticien avec notification patient (in-app, email, SMS), correctif de redirection post-connexion, logo Animéaux dans tous les emails transactionnels, recherche de bugs applicative complète le 24 août 2026 : faille XSS critique corrigée sur la biographie praticien, durcissement de la sécurité au niveau colonne sur les rendez-vous/profils praticiens/messages/notifications, sécurisation des fonctions serveur d'envoi d'email-SMS-push contre les appels non autorisés, correctifs messagerie temps réel/documents de vérification/statistiques praticien/actions de modération admin, système de rappels automatiques (RDV à 24h, vaccin, avis) entièrement fiabilisé début septembre 2026 après plusieurs pannes silencieuses en cascade (vérification JWT de la plateforme, délai réseau trop court, désynchronisation de clé secrète, mauvaise colonne interrogée), erreurs de requête serveur désormais toujours visibles au lieu d'être ignorées silencieusement, adresse postale ajoutée au profil praticien, code de messagerie temps réel unifié entre l'espace patient et praticien, audit applicatif complet du 04/09/2026 : reconstruction de secours de 4 tables jamais commitées (animaux/vaccins/poids/dossiers de santé), verrouillage RLS niveau colonne étendu (avis, dossiers médicaux), durée de rendez-vous alignée sur la configuration réelle du praticien (45/60 min au lieu de 30 min fixe), garde-fou anti-doublon sur le rappel de RDV à 24h, rappel de vaccin en retard qui repart, confirmations ajoutées avant les actions destructrices du cabinet (retirer un membre, supprimer un tarif), renouvellement d'abonnement push géré, notification qui réutilise l'onglet déjà ouvert, plusieurs correctifs de fiabilité (connexion, invalidations de cache, routage administrateur), report de rendez-vous en libre-service pour le patient (au même titre que l'annulation), délai minimum d'1h avant le rendez-vous imposé au patient pour annuler ou reporter, flux calendrier abonnable (ICS) pour le praticien permettant de synchroniser tout son agenda confirmé en un clic dans Google Agenda ou Apple Calendrier, audit de sécurité complet du 05/09/2026 (8 revues croisées) : contournement RLS corrigé permettant à un patient de confirmer lui-même un RDV en attente et de le déplacer à sa guise, motif de rejet administratif d'un praticien retiré de la lecture publique, faille de remplacement de fichier de stockage entre utilisateurs corrigée, verrou ajouté empêchant un patient de forger la réponse du praticien à son propre avis, emails de confirmation/annulation/report de RDV et lien de confirmation de présence fiabilisés (requête ambiguë), échappement HTML généralisé dans les emails, correction du destinataire de l'email de report de RDV quand c'est le patient qui reporte, auto-réparation de l'abonnement aux notifications push, confirmations à deux clics harmonisées sur les annulations de RDV, messages d'erreur explicites au lieu d'échecs silencieux sur les actions de rendez-vous; puis du 22 au 25/09/2026 : notifications push enfin fonctionnelles, pipeline de déploiement automatisé (fonctions Edge, tests bloquants, Sentry), corrections de récursions RLS sur l'espace praticien, performances mobile (graphique et carte chargés à la demande, images en lazy loading), rappels de suivi généralisés (vaccin, vermifuge, bilan annuel), partage de dossier animal entre praticiens avec l'accord du propriétaire, praticiens à plusieurs métiers, page Mes animaux allégée, relance des patients inactifs, interrupteur de messagerie par praticien, visite guidée de première connexion, 585 tests unitaires, email de confirmation d'inscription refait (lien cliquable, en français), statistiques praticien enrichies, fermeture de cabinet, carte dans la recherche, retrait d'un compte secrétariat, partages terminés visibles du propriétaire, nouvelle règle d'accès praticien aux dossiers d'animaux)</w:t>
       </w:r>
     </w:p>
     <w:p>
@@ -7696,6 +7696,14 @@
       </w:pPr>
       <w:r>
         <w:t>Ajouté le 07/10/2026 — renvoi de l'email de confirmation : un compte non confirmé qui tente de se connecter voit désormais un bouton « Renvoyer l'email de confirmation » (LoginPage), qui appelle supabase.auth.resend avec un jeton Turnstile frais (la protection CAPTCHA de Supabase Auth, activée, s'applique aussi à resend ; jeton à usage unique donc le widget est réinitialisé après chaque tentative) ; messages dédiés pour captcha expiré et limite de débit ; l'écran de succès d'inscription indique la marche à suivre. Raison : un lien de confirmation expire et l'application n'offrait aucun moyen d'en redemander un, l'utilisateur restait bloqué — ce qui avait conduit à porter la durée de validité des liens à 24 h (alerte « OTP expiry exceeds recommended threshold » dans Supabase), à ramener à 1 h une fois ce bouton en production. Classement des erreurs d'authentification extrait dans src/lib/authErrors.ts (testé) ; premier test de page pour LoginPage. Réglages Supabase Auth relevés ce jour : CAPTCHA Turnstile activé, Site URL corrigée vers https://monanimeaux.fr (elle pointait vers l'ancien domaine vercel.app, vers lequel renvoyaient les liens de confirmation), seule redirection autorisée https://monanimeaux.fr/**, mot de passe minimum 8, changement de mot de passe sécurisé activé, confirmation d'email activée ; l'invitation secrétariat renvoie aussi vers le bon domaine.</w:t>
+      </w:r>
+    </w:p>
+    <w:p>
+      <w:pPr>
+        <w:spacing w:after="160" w:line="300"/>
+      </w:pPr>
+      <w:r>
+        <w:t>Ajouté le 07/10/2026 — rechargement automatique après une mise en ligne : Sentry (premier relevé réel) montrait des erreurs « Failed to fetch dynamically imported module » et « 'text/html' is not a valid JavaScript MIME type » — un utilisateur qui avait ouvert l'application avant une mise en ligne cherche un fichier à empreinte (ex. DoctorDashboard-xxxx.js) qui n'existe plus et reçoit la page d'accueil à la place. src/lib/chunkReload.ts écoute l'événement vite:preloadError et recharge la page UNE fois (garde-fou d'une minute stocké en sessionStorage contre une boucle), installé dans main.tsx ; testé. Autre erreur relevée, à surveiller : TurnstileError 600010 (widget de captcha, 6 occurrences en 2 mois, 0 utilisateur identifié), typiquement un navigateur qui bloque le script Cloudflare.</w:t>
       </w:r>
     </w:p>
     <w:sectPr>

</xml_diff>

<commit_message>
Pré-lancement praticiens : choix de formule sans paiement, réglages admin, compteurs et export, paiements bloqués côté serveur
Co-Authored-By: Claude Sonnet 5.5 <noreply@anthropic.com>
</commit_message>
<xml_diff>
--- a/cahier_des_charges_animeaux.docx
+++ b/cahier_des_charges_animeaux.docx
@@ -58,7 +58,7 @@
           <w:sz w:val="22"/>
           <w:szCs w:val="22"/>
         </w:rPr>
-        <w:t>Version 1.59 — document mis à jour avec les évolutions de juillet, août et septembre 2026 (vérification des praticiens par documents, correctif critique inscriptions, espace secrétariat en compte dédié, statut administrateur découplé du rôle, tableau de bord admin complet, domaine d'envoi Resend vérifié, carte Leaflet sur la fiche praticien avec géocodage des cabinets, domaine monanimeaux.fr connecté au site et indexé par Google, modération avancée admin, rappels de RDV par SMS, liste d'attente, rappels de vaccin proactifs, statistiques praticien, 368 tests unitaires, code-splitting par route, PWA installable, référencement de base, découpage vendor du bundle, réponse du praticien aux avis, export .ics du RDV, carnet de santé exportable, tri par prochaine disponibilité en recherche, notifications push navigateur, email + SMS de confirmation immédiate à la réservation, pages légales finalisées avec le SIRET, annulation de RDV patient corrigée, interface mobile dédiée pour l'espace patient avec recherche à deux champs et cartes animaux en bannière photo, rappel automatique pour laisser un avis après un RDV terminé, favoris praticiens, annulation de RDV côté praticien avec notification patient (in-app, email, SMS), correctif de redirection post-connexion, logo Animéaux dans tous les emails transactionnels, recherche de bugs applicative complète le 24 août 2026 : faille XSS critique corrigée sur la biographie praticien, durcissement de la sécurité au niveau colonne sur les rendez-vous/profils praticiens/messages/notifications, sécurisation des fonctions serveur d'envoi d'email-SMS-push contre les appels non autorisés, correctifs messagerie temps réel/documents de vérification/statistiques praticien/actions de modération admin, système de rappels automatiques (RDV à 24h, vaccin, avis) entièrement fiabilisé début septembre 2026 après plusieurs pannes silencieuses en cascade (vérification JWT de la plateforme, délai réseau trop court, désynchronisation de clé secrète, mauvaise colonne interrogée), erreurs de requête serveur désormais toujours visibles au lieu d'être ignorées silencieusement, adresse postale ajoutée au profil praticien, code de messagerie temps réel unifié entre l'espace patient et praticien, audit applicatif complet du 04/09/2026 : reconstruction de secours de 4 tables jamais commitées (animaux/vaccins/poids/dossiers de santé), verrouillage RLS niveau colonne étendu (avis, dossiers médicaux), durée de rendez-vous alignée sur la configuration réelle du praticien (45/60 min au lieu de 30 min fixe), garde-fou anti-doublon sur le rappel de RDV à 24h, rappel de vaccin en retard qui repart, confirmations ajoutées avant les actions destructrices du cabinet (retirer un membre, supprimer un tarif), renouvellement d'abonnement push géré, notification qui réutilise l'onglet déjà ouvert, plusieurs correctifs de fiabilité (connexion, invalidations de cache, routage administrateur), report de rendez-vous en libre-service pour le patient (au même titre que l'annulation), délai minimum d'1h avant le rendez-vous imposé au patient pour annuler ou reporter, flux calendrier abonnable (ICS) pour le praticien permettant de synchroniser tout son agenda confirmé en un clic dans Google Agenda ou Apple Calendrier, audit de sécurité complet du 05/09/2026 (8 revues croisées) : contournement RLS corrigé permettant à un patient de confirmer lui-même un RDV en attente et de le déplacer à sa guise, motif de rejet administratif d'un praticien retiré de la lecture publique, faille de remplacement de fichier de stockage entre utilisateurs corrigée, verrou ajouté empêchant un patient de forger la réponse du praticien à son propre avis, emails de confirmation/annulation/report de RDV et lien de confirmation de présence fiabilisés (requête ambiguë), échappement HTML généralisé dans les emails, correction du destinataire de l'email de report de RDV quand c'est le patient qui reporte, auto-réparation de l'abonnement aux notifications push, confirmations à deux clics harmonisées sur les annulations de RDV, messages d'erreur explicites au lieu d'échecs silencieux sur les actions de rendez-vous; puis du 22 au 25/09/2026 : notifications push enfin fonctionnelles, pipeline de déploiement automatisé (fonctions Edge, tests bloquants, Sentry), corrections de récursions RLS sur l'espace praticien, performances mobile (graphique et carte chargés à la demande, images en lazy loading), rappels de suivi généralisés (vaccin, vermifuge, bilan annuel), partage de dossier animal entre praticiens avec l'accord du propriétaire, praticiens à plusieurs métiers, page Mes animaux allégée, relance des patients inactifs, interrupteur de messagerie par praticien, visite guidée de première connexion, 922 tests unitaires, email de confirmation d'inscription refait (lien cliquable, en français), statistiques praticien enrichies, fermeture de cabinet, carte dans la recherche, retrait d'un compte secrétariat, partages terminés visibles du propriétaire, nouvelle règle d'accès praticien aux dossiers d'animaux, ouverture d'un document corrigée : plus aucun lien public périmé pendant que le lien sécurisé se prépare, message d'inscription précisant que l'email peut mettre quelques minutes, domaine www redirigé vers monanimeaux.fr, dépôt de plusieurs justificatifs par le praticien rendu explicite (nouveau type « attestation de formation / certification », confirmation après chaque envoi), visite guidée praticien qui n'attend plus qu'il soit vérifié avant de se lancer, étape messagerie de la visite guidée précisant qu'elle est facultative pour le praticien, interrupteur « Apparaître dans la recherche » pour le praticien (migration 126 : masquer sa fiche sans perdre l'accès à son espace ni son statut vérifié), message explicite quand les notifications sont bloquées par le navigateur (navigation privée), offre du praticien gratuite/abonnement étape 1 (migration 127 : champ verrouillé contre l'auto-attribution, changement par l'admin, praticiens existants en abonnement fondateur), offre cabinet (jusqu'à 5 praticiens, offre propre au cabinet, fonctionnalités complètes pour ses membres, limite imposée par la base) ajoutée à l'étape 1 des offres, offres étape 2 (migration 128 : réservation, liste d'attente et messagerie fermées côté base pour un praticien en offre gratuite, fiche publique sans réservation, pas de prochain créneau pour lui en recherche), note du praticien recalculée aussi à la suppression d'un avis ou d'un compte (migration 129), carte de résultat « Voir la fiche » au lieu de « Réserver » pour un praticien en offre gratuite, signalement d'un avis abusif réservé au praticien concerné (bouton dans l'onglet Avis de son espace, retiré de la fiche publique ; règle imposée par la base, migration 130), suppression de l'avis signalé et clôture du signalement en une action depuis la vue admin « Signalements », email de retour au praticien quand l'admin traite son signalement d'avis (issue + commentaire de l'admin, fonction Edge send-report-feedback, copie de l'avis conservée au signalement, migration 131), nettoyage du 13/10/2026 : filtre « disponible » de la recherche aligné sur les offres, message de refus de la messagerie corrigé, vouvoiement harmonisé, documentation à jour, cabinets : secrétariat réservé aux cabinets abonnés (refus avant création du compte + garde en base), messages clairs quand un cabinet est non activé ou complet, bandeau d'état du cabinet dans l'espace praticien, page publique du cabinet limitée aux praticiens vérifiés et visibles, pastilles « Offre gratuite » / « Masqué » / « Non activé » dans l'administration (migration 132), offres étape 3 : espace du praticien en offre gratuite (onglets Mes patients, Tarifs, RDV et Statistiques avec cadenas, page d'explication de l'abonnement, bandeau orange sur Mon espace, demande d'abonnement par email pré-rempli en attendant le paiement en ligne), messagerie réservée à l'abonnement dans les deux sens (onglet et enveloppe verrouillés pour un praticien gratuit, envoi comme réception bloqués côté base, migration 133), bannière d'activation des alertes non proposée à un praticien en offre gratuite (la cloche reste : résultat de la vérification, avis), onglets Profil (praticien et patient) et Mon cabinet refondus (en-têtes de synthèse, sous-onglets, interrupteurs, un seul bouton Enregistrer), statistiques de cabinet complètes (tout le cabinet ou par praticien, avec comparatif), paiement d’un devis par lien sécurisé, offre « Grand cabinet » sur mesure (plus de 5 praticiens : questionnaire de devis, suivi dans l’administration, limite de praticiens réglable par cabinet), paiement des abonnements par Stripe (testé de bout en bout en mode test le 14/10/2026 : paiement, activation par confirmation signée, retour à l’offre gratuite par résiliation, visite guidée lancée à l’activation) (écran de tarification /abonnement, paiement sécurisé, activation uniquement par la confirmation signée de Stripe, portail de gestion carte/factures/résiliation, abonnement individuel 39,90 € HT et cabinet 95,90 € HT, garde-fous sur la suppression de compte et la fermeture de cabinet, migration 134), écran de tarification : aucune offre « recommandée » (on ne connaît pas la situation du praticien), la carte survolée passe en orange (jamais deux à la fois), écran de tarification : un clic sur « Choisir… » sans avoir coché les conditions affiche un message clair à côté de la case (boutons non grisés))</w:t>
+        <w:t>Version 1.60 — document mis à jour avec les évolutions de juillet, août et septembre 2026 (vérification des praticiens par documents, correctif critique inscriptions, espace secrétariat en compte dédié, statut administrateur découplé du rôle, tableau de bord admin complet, domaine d'envoi Resend vérifié, carte Leaflet sur la fiche praticien avec géocodage des cabinets, domaine monanimeaux.fr connecté au site et indexé par Google, modération avancée admin, rappels de RDV par SMS, liste d'attente, rappels de vaccin proactifs, statistiques praticien, 368 tests unitaires, code-splitting par route, PWA installable, référencement de base, découpage vendor du bundle, réponse du praticien aux avis, export .ics du RDV, carnet de santé exportable, tri par prochaine disponibilité en recherche, notifications push navigateur, email + SMS de confirmation immédiate à la réservation, pages légales finalisées avec le SIRET, annulation de RDV patient corrigée, interface mobile dédiée pour l'espace patient avec recherche à deux champs et cartes animaux en bannière photo, rappel automatique pour laisser un avis après un RDV terminé, favoris praticiens, annulation de RDV côté praticien avec notification patient (in-app, email, SMS), correctif de redirection post-connexion, logo Animéaux dans tous les emails transactionnels, recherche de bugs applicative complète le 24 août 2026 : faille XSS critique corrigée sur la biographie praticien, durcissement de la sécurité au niveau colonne sur les rendez-vous/profils praticiens/messages/notifications, sécurisation des fonctions serveur d'envoi d'email-SMS-push contre les appels non autorisés, correctifs messagerie temps réel/documents de vérification/statistiques praticien/actions de modération admin, système de rappels automatiques (RDV à 24h, vaccin, avis) entièrement fiabilisé début septembre 2026 après plusieurs pannes silencieuses en cascade (vérification JWT de la plateforme, délai réseau trop court, désynchronisation de clé secrète, mauvaise colonne interrogée), erreurs de requête serveur désormais toujours visibles au lieu d'être ignorées silencieusement, adresse postale ajoutée au profil praticien, code de messagerie temps réel unifié entre l'espace patient et praticien, audit applicatif complet du 04/09/2026 : reconstruction de secours de 4 tables jamais commitées (animaux/vaccins/poids/dossiers de santé), verrouillage RLS niveau colonne étendu (avis, dossiers médicaux), durée de rendez-vous alignée sur la configuration réelle du praticien (45/60 min au lieu de 30 min fixe), garde-fou anti-doublon sur le rappel de RDV à 24h, rappel de vaccin en retard qui repart, confirmations ajoutées avant les actions destructrices du cabinet (retirer un membre, supprimer un tarif), renouvellement d'abonnement push géré, notification qui réutilise l'onglet déjà ouvert, plusieurs correctifs de fiabilité (connexion, invalidations de cache, routage administrateur), report de rendez-vous en libre-service pour le patient (au même titre que l'annulation), délai minimum d'1h avant le rendez-vous imposé au patient pour annuler ou reporter, flux calendrier abonnable (ICS) pour le praticien permettant de synchroniser tout son agenda confirmé en un clic dans Google Agenda ou Apple Calendrier, audit de sécurité complet du 05/09/2026 (8 revues croisées) : contournement RLS corrigé permettant à un patient de confirmer lui-même un RDV en attente et de le déplacer à sa guise, motif de rejet administratif d'un praticien retiré de la lecture publique, faille de remplacement de fichier de stockage entre utilisateurs corrigée, verrou ajouté empêchant un patient de forger la réponse du praticien à son propre avis, emails de confirmation/annulation/report de RDV et lien de confirmation de présence fiabilisés (requête ambiguë), échappement HTML généralisé dans les emails, correction du destinataire de l'email de report de RDV quand c'est le patient qui reporte, auto-réparation de l'abonnement aux notifications push, confirmations à deux clics harmonisées sur les annulations de RDV, messages d'erreur explicites au lieu d'échecs silencieux sur les actions de rendez-vous; puis du 22 au 25/09/2026 : notifications push enfin fonctionnelles, pipeline de déploiement automatisé (fonctions Edge, tests bloquants, Sentry), corrections de récursions RLS sur l'espace praticien, performances mobile (graphique et carte chargés à la demande, images en lazy loading), rappels de suivi généralisés (vaccin, vermifuge, bilan annuel), partage de dossier animal entre praticiens avec l'accord du propriétaire, praticiens à plusieurs métiers, page Mes animaux allégée, relance des patients inactifs, interrupteur de messagerie par praticien, visite guidée de première connexion, 922 tests unitaires, email de confirmation d'inscription refait (lien cliquable, en français), statistiques praticien enrichies, fermeture de cabinet, carte dans la recherche, retrait d'un compte secrétariat, partages terminés visibles du propriétaire, nouvelle règle d'accès praticien aux dossiers d'animaux, ouverture d'un document corrigée : plus aucun lien public périmé pendant que le lien sécurisé se prépare, message d'inscription précisant que l'email peut mettre quelques minutes, domaine www redirigé vers monanimeaux.fr, dépôt de plusieurs justificatifs par le praticien rendu explicite (nouveau type « attestation de formation / certification », confirmation après chaque envoi), visite guidée praticien qui n'attend plus qu'il soit vérifié avant de se lancer, étape messagerie de la visite guidée précisant qu'elle est facultative pour le praticien, interrupteur « Apparaître dans la recherche » pour le praticien (migration 126 : masquer sa fiche sans perdre l'accès à son espace ni son statut vérifié), message explicite quand les notifications sont bloquées par le navigateur (navigation privée), offre du praticien gratuite/abonnement étape 1 (migration 127 : champ verrouillé contre l'auto-attribution, changement par l'admin, praticiens existants en abonnement fondateur), offre cabinet (jusqu'à 5 praticiens, offre propre au cabinet, fonctionnalités complètes pour ses membres, limite imposée par la base) ajoutée à l'étape 1 des offres, offres étape 2 (migration 128 : réservation, liste d'attente et messagerie fermées côté base pour un praticien en offre gratuite, fiche publique sans réservation, pas de prochain créneau pour lui en recherche), note du praticien recalculée aussi à la suppression d'un avis ou d'un compte (migration 129), carte de résultat « Voir la fiche » au lieu de « Réserver » pour un praticien en offre gratuite, signalement d'un avis abusif réservé au praticien concerné (bouton dans l'onglet Avis de son espace, retiré de la fiche publique ; règle imposée par la base, migration 130), suppression de l'avis signalé et clôture du signalement en une action depuis la vue admin « Signalements », email de retour au praticien quand l'admin traite son signalement d'avis (issue + commentaire de l'admin, fonction Edge send-report-feedback, copie de l'avis conservée au signalement, migration 131), nettoyage du 13/10/2026 : filtre « disponible » de la recherche aligné sur les offres, message de refus de la messagerie corrigé, vouvoiement harmonisé, documentation à jour, cabinets : secrétariat réservé aux cabinets abonnés (refus avant création du compte + garde en base), messages clairs quand un cabinet est non activé ou complet, bandeau d'état du cabinet dans l'espace praticien, page publique du cabinet limitée aux praticiens vérifiés et visibles, pastilles « Offre gratuite » / « Masqué » / « Non activé » dans l'administration (migration 132), offres étape 3 : espace du praticien en offre gratuite (onglets Mes patients, Tarifs, RDV et Statistiques avec cadenas, page d'explication de l'abonnement, bandeau orange sur Mon espace, demande d'abonnement par email pré-rempli en attendant le paiement en ligne), messagerie réservée à l'abonnement dans les deux sens (onglet et enveloppe verrouillés pour un praticien gratuit, envoi comme réception bloqués côté base, migration 133), bannière d'activation des alertes non proposée à un praticien en offre gratuite (la cloche reste : résultat de la vérification, avis), onglets Profil (praticien et patient) et Mon cabinet refondus (en-têtes de synthèse, sous-onglets, interrupteurs, un seul bouton Enregistrer), statistiques de cabinet complètes (tout le cabinet ou par praticien, avec comparatif), paiement d’un devis par lien sécurisé, offre « Grand cabinet » sur mesure (plus de 5 praticiens : questionnaire de devis, suivi dans l’administration, limite de praticiens réglable par cabinet), paiement des abonnements par Stripe (testé de bout en bout en mode test le 14/10/2026 : paiement, activation par confirmation signée, retour à l’offre gratuite par résiliation, visite guidée lancée à l’activation) (écran de tarification /abonnement, paiement sécurisé, activation uniquement par la confirmation signée de Stripe, portail de gestion carte/factures/résiliation, abonnement individuel 39,90 € HT et cabinet 95,90 € HT, garde-fous sur la suppression de compte et la fermeture de cabinet, migration 134), écran de tarification : aucune offre « recommandée » (on ne connaît pas la situation du praticien), la carte survolée passe en orange (jamais deux à la fois), écran de tarification : un clic sur « Choisir… » sans avoir coché les conditions affiche un message clair à côté de la case (boutons non grisés), phase de pré-lancement praticiens avec choix de formule sans paiement et tableau de bord de comptage (migration 137))</w:t>
       </w:r>
     </w:p>
     <w:p>
@@ -7704,6 +7704,14 @@
       </w:pPr>
       <w:r>
         <w:t>Ajouté le 07/10/2026 — rechargement automatique après une mise en ligne : Sentry (premier relevé réel) montrait des erreurs « Failed to fetch dynamically imported module » et « 'text/html' is not a valid JavaScript MIME type » — un utilisateur qui avait ouvert l'application avant une mise en ligne cherche un fichier à empreinte (ex. DoctorDashboard-xxxx.js) qui n'existe plus et reçoit la page d'accueil à la place. src/lib/chunkReload.ts écoute l'événement vite:preloadError et recharge la page UNE fois (garde-fou d'une minute stocké en sessionStorage contre une boucle), installé dans main.tsx ; testé. Autre erreur relevée, à surveiller : TurnstileError 600010 (widget de captcha, 6 occurrences en 2 mois, 0 utilisateur identifié), typiquement un navigateur qui bloque le script Cloudflare.</w:t>
+      </w:r>
+    </w:p>
+    <w:p>
+      <w:pPr>
+        <w:spacing w:after="160" w:line="300"/>
+      </w:pPr>
+      <w:r>
+        <w:t>Ajouté le 26/10/2026 (migration 137) — phase de pré-lancement praticiens. Avant l'ouverture aux propriétaires d'animaux, les praticiens créent un vrai compte et indiquent la formule qui les intéresse (Gratuite, Abonnement, Abonnement cabinet), sans aucun paiement ni coordonnée bancaire, pour que l'administratrice compte les praticiens au fil de l'eau et décide d'ouvrir ou de reporter. Réglages dans la table app_settings, modifiables depuis Administration → Pré-lancement : launch_phase (« open » par défaut = comportement actuel, ou « prelaunch »), public_launch_date (aucune date codée en dur : les dates annoncées sont fictives tant qu'elles ne sont pas décidées ; sans date le site affiche « Ouverture bientôt »), prelaunch_threshold (seuil de praticiens, lisible par l'admin seul). Lecture publique de la phase et de la date uniquement. En pré-lancement : l'accueil d'un visiteur est la page PrelaunchLanding (praticiens, trois formules, TVA non applicable art. 293 B) ; l'inscription ne propose que le compte praticien et exige le choix d'une formule (IntendedPlanPicker, métadonnée intended_plan reprise par handle_new_user dans la table doctor_intended_plans, lisible par le praticien concerné et l'admin) ; /abonnement remplace les boutons de paiement par « Je choisis cette formule » (set_my_intended_plan) ; un bandeau invite les praticiens existants à choisir leur formule ; create-checkout-session et create-quote-checkout refusent tout paiement (code « prelaunch », fonction partagée isPrelaunch qui bloque aussi si le réglage est illisible). Tableau de bord admin : nombre de praticiens inscrits avec jauge vers le seuil, dossiers validés/à valider/rejetés, formule souhaitée, répartition par métier, inscriptions par semaine, export CSV (admin_prelaunch_stats, admin_prelaunch_list, admin_set_setting qui écrit au journal d'actions). Les comptes administrateurs ne comptent pas comme praticiens. Non fait à ce stade : email d'invitation à l'ouverture et écriture groupée aux pré-inscrits. Lecture du réglage impossible côté site = comportement « ouvert », pour qu'un incident ne ferme jamais le site. 973 tests unitaires.</w:t>
       </w:r>
     </w:p>
     <w:sectPr>

</xml_diff>